<commit_message>
Strengthen the Deconstruction step (Foundations)
Add the high-leverage DiSSS Deconstruction elements that were missing:
- §0.0 Deconstruction Sentences: 10 annotated sentences that x-ray Italian
  sentence structure (agreement, pronoun placement, modal+infinitive, etc.)
- §0.5–0.10: cognate transformation rules + false friends, object/indirect
  pronouns & placement, modal+infinitive frame, prep+article contractions,
  questions/negation/c'è, possessives and essere vs stare.

Folded the same sections into the master .docx (theme-matched: 38→44 tables)
and added 25 core-patterns cards to the Anki deck.

Co-Authored-By: Claude Opus 4.8 (1M context) <noreply@anthropic.com>
</commit_message>
<xml_diff>
--- a/Learn_Italian_80_20.docx
+++ b/Learn_Italian_80_20.docx
@@ -704,6 +704,1154 @@
           <w:sz w:val="28"/>
           <w:szCs w:val="28"/>
         </w:rPr>
+        <w:t xml:space="preserve">0.0  The Deconstruction Sentences — The Grammar X-Ray</w:t>
+      </w:r>
+    </w:p>
+    <w:p>
+      <w:pPr>
+        <w:spacing w:before="40" w:after="40"/>
+      </w:pPr>
+      <w:r>
+        <w:rPr>
+          <w:rFonts w:ascii="Arial" w:cs="Arial" w:eastAsia="Arial" w:hAnsi="Arial"/>
+          <w:b w:val="false"/>
+          <w:bCs w:val="false"/>
+          <w:color w:val="1C1C1C"/>
+          <w:sz w:val="22"/>
+          <w:szCs w:val="22"/>
+        </w:rPr>
+        <w:t xml:space="preserve">Tim Ferriss' core trick: a handful of sentences that expose a language's whole machinery. Translate these ten, understand why each one works, and you have mapped about 80% of Italian sentence structure. Re-derive them from memory once a week.</w:t>
+      </w:r>
+    </w:p>
+    <w:tbl>
+      <w:tblPr>
+        <w:tblW w:type="dxa" w:w="9360"/>
+        <w:tblBorders>
+          <w:top w:val="single" w:color="auto" w:sz="4"/>
+          <w:left w:val="single" w:color="auto" w:sz="4"/>
+          <w:bottom w:val="single" w:color="auto" w:sz="4"/>
+          <w:right w:val="single" w:color="auto" w:sz="4"/>
+          <w:insideH w:val="single" w:color="auto" w:sz="4"/>
+          <w:insideV w:val="single" w:color="auto" w:sz="4"/>
+        </w:tblBorders>
+      </w:tblPr>
+      <w:tblGrid>
+        <w:gridCol w:w="2600"/>
+        <w:gridCol w:w="2800"/>
+        <w:gridCol w:w="3960"/>
+      </w:tblGrid>
+      <w:tr>
+        <w:tc>
+          <w:tcPr>
+            <w:tcW w:type="dxa" w:w="2600"/>
+            <w:tcBorders>
+              <w:top w:val="single" w:color="CCCCCC" w:sz="1"/>
+              <w:left w:val="single" w:color="CCCCCC" w:sz="1"/>
+              <w:bottom w:val="single" w:color="CCCCCC" w:sz="1"/>
+              <w:right w:val="single" w:color="CCCCCC" w:sz="1"/>
+            </w:tcBorders>
+            <w:shd w:fill="1A6B3C" w:val="clear"/>
+            <w:tcMar>
+              <w:top w:type="dxa" w:w="80"/>
+              <w:left w:type="dxa" w:w="120"/>
+              <w:bottom w:type="dxa" w:w="80"/>
+              <w:right w:type="dxa" w:w="120"/>
+            </w:tcMar>
+          </w:tcPr>
+          <w:p>
+            <w:r>
+              <w:rPr>
+                <w:rFonts w:ascii="Arial" w:cs="Arial" w:eastAsia="Arial" w:hAnsi="Arial"/>
+                <w:b/>
+                <w:bCs/>
+                <w:color w:val="FFFFFF"/>
+                <w:sz w:val="21"/>
+                <w:szCs w:val="21"/>
+              </w:rPr>
+              <w:t xml:space="preserve">Italian</w:t>
+            </w:r>
+          </w:p>
+        </w:tc>
+        <w:tc>
+          <w:tcPr>
+            <w:tcW w:type="dxa" w:w="2800"/>
+            <w:tcBorders>
+              <w:top w:val="single" w:color="CCCCCC" w:sz="1"/>
+              <w:left w:val="single" w:color="CCCCCC" w:sz="1"/>
+              <w:bottom w:val="single" w:color="CCCCCC" w:sz="1"/>
+              <w:right w:val="single" w:color="CCCCCC" w:sz="1"/>
+            </w:tcBorders>
+            <w:shd w:fill="1A6B3C" w:val="clear"/>
+            <w:tcMar>
+              <w:top w:type="dxa" w:w="80"/>
+              <w:left w:type="dxa" w:w="120"/>
+              <w:bottom w:type="dxa" w:w="80"/>
+              <w:right w:type="dxa" w:w="120"/>
+            </w:tcMar>
+          </w:tcPr>
+          <w:p>
+            <w:r>
+              <w:rPr>
+                <w:rFonts w:ascii="Arial" w:cs="Arial" w:eastAsia="Arial" w:hAnsi="Arial"/>
+                <w:b/>
+                <w:bCs/>
+                <w:color w:val="FFFFFF"/>
+                <w:sz w:val="21"/>
+                <w:szCs w:val="21"/>
+              </w:rPr>
+              <w:t xml:space="preserve">English</w:t>
+            </w:r>
+          </w:p>
+        </w:tc>
+        <w:tc>
+          <w:tcPr>
+            <w:tcW w:type="dxa" w:w="3960"/>
+            <w:tcBorders>
+              <w:top w:val="single" w:color="CCCCCC" w:sz="1"/>
+              <w:left w:val="single" w:color="CCCCCC" w:sz="1"/>
+              <w:bottom w:val="single" w:color="CCCCCC" w:sz="1"/>
+              <w:right w:val="single" w:color="CCCCCC" w:sz="1"/>
+            </w:tcBorders>
+            <w:shd w:fill="1A6B3C" w:val="clear"/>
+            <w:tcMar>
+              <w:top w:type="dxa" w:w="80"/>
+              <w:left w:type="dxa" w:w="120"/>
+              <w:bottom w:type="dxa" w:w="80"/>
+              <w:right w:type="dxa" w:w="120"/>
+            </w:tcMar>
+          </w:tcPr>
+          <w:p>
+            <w:r>
+              <w:rPr>
+                <w:rFonts w:ascii="Arial" w:cs="Arial" w:eastAsia="Arial" w:hAnsi="Arial"/>
+                <w:b/>
+                <w:bCs/>
+                <w:color w:val="FFFFFF"/>
+                <w:sz w:val="21"/>
+                <w:szCs w:val="21"/>
+              </w:rPr>
+              <w:t xml:space="preserve">What it reveals</w:t>
+            </w:r>
+          </w:p>
+        </w:tc>
+      </w:tr>
+      <w:tr>
+        <w:tc>
+          <w:tcPr>
+            <w:tcW w:type="dxa" w:w="2600"/>
+            <w:tcBorders>
+              <w:top w:val="single" w:color="CCCCCC" w:sz="1"/>
+              <w:left w:val="single" w:color="CCCCCC" w:sz="1"/>
+              <w:bottom w:val="single" w:color="CCCCCC" w:sz="1"/>
+              <w:right w:val="single" w:color="CCCCCC" w:sz="1"/>
+            </w:tcBorders>
+            <w:shd w:fill="FFFFFF" w:val="clear"/>
+            <w:tcMar>
+              <w:top w:type="dxa" w:w="80"/>
+              <w:left w:type="dxa" w:w="120"/>
+              <w:bottom w:type="dxa" w:w="80"/>
+              <w:right w:type="dxa" w:w="120"/>
+            </w:tcMar>
+          </w:tcPr>
+          <w:p>
+            <w:r>
+              <w:rPr>
+                <w:rFonts w:ascii="Arial" w:cs="Arial" w:eastAsia="Arial" w:hAnsi="Arial"/>
+                <w:b w:val="false"/>
+                <w:bCs w:val="false"/>
+                <w:color w:val="1C1C1C"/>
+                <w:sz w:val="21"/>
+                <w:szCs w:val="21"/>
+              </w:rPr>
+              <w:t xml:space="preserve">La mela è rossa.</w:t>
+            </w:r>
+          </w:p>
+        </w:tc>
+        <w:tc>
+          <w:tcPr>
+            <w:tcW w:type="dxa" w:w="2800"/>
+            <w:tcBorders>
+              <w:top w:val="single" w:color="CCCCCC" w:sz="1"/>
+              <w:left w:val="single" w:color="CCCCCC" w:sz="1"/>
+              <w:bottom w:val="single" w:color="CCCCCC" w:sz="1"/>
+              <w:right w:val="single" w:color="CCCCCC" w:sz="1"/>
+            </w:tcBorders>
+            <w:shd w:fill="FFFFFF" w:val="clear"/>
+            <w:tcMar>
+              <w:top w:type="dxa" w:w="80"/>
+              <w:left w:type="dxa" w:w="120"/>
+              <w:bottom w:type="dxa" w:w="80"/>
+              <w:right w:type="dxa" w:w="120"/>
+            </w:tcMar>
+          </w:tcPr>
+          <w:p>
+            <w:r>
+              <w:rPr>
+                <w:rFonts w:ascii="Arial" w:cs="Arial" w:eastAsia="Arial" w:hAnsi="Arial"/>
+                <w:b w:val="false"/>
+                <w:bCs w:val="false"/>
+                <w:color w:val="1C1C1C"/>
+                <w:sz w:val="21"/>
+                <w:szCs w:val="21"/>
+              </w:rPr>
+              <w:t xml:space="preserve">The apple is red.</w:t>
+            </w:r>
+          </w:p>
+        </w:tc>
+        <w:tc>
+          <w:tcPr>
+            <w:tcW w:type="dxa" w:w="3960"/>
+            <w:tcBorders>
+              <w:top w:val="single" w:color="CCCCCC" w:sz="1"/>
+              <w:left w:val="single" w:color="CCCCCC" w:sz="1"/>
+              <w:bottom w:val="single" w:color="CCCCCC" w:sz="1"/>
+              <w:right w:val="single" w:color="CCCCCC" w:sz="1"/>
+            </w:tcBorders>
+            <w:shd w:fill="FFFFFF" w:val="clear"/>
+            <w:tcMar>
+              <w:top w:type="dxa" w:w="80"/>
+              <w:left w:type="dxa" w:w="120"/>
+              <w:bottom w:type="dxa" w:w="80"/>
+              <w:right w:type="dxa" w:w="120"/>
+            </w:tcMar>
+          </w:tcPr>
+          <w:p>
+            <w:r>
+              <w:rPr>
+                <w:rFonts w:ascii="Arial" w:cs="Arial" w:eastAsia="Arial" w:hAnsi="Arial"/>
+                <w:b w:val="false"/>
+                <w:bCs w:val="false"/>
+                <w:color w:val="1C1C1C"/>
+                <w:sz w:val="21"/>
+                <w:szCs w:val="21"/>
+              </w:rPr>
+              <w:t xml:space="preserve">Adjective follows the noun and agrees (mela = fem → rossa).</w:t>
+            </w:r>
+          </w:p>
+        </w:tc>
+      </w:tr>
+      <w:tr>
+        <w:tc>
+          <w:tcPr>
+            <w:tcW w:type="dxa" w:w="2600"/>
+            <w:tcBorders>
+              <w:top w:val="single" w:color="CCCCCC" w:sz="1"/>
+              <w:left w:val="single" w:color="CCCCCC" w:sz="1"/>
+              <w:bottom w:val="single" w:color="CCCCCC" w:sz="1"/>
+              <w:right w:val="single" w:color="CCCCCC" w:sz="1"/>
+            </w:tcBorders>
+            <w:shd w:fill="F5F5F5" w:val="clear"/>
+            <w:tcMar>
+              <w:top w:type="dxa" w:w="80"/>
+              <w:left w:type="dxa" w:w="120"/>
+              <w:bottom w:type="dxa" w:w="80"/>
+              <w:right w:type="dxa" w:w="120"/>
+            </w:tcMar>
+          </w:tcPr>
+          <w:p>
+            <w:r>
+              <w:rPr>
+                <w:rFonts w:ascii="Arial" w:cs="Arial" w:eastAsia="Arial" w:hAnsi="Arial"/>
+                <w:b w:val="false"/>
+                <w:bCs w:val="false"/>
+                <w:color w:val="1C1C1C"/>
+                <w:sz w:val="21"/>
+                <w:szCs w:val="21"/>
+              </w:rPr>
+              <w:t xml:space="preserve">È la mela di Marco.</w:t>
+            </w:r>
+          </w:p>
+        </w:tc>
+        <w:tc>
+          <w:tcPr>
+            <w:tcW w:type="dxa" w:w="2800"/>
+            <w:tcBorders>
+              <w:top w:val="single" w:color="CCCCCC" w:sz="1"/>
+              <w:left w:val="single" w:color="CCCCCC" w:sz="1"/>
+              <w:bottom w:val="single" w:color="CCCCCC" w:sz="1"/>
+              <w:right w:val="single" w:color="CCCCCC" w:sz="1"/>
+            </w:tcBorders>
+            <w:shd w:fill="F5F5F5" w:val="clear"/>
+            <w:tcMar>
+              <w:top w:type="dxa" w:w="80"/>
+              <w:left w:type="dxa" w:w="120"/>
+              <w:bottom w:type="dxa" w:w="80"/>
+              <w:right w:type="dxa" w:w="120"/>
+            </w:tcMar>
+          </w:tcPr>
+          <w:p>
+            <w:r>
+              <w:rPr>
+                <w:rFonts w:ascii="Arial" w:cs="Arial" w:eastAsia="Arial" w:hAnsi="Arial"/>
+                <w:b w:val="false"/>
+                <w:bCs w:val="false"/>
+                <w:color w:val="1C1C1C"/>
+                <w:sz w:val="21"/>
+                <w:szCs w:val="21"/>
+              </w:rPr>
+              <w:t xml:space="preserve">It's Marco's apple.</w:t>
+            </w:r>
+          </w:p>
+        </w:tc>
+        <w:tc>
+          <w:tcPr>
+            <w:tcW w:type="dxa" w:w="3960"/>
+            <w:tcBorders>
+              <w:top w:val="single" w:color="CCCCCC" w:sz="1"/>
+              <w:left w:val="single" w:color="CCCCCC" w:sz="1"/>
+              <w:bottom w:val="single" w:color="CCCCCC" w:sz="1"/>
+              <w:right w:val="single" w:color="CCCCCC" w:sz="1"/>
+            </w:tcBorders>
+            <w:shd w:fill="F5F5F5" w:val="clear"/>
+            <w:tcMar>
+              <w:top w:type="dxa" w:w="80"/>
+              <w:left w:type="dxa" w:w="120"/>
+              <w:bottom w:type="dxa" w:w="80"/>
+              <w:right w:type="dxa" w:w="120"/>
+            </w:tcMar>
+          </w:tcPr>
+          <w:p>
+            <w:r>
+              <w:rPr>
+                <w:rFonts w:ascii="Arial" w:cs="Arial" w:eastAsia="Arial" w:hAnsi="Arial"/>
+                <w:b w:val="false"/>
+                <w:bCs w:val="false"/>
+                <w:color w:val="1C1C1C"/>
+                <w:sz w:val="21"/>
+                <w:szCs w:val="21"/>
+              </w:rPr>
+              <w:t xml:space="preserve">Possession = di + owner (no apostrophe-s).</w:t>
+            </w:r>
+          </w:p>
+        </w:tc>
+      </w:tr>
+      <w:tr>
+        <w:tc>
+          <w:tcPr>
+            <w:tcW w:type="dxa" w:w="2600"/>
+            <w:tcBorders>
+              <w:top w:val="single" w:color="CCCCCC" w:sz="1"/>
+              <w:left w:val="single" w:color="CCCCCC" w:sz="1"/>
+              <w:bottom w:val="single" w:color="CCCCCC" w:sz="1"/>
+              <w:right w:val="single" w:color="CCCCCC" w:sz="1"/>
+            </w:tcBorders>
+            <w:shd w:fill="FFFFFF" w:val="clear"/>
+            <w:tcMar>
+              <w:top w:type="dxa" w:w="80"/>
+              <w:left w:type="dxa" w:w="120"/>
+              <w:bottom w:type="dxa" w:w="80"/>
+              <w:right w:type="dxa" w:w="120"/>
+            </w:tcMar>
+          </w:tcPr>
+          <w:p>
+            <w:r>
+              <w:rPr>
+                <w:rFonts w:ascii="Arial" w:cs="Arial" w:eastAsia="Arial" w:hAnsi="Arial"/>
+                <w:b w:val="false"/>
+                <w:bCs w:val="false"/>
+                <w:color w:val="1C1C1C"/>
+                <w:sz w:val="21"/>
+                <w:szCs w:val="21"/>
+              </w:rPr>
+              <w:t xml:space="preserve">Do la mela a Marco.</w:t>
+            </w:r>
+          </w:p>
+        </w:tc>
+        <w:tc>
+          <w:tcPr>
+            <w:tcW w:type="dxa" w:w="2800"/>
+            <w:tcBorders>
+              <w:top w:val="single" w:color="CCCCCC" w:sz="1"/>
+              <w:left w:val="single" w:color="CCCCCC" w:sz="1"/>
+              <w:bottom w:val="single" w:color="CCCCCC" w:sz="1"/>
+              <w:right w:val="single" w:color="CCCCCC" w:sz="1"/>
+            </w:tcBorders>
+            <w:shd w:fill="FFFFFF" w:val="clear"/>
+            <w:tcMar>
+              <w:top w:type="dxa" w:w="80"/>
+              <w:left w:type="dxa" w:w="120"/>
+              <w:bottom w:type="dxa" w:w="80"/>
+              <w:right w:type="dxa" w:w="120"/>
+            </w:tcMar>
+          </w:tcPr>
+          <w:p>
+            <w:r>
+              <w:rPr>
+                <w:rFonts w:ascii="Arial" w:cs="Arial" w:eastAsia="Arial" w:hAnsi="Arial"/>
+                <w:b w:val="false"/>
+                <w:bCs w:val="false"/>
+                <w:color w:val="1C1C1C"/>
+                <w:sz w:val="21"/>
+                <w:szCs w:val="21"/>
+              </w:rPr>
+              <w:t xml:space="preserve">I give the apple to Marco.</w:t>
+            </w:r>
+          </w:p>
+        </w:tc>
+        <w:tc>
+          <w:tcPr>
+            <w:tcW w:type="dxa" w:w="3960"/>
+            <w:tcBorders>
+              <w:top w:val="single" w:color="CCCCCC" w:sz="1"/>
+              <w:left w:val="single" w:color="CCCCCC" w:sz="1"/>
+              <w:bottom w:val="single" w:color="CCCCCC" w:sz="1"/>
+              <w:right w:val="single" w:color="CCCCCC" w:sz="1"/>
+            </w:tcBorders>
+            <w:shd w:fill="FFFFFF" w:val="clear"/>
+            <w:tcMar>
+              <w:top w:type="dxa" w:w="80"/>
+              <w:left w:type="dxa" w:w="120"/>
+              <w:bottom w:type="dxa" w:w="80"/>
+              <w:right w:type="dxa" w:w="120"/>
+            </w:tcMar>
+          </w:tcPr>
+          <w:p>
+            <w:r>
+              <w:rPr>
+                <w:rFonts w:ascii="Arial" w:cs="Arial" w:eastAsia="Arial" w:hAnsi="Arial"/>
+                <w:b w:val="false"/>
+                <w:bCs w:val="false"/>
+                <w:color w:val="1C1C1C"/>
+                <w:sz w:val="21"/>
+                <w:szCs w:val="21"/>
+              </w:rPr>
+              <w:t xml:space="preserve">Subject dropped (do = I give); indirect object marked by a.</w:t>
+            </w:r>
+          </w:p>
+        </w:tc>
+      </w:tr>
+      <w:tr>
+        <w:tc>
+          <w:tcPr>
+            <w:tcW w:type="dxa" w:w="2600"/>
+            <w:tcBorders>
+              <w:top w:val="single" w:color="CCCCCC" w:sz="1"/>
+              <w:left w:val="single" w:color="CCCCCC" w:sz="1"/>
+              <w:bottom w:val="single" w:color="CCCCCC" w:sz="1"/>
+              <w:right w:val="single" w:color="CCCCCC" w:sz="1"/>
+            </w:tcBorders>
+            <w:shd w:fill="F5F5F5" w:val="clear"/>
+            <w:tcMar>
+              <w:top w:type="dxa" w:w="80"/>
+              <w:left w:type="dxa" w:w="120"/>
+              <w:bottom w:type="dxa" w:w="80"/>
+              <w:right w:type="dxa" w:w="120"/>
+            </w:tcMar>
+          </w:tcPr>
+          <w:p>
+            <w:r>
+              <w:rPr>
+                <w:rFonts w:ascii="Arial" w:cs="Arial" w:eastAsia="Arial" w:hAnsi="Arial"/>
+                <w:b w:val="false"/>
+                <w:bCs w:val="false"/>
+                <w:color w:val="1C1C1C"/>
+                <w:sz w:val="21"/>
+                <w:szCs w:val="21"/>
+              </w:rPr>
+              <w:t xml:space="preserve">Gli do la mela.</w:t>
+            </w:r>
+          </w:p>
+        </w:tc>
+        <w:tc>
+          <w:tcPr>
+            <w:tcW w:type="dxa" w:w="2800"/>
+            <w:tcBorders>
+              <w:top w:val="single" w:color="CCCCCC" w:sz="1"/>
+              <w:left w:val="single" w:color="CCCCCC" w:sz="1"/>
+              <w:bottom w:val="single" w:color="CCCCCC" w:sz="1"/>
+              <w:right w:val="single" w:color="CCCCCC" w:sz="1"/>
+            </w:tcBorders>
+            <w:shd w:fill="F5F5F5" w:val="clear"/>
+            <w:tcMar>
+              <w:top w:type="dxa" w:w="80"/>
+              <w:left w:type="dxa" w:w="120"/>
+              <w:bottom w:type="dxa" w:w="80"/>
+              <w:right w:type="dxa" w:w="120"/>
+            </w:tcMar>
+          </w:tcPr>
+          <w:p>
+            <w:r>
+              <w:rPr>
+                <w:rFonts w:ascii="Arial" w:cs="Arial" w:eastAsia="Arial" w:hAnsi="Arial"/>
+                <w:b w:val="false"/>
+                <w:bCs w:val="false"/>
+                <w:color w:val="1C1C1C"/>
+                <w:sz w:val="21"/>
+                <w:szCs w:val="21"/>
+              </w:rPr>
+              <w:t xml:space="preserve">I give him the apple.</w:t>
+            </w:r>
+          </w:p>
+        </w:tc>
+        <w:tc>
+          <w:tcPr>
+            <w:tcW w:type="dxa" w:w="3960"/>
+            <w:tcBorders>
+              <w:top w:val="single" w:color="CCCCCC" w:sz="1"/>
+              <w:left w:val="single" w:color="CCCCCC" w:sz="1"/>
+              <w:bottom w:val="single" w:color="CCCCCC" w:sz="1"/>
+              <w:right w:val="single" w:color="CCCCCC" w:sz="1"/>
+            </w:tcBorders>
+            <w:shd w:fill="F5F5F5" w:val="clear"/>
+            <w:tcMar>
+              <w:top w:type="dxa" w:w="80"/>
+              <w:left w:type="dxa" w:w="120"/>
+              <w:bottom w:type="dxa" w:w="80"/>
+              <w:right w:type="dxa" w:w="120"/>
+            </w:tcMar>
+          </w:tcPr>
+          <w:p>
+            <w:r>
+              <w:rPr>
+                <w:rFonts w:ascii="Arial" w:cs="Arial" w:eastAsia="Arial" w:hAnsi="Arial"/>
+                <w:b w:val="false"/>
+                <w:bCs w:val="false"/>
+                <w:color w:val="1C1C1C"/>
+                <w:sz w:val="21"/>
+                <w:szCs w:val="21"/>
+              </w:rPr>
+              <w:t xml:space="preserve">Indirect pronoun gli goes before the verb.</w:t>
+            </w:r>
+          </w:p>
+        </w:tc>
+      </w:tr>
+      <w:tr>
+        <w:tc>
+          <w:tcPr>
+            <w:tcW w:type="dxa" w:w="2600"/>
+            <w:tcBorders>
+              <w:top w:val="single" w:color="CCCCCC" w:sz="1"/>
+              <w:left w:val="single" w:color="CCCCCC" w:sz="1"/>
+              <w:bottom w:val="single" w:color="CCCCCC" w:sz="1"/>
+              <w:right w:val="single" w:color="CCCCCC" w:sz="1"/>
+            </w:tcBorders>
+            <w:shd w:fill="FFFFFF" w:val="clear"/>
+            <w:tcMar>
+              <w:top w:type="dxa" w:w="80"/>
+              <w:left w:type="dxa" w:w="120"/>
+              <w:bottom w:type="dxa" w:w="80"/>
+              <w:right w:type="dxa" w:w="120"/>
+            </w:tcMar>
+          </w:tcPr>
+          <w:p>
+            <w:r>
+              <w:rPr>
+                <w:rFonts w:ascii="Arial" w:cs="Arial" w:eastAsia="Arial" w:hAnsi="Arial"/>
+                <w:b w:val="false"/>
+                <w:bCs w:val="false"/>
+                <w:color w:val="1C1C1C"/>
+                <w:sz w:val="21"/>
+                <w:szCs w:val="21"/>
+              </w:rPr>
+              <w:t xml:space="preserve">Gliela do.</w:t>
+            </w:r>
+          </w:p>
+        </w:tc>
+        <w:tc>
+          <w:tcPr>
+            <w:tcW w:type="dxa" w:w="2800"/>
+            <w:tcBorders>
+              <w:top w:val="single" w:color="CCCCCC" w:sz="1"/>
+              <w:left w:val="single" w:color="CCCCCC" w:sz="1"/>
+              <w:bottom w:val="single" w:color="CCCCCC" w:sz="1"/>
+              <w:right w:val="single" w:color="CCCCCC" w:sz="1"/>
+            </w:tcBorders>
+            <w:shd w:fill="FFFFFF" w:val="clear"/>
+            <w:tcMar>
+              <w:top w:type="dxa" w:w="80"/>
+              <w:left w:type="dxa" w:w="120"/>
+              <w:bottom w:type="dxa" w:w="80"/>
+              <w:right w:type="dxa" w:w="120"/>
+            </w:tcMar>
+          </w:tcPr>
+          <w:p>
+            <w:r>
+              <w:rPr>
+                <w:rFonts w:ascii="Arial" w:cs="Arial" w:eastAsia="Arial" w:hAnsi="Arial"/>
+                <w:b w:val="false"/>
+                <w:bCs w:val="false"/>
+                <w:color w:val="1C1C1C"/>
+                <w:sz w:val="21"/>
+                <w:szCs w:val="21"/>
+              </w:rPr>
+              <w:t xml:space="preserve">I give it to him.</w:t>
+            </w:r>
+          </w:p>
+        </w:tc>
+        <w:tc>
+          <w:tcPr>
+            <w:tcW w:type="dxa" w:w="3960"/>
+            <w:tcBorders>
+              <w:top w:val="single" w:color="CCCCCC" w:sz="1"/>
+              <w:left w:val="single" w:color="CCCCCC" w:sz="1"/>
+              <w:bottom w:val="single" w:color="CCCCCC" w:sz="1"/>
+              <w:right w:val="single" w:color="CCCCCC" w:sz="1"/>
+            </w:tcBorders>
+            <w:shd w:fill="FFFFFF" w:val="clear"/>
+            <w:tcMar>
+              <w:top w:type="dxa" w:w="80"/>
+              <w:left w:type="dxa" w:w="120"/>
+              <w:bottom w:type="dxa" w:w="80"/>
+              <w:right w:type="dxa" w:w="120"/>
+            </w:tcMar>
+          </w:tcPr>
+          <w:p>
+            <w:r>
+              <w:rPr>
+                <w:rFonts w:ascii="Arial" w:cs="Arial" w:eastAsia="Arial" w:hAnsi="Arial"/>
+                <w:b w:val="false"/>
+                <w:bCs w:val="false"/>
+                <w:color w:val="1C1C1C"/>
+                <w:sz w:val="21"/>
+                <w:szCs w:val="21"/>
+              </w:rPr>
+              <w:t xml:space="preserve">Two pronouns merge (gli + la → gliela) and stack before the verb.</w:t>
+            </w:r>
+          </w:p>
+        </w:tc>
+      </w:tr>
+      <w:tr>
+        <w:tc>
+          <w:tcPr>
+            <w:tcW w:type="dxa" w:w="2600"/>
+            <w:tcBorders>
+              <w:top w:val="single" w:color="CCCCCC" w:sz="1"/>
+              <w:left w:val="single" w:color="CCCCCC" w:sz="1"/>
+              <w:bottom w:val="single" w:color="CCCCCC" w:sz="1"/>
+              <w:right w:val="single" w:color="CCCCCC" w:sz="1"/>
+            </w:tcBorders>
+            <w:shd w:fill="F5F5F5" w:val="clear"/>
+            <w:tcMar>
+              <w:top w:type="dxa" w:w="80"/>
+              <w:left w:type="dxa" w:w="120"/>
+              <w:bottom w:type="dxa" w:w="80"/>
+              <w:right w:type="dxa" w:w="120"/>
+            </w:tcMar>
+          </w:tcPr>
+          <w:p>
+            <w:r>
+              <w:rPr>
+                <w:rFonts w:ascii="Arial" w:cs="Arial" w:eastAsia="Arial" w:hAnsi="Arial"/>
+                <w:b w:val="false"/>
+                <w:bCs w:val="false"/>
+                <w:color w:val="1C1C1C"/>
+                <w:sz w:val="21"/>
+                <w:szCs w:val="21"/>
+              </w:rPr>
+              <w:t xml:space="preserve">Devo dargliela.</w:t>
+            </w:r>
+          </w:p>
+        </w:tc>
+        <w:tc>
+          <w:tcPr>
+            <w:tcW w:type="dxa" w:w="2800"/>
+            <w:tcBorders>
+              <w:top w:val="single" w:color="CCCCCC" w:sz="1"/>
+              <w:left w:val="single" w:color="CCCCCC" w:sz="1"/>
+              <w:bottom w:val="single" w:color="CCCCCC" w:sz="1"/>
+              <w:right w:val="single" w:color="CCCCCC" w:sz="1"/>
+            </w:tcBorders>
+            <w:shd w:fill="F5F5F5" w:val="clear"/>
+            <w:tcMar>
+              <w:top w:type="dxa" w:w="80"/>
+              <w:left w:type="dxa" w:w="120"/>
+              <w:bottom w:type="dxa" w:w="80"/>
+              <w:right w:type="dxa" w:w="120"/>
+            </w:tcMar>
+          </w:tcPr>
+          <w:p>
+            <w:r>
+              <w:rPr>
+                <w:rFonts w:ascii="Arial" w:cs="Arial" w:eastAsia="Arial" w:hAnsi="Arial"/>
+                <w:b w:val="false"/>
+                <w:bCs w:val="false"/>
+                <w:color w:val="1C1C1C"/>
+                <w:sz w:val="21"/>
+                <w:szCs w:val="21"/>
+              </w:rPr>
+              <w:t xml:space="preserve">I have to give it to him.</w:t>
+            </w:r>
+          </w:p>
+        </w:tc>
+        <w:tc>
+          <w:tcPr>
+            <w:tcW w:type="dxa" w:w="3960"/>
+            <w:tcBorders>
+              <w:top w:val="single" w:color="CCCCCC" w:sz="1"/>
+              <w:left w:val="single" w:color="CCCCCC" w:sz="1"/>
+              <w:bottom w:val="single" w:color="CCCCCC" w:sz="1"/>
+              <w:right w:val="single" w:color="CCCCCC" w:sz="1"/>
+            </w:tcBorders>
+            <w:shd w:fill="F5F5F5" w:val="clear"/>
+            <w:tcMar>
+              <w:top w:type="dxa" w:w="80"/>
+              <w:left w:type="dxa" w:w="120"/>
+              <w:bottom w:type="dxa" w:w="80"/>
+              <w:right w:type="dxa" w:w="120"/>
+            </w:tcMar>
+          </w:tcPr>
+          <w:p>
+            <w:r>
+              <w:rPr>
+                <w:rFonts w:ascii="Arial" w:cs="Arial" w:eastAsia="Arial" w:hAnsi="Arial"/>
+                <w:b w:val="false"/>
+                <w:bCs w:val="false"/>
+                <w:color w:val="1C1C1C"/>
+                <w:sz w:val="21"/>
+                <w:szCs w:val="21"/>
+              </w:rPr>
+              <w:t xml:space="preserve">Modal (devo) + infinitive; pronouns attach to the infinitive.</w:t>
+            </w:r>
+          </w:p>
+        </w:tc>
+      </w:tr>
+      <w:tr>
+        <w:tc>
+          <w:tcPr>
+            <w:tcW w:type="dxa" w:w="2600"/>
+            <w:tcBorders>
+              <w:top w:val="single" w:color="CCCCCC" w:sz="1"/>
+              <w:left w:val="single" w:color="CCCCCC" w:sz="1"/>
+              <w:bottom w:val="single" w:color="CCCCCC" w:sz="1"/>
+              <w:right w:val="single" w:color="CCCCCC" w:sz="1"/>
+            </w:tcBorders>
+            <w:shd w:fill="FFFFFF" w:val="clear"/>
+            <w:tcMar>
+              <w:top w:type="dxa" w:w="80"/>
+              <w:left w:type="dxa" w:w="120"/>
+              <w:bottom w:type="dxa" w:w="80"/>
+              <w:right w:type="dxa" w:w="120"/>
+            </w:tcMar>
+          </w:tcPr>
+          <w:p>
+            <w:r>
+              <w:rPr>
+                <w:rFonts w:ascii="Arial" w:cs="Arial" w:eastAsia="Arial" w:hAnsi="Arial"/>
+                <w:b w:val="false"/>
+                <w:bCs w:val="false"/>
+                <w:color w:val="1C1C1C"/>
+                <w:sz w:val="21"/>
+                <w:szCs w:val="21"/>
+              </w:rPr>
+              <w:t xml:space="preserve">Posso / Voglio dargliela.</w:t>
+            </w:r>
+          </w:p>
+        </w:tc>
+        <w:tc>
+          <w:tcPr>
+            <w:tcW w:type="dxa" w:w="2800"/>
+            <w:tcBorders>
+              <w:top w:val="single" w:color="CCCCCC" w:sz="1"/>
+              <w:left w:val="single" w:color="CCCCCC" w:sz="1"/>
+              <w:bottom w:val="single" w:color="CCCCCC" w:sz="1"/>
+              <w:right w:val="single" w:color="CCCCCC" w:sz="1"/>
+            </w:tcBorders>
+            <w:shd w:fill="FFFFFF" w:val="clear"/>
+            <w:tcMar>
+              <w:top w:type="dxa" w:w="80"/>
+              <w:left w:type="dxa" w:w="120"/>
+              <w:bottom w:type="dxa" w:w="80"/>
+              <w:right w:type="dxa" w:w="120"/>
+            </w:tcMar>
+          </w:tcPr>
+          <w:p>
+            <w:r>
+              <w:rPr>
+                <w:rFonts w:ascii="Arial" w:cs="Arial" w:eastAsia="Arial" w:hAnsi="Arial"/>
+                <w:b w:val="false"/>
+                <w:bCs w:val="false"/>
+                <w:color w:val="1C1C1C"/>
+                <w:sz w:val="21"/>
+                <w:szCs w:val="21"/>
+              </w:rPr>
+              <w:t xml:space="preserve">I can / want to give it to him.</w:t>
+            </w:r>
+          </w:p>
+        </w:tc>
+        <w:tc>
+          <w:tcPr>
+            <w:tcW w:type="dxa" w:w="3960"/>
+            <w:tcBorders>
+              <w:top w:val="single" w:color="CCCCCC" w:sz="1"/>
+              <w:left w:val="single" w:color="CCCCCC" w:sz="1"/>
+              <w:bottom w:val="single" w:color="CCCCCC" w:sz="1"/>
+              <w:right w:val="single" w:color="CCCCCC" w:sz="1"/>
+            </w:tcBorders>
+            <w:shd w:fill="FFFFFF" w:val="clear"/>
+            <w:tcMar>
+              <w:top w:type="dxa" w:w="80"/>
+              <w:left w:type="dxa" w:w="120"/>
+              <w:bottom w:type="dxa" w:w="80"/>
+              <w:right w:type="dxa" w:w="120"/>
+            </w:tcMar>
+          </w:tcPr>
+          <w:p>
+            <w:r>
+              <w:rPr>
+                <w:rFonts w:ascii="Arial" w:cs="Arial" w:eastAsia="Arial" w:hAnsi="Arial"/>
+                <w:b w:val="false"/>
+                <w:bCs w:val="false"/>
+                <w:color w:val="1C1C1C"/>
+                <w:sz w:val="21"/>
+                <w:szCs w:val="21"/>
+              </w:rPr>
+              <w:t xml:space="preserve">Same frame for potere and volere.</w:t>
+            </w:r>
+          </w:p>
+        </w:tc>
+      </w:tr>
+      <w:tr>
+        <w:tc>
+          <w:tcPr>
+            <w:tcW w:type="dxa" w:w="2600"/>
+            <w:tcBorders>
+              <w:top w:val="single" w:color="CCCCCC" w:sz="1"/>
+              <w:left w:val="single" w:color="CCCCCC" w:sz="1"/>
+              <w:bottom w:val="single" w:color="CCCCCC" w:sz="1"/>
+              <w:right w:val="single" w:color="CCCCCC" w:sz="1"/>
+            </w:tcBorders>
+            <w:shd w:fill="F5F5F5" w:val="clear"/>
+            <w:tcMar>
+              <w:top w:type="dxa" w:w="80"/>
+              <w:left w:type="dxa" w:w="120"/>
+              <w:bottom w:type="dxa" w:w="80"/>
+              <w:right w:type="dxa" w:w="120"/>
+            </w:tcMar>
+          </w:tcPr>
+          <w:p>
+            <w:r>
+              <w:rPr>
+                <w:rFonts w:ascii="Arial" w:cs="Arial" w:eastAsia="Arial" w:hAnsi="Arial"/>
+                <w:b w:val="false"/>
+                <w:bCs w:val="false"/>
+                <w:color w:val="1C1C1C"/>
+                <w:sz w:val="21"/>
+                <w:szCs w:val="21"/>
+              </w:rPr>
+              <w:t xml:space="preserve">Non posso mangiarla.</w:t>
+            </w:r>
+          </w:p>
+        </w:tc>
+        <w:tc>
+          <w:tcPr>
+            <w:tcW w:type="dxa" w:w="2800"/>
+            <w:tcBorders>
+              <w:top w:val="single" w:color="CCCCCC" w:sz="1"/>
+              <w:left w:val="single" w:color="CCCCCC" w:sz="1"/>
+              <w:bottom w:val="single" w:color="CCCCCC" w:sz="1"/>
+              <w:right w:val="single" w:color="CCCCCC" w:sz="1"/>
+            </w:tcBorders>
+            <w:shd w:fill="F5F5F5" w:val="clear"/>
+            <w:tcMar>
+              <w:top w:type="dxa" w:w="80"/>
+              <w:left w:type="dxa" w:w="120"/>
+              <w:bottom w:type="dxa" w:w="80"/>
+              <w:right w:type="dxa" w:w="120"/>
+            </w:tcMar>
+          </w:tcPr>
+          <w:p>
+            <w:r>
+              <w:rPr>
+                <w:rFonts w:ascii="Arial" w:cs="Arial" w:eastAsia="Arial" w:hAnsi="Arial"/>
+                <w:b w:val="false"/>
+                <w:bCs w:val="false"/>
+                <w:color w:val="1C1C1C"/>
+                <w:sz w:val="21"/>
+                <w:szCs w:val="21"/>
+              </w:rPr>
+              <w:t xml:space="preserve">I can't eat it.</w:t>
+            </w:r>
+          </w:p>
+        </w:tc>
+        <w:tc>
+          <w:tcPr>
+            <w:tcW w:type="dxa" w:w="3960"/>
+            <w:tcBorders>
+              <w:top w:val="single" w:color="CCCCCC" w:sz="1"/>
+              <w:left w:val="single" w:color="CCCCCC" w:sz="1"/>
+              <w:bottom w:val="single" w:color="CCCCCC" w:sz="1"/>
+              <w:right w:val="single" w:color="CCCCCC" w:sz="1"/>
+            </w:tcBorders>
+            <w:shd w:fill="F5F5F5" w:val="clear"/>
+            <w:tcMar>
+              <w:top w:type="dxa" w:w="80"/>
+              <w:left w:type="dxa" w:w="120"/>
+              <w:bottom w:type="dxa" w:w="80"/>
+              <w:right w:type="dxa" w:w="120"/>
+            </w:tcMar>
+          </w:tcPr>
+          <w:p>
+            <w:r>
+              <w:rPr>
+                <w:rFonts w:ascii="Arial" w:cs="Arial" w:eastAsia="Arial" w:hAnsi="Arial"/>
+                <w:b w:val="false"/>
+                <w:bCs w:val="false"/>
+                <w:color w:val="1C1C1C"/>
+                <w:sz w:val="21"/>
+                <w:szCs w:val="21"/>
+              </w:rPr>
+              <w:t xml:space="preserve">Negation = non before the verb; pronoun on the infinitive.</w:t>
+            </w:r>
+          </w:p>
+        </w:tc>
+      </w:tr>
+      <w:tr>
+        <w:tc>
+          <w:tcPr>
+            <w:tcW w:type="dxa" w:w="2600"/>
+            <w:tcBorders>
+              <w:top w:val="single" w:color="CCCCCC" w:sz="1"/>
+              <w:left w:val="single" w:color="CCCCCC" w:sz="1"/>
+              <w:bottom w:val="single" w:color="CCCCCC" w:sz="1"/>
+              <w:right w:val="single" w:color="CCCCCC" w:sz="1"/>
+            </w:tcBorders>
+            <w:shd w:fill="FFFFFF" w:val="clear"/>
+            <w:tcMar>
+              <w:top w:type="dxa" w:w="80"/>
+              <w:left w:type="dxa" w:w="120"/>
+              <w:bottom w:type="dxa" w:w="80"/>
+              <w:right w:type="dxa" w:w="120"/>
+            </w:tcMar>
+          </w:tcPr>
+          <w:p>
+            <w:r>
+              <w:rPr>
+                <w:rFonts w:ascii="Arial" w:cs="Arial" w:eastAsia="Arial" w:hAnsi="Arial"/>
+                <w:b w:val="false"/>
+                <w:bCs w:val="false"/>
+                <w:color w:val="1C1C1C"/>
+                <w:sz w:val="21"/>
+                <w:szCs w:val="21"/>
+              </w:rPr>
+              <w:t xml:space="preserve">Le ho dato la mela.</w:t>
+            </w:r>
+          </w:p>
+        </w:tc>
+        <w:tc>
+          <w:tcPr>
+            <w:tcW w:type="dxa" w:w="2800"/>
+            <w:tcBorders>
+              <w:top w:val="single" w:color="CCCCCC" w:sz="1"/>
+              <w:left w:val="single" w:color="CCCCCC" w:sz="1"/>
+              <w:bottom w:val="single" w:color="CCCCCC" w:sz="1"/>
+              <w:right w:val="single" w:color="CCCCCC" w:sz="1"/>
+            </w:tcBorders>
+            <w:shd w:fill="FFFFFF" w:val="clear"/>
+            <w:tcMar>
+              <w:top w:type="dxa" w:w="80"/>
+              <w:left w:type="dxa" w:w="120"/>
+              <w:bottom w:type="dxa" w:w="80"/>
+              <w:right w:type="dxa" w:w="120"/>
+            </w:tcMar>
+          </w:tcPr>
+          <w:p>
+            <w:r>
+              <w:rPr>
+                <w:rFonts w:ascii="Arial" w:cs="Arial" w:eastAsia="Arial" w:hAnsi="Arial"/>
+                <w:b w:val="false"/>
+                <w:bCs w:val="false"/>
+                <w:color w:val="1C1C1C"/>
+                <w:sz w:val="21"/>
+                <w:szCs w:val="21"/>
+              </w:rPr>
+              <w:t xml:space="preserve">I gave her the apple.</w:t>
+            </w:r>
+          </w:p>
+        </w:tc>
+        <w:tc>
+          <w:tcPr>
+            <w:tcW w:type="dxa" w:w="3960"/>
+            <w:tcBorders>
+              <w:top w:val="single" w:color="CCCCCC" w:sz="1"/>
+              <w:left w:val="single" w:color="CCCCCC" w:sz="1"/>
+              <w:bottom w:val="single" w:color="CCCCCC" w:sz="1"/>
+              <w:right w:val="single" w:color="CCCCCC" w:sz="1"/>
+            </w:tcBorders>
+            <w:shd w:fill="FFFFFF" w:val="clear"/>
+            <w:tcMar>
+              <w:top w:type="dxa" w:w="80"/>
+              <w:left w:type="dxa" w:w="120"/>
+              <w:bottom w:type="dxa" w:w="80"/>
+              <w:right w:type="dxa" w:w="120"/>
+            </w:tcMar>
+          </w:tcPr>
+          <w:p>
+            <w:r>
+              <w:rPr>
+                <w:rFonts w:ascii="Arial" w:cs="Arial" w:eastAsia="Arial" w:hAnsi="Arial"/>
+                <w:b w:val="false"/>
+                <w:bCs w:val="false"/>
+                <w:color w:val="1C1C1C"/>
+                <w:sz w:val="21"/>
+                <w:szCs w:val="21"/>
+              </w:rPr>
+              <w:t xml:space="preserve">Past = avere + participle; pronoun sits before ho.</w:t>
+            </w:r>
+          </w:p>
+        </w:tc>
+      </w:tr>
+      <w:tr>
+        <w:tc>
+          <w:tcPr>
+            <w:tcW w:type="dxa" w:w="2600"/>
+            <w:tcBorders>
+              <w:top w:val="single" w:color="CCCCCC" w:sz="1"/>
+              <w:left w:val="single" w:color="CCCCCC" w:sz="1"/>
+              <w:bottom w:val="single" w:color="CCCCCC" w:sz="1"/>
+              <w:right w:val="single" w:color="CCCCCC" w:sz="1"/>
+            </w:tcBorders>
+            <w:shd w:fill="F5F5F5" w:val="clear"/>
+            <w:tcMar>
+              <w:top w:type="dxa" w:w="80"/>
+              <w:left w:type="dxa" w:w="120"/>
+              <w:bottom w:type="dxa" w:w="80"/>
+              <w:right w:type="dxa" w:w="120"/>
+            </w:tcMar>
+          </w:tcPr>
+          <w:p>
+            <w:r>
+              <w:rPr>
+                <w:rFonts w:ascii="Arial" w:cs="Arial" w:eastAsia="Arial" w:hAnsi="Arial"/>
+                <w:b w:val="false"/>
+                <w:bCs w:val="false"/>
+                <w:color w:val="1C1C1C"/>
+                <w:sz w:val="21"/>
+                <w:szCs w:val="21"/>
+              </w:rPr>
+              <w:t xml:space="preserve">Quando me la dai?</w:t>
+            </w:r>
+          </w:p>
+        </w:tc>
+        <w:tc>
+          <w:tcPr>
+            <w:tcW w:type="dxa" w:w="2800"/>
+            <w:tcBorders>
+              <w:top w:val="single" w:color="CCCCCC" w:sz="1"/>
+              <w:left w:val="single" w:color="CCCCCC" w:sz="1"/>
+              <w:bottom w:val="single" w:color="CCCCCC" w:sz="1"/>
+              <w:right w:val="single" w:color="CCCCCC" w:sz="1"/>
+            </w:tcBorders>
+            <w:shd w:fill="F5F5F5" w:val="clear"/>
+            <w:tcMar>
+              <w:top w:type="dxa" w:w="80"/>
+              <w:left w:type="dxa" w:w="120"/>
+              <w:bottom w:type="dxa" w:w="80"/>
+              <w:right w:type="dxa" w:w="120"/>
+            </w:tcMar>
+          </w:tcPr>
+          <w:p>
+            <w:r>
+              <w:rPr>
+                <w:rFonts w:ascii="Arial" w:cs="Arial" w:eastAsia="Arial" w:hAnsi="Arial"/>
+                <w:b w:val="false"/>
+                <w:bCs w:val="false"/>
+                <w:color w:val="1C1C1C"/>
+                <w:sz w:val="21"/>
+                <w:szCs w:val="21"/>
+              </w:rPr>
+              <w:t xml:space="preserve">When are you giving it to me?</w:t>
+            </w:r>
+          </w:p>
+        </w:tc>
+        <w:tc>
+          <w:tcPr>
+            <w:tcW w:type="dxa" w:w="3960"/>
+            <w:tcBorders>
+              <w:top w:val="single" w:color="CCCCCC" w:sz="1"/>
+              <w:left w:val="single" w:color="CCCCCC" w:sz="1"/>
+              <w:bottom w:val="single" w:color="CCCCCC" w:sz="1"/>
+              <w:right w:val="single" w:color="CCCCCC" w:sz="1"/>
+            </w:tcBorders>
+            <w:shd w:fill="F5F5F5" w:val="clear"/>
+            <w:tcMar>
+              <w:top w:type="dxa" w:w="80"/>
+              <w:left w:type="dxa" w:w="120"/>
+              <w:bottom w:type="dxa" w:w="80"/>
+              <w:right w:type="dxa" w:w="120"/>
+            </w:tcMar>
+          </w:tcPr>
+          <w:p>
+            <w:r>
+              <w:rPr>
+                <w:rFonts w:ascii="Arial" w:cs="Arial" w:eastAsia="Arial" w:hAnsi="Arial"/>
+                <w:b w:val="false"/>
+                <w:bCs w:val="false"/>
+                <w:color w:val="1C1C1C"/>
+                <w:sz w:val="21"/>
+                <w:szCs w:val="21"/>
+              </w:rPr>
+              <w:t xml:space="preserve">Question by intonation only; mi → me before another pronoun.</w:t>
+            </w:r>
+          </w:p>
+        </w:tc>
+      </w:tr>
+    </w:tbl>
+    <w:tbl>
+      <w:tblPr>
+        <w:tblW w:type="dxa" w:w="9360"/>
+        <w:tblBorders>
+          <w:top w:val="single" w:color="auto" w:sz="4"/>
+          <w:left w:val="single" w:color="auto" w:sz="4"/>
+          <w:bottom w:val="single" w:color="auto" w:sz="4"/>
+          <w:right w:val="single" w:color="auto" w:sz="4"/>
+          <w:insideH w:val="single" w:color="auto" w:sz="4"/>
+          <w:insideV w:val="single" w:color="auto" w:sz="4"/>
+        </w:tblBorders>
+      </w:tblPr>
+      <w:tblGrid>
+        <w:gridCol w:w="9360"/>
+      </w:tblGrid>
+      <w:tr>
+        <w:tc>
+          <w:tcPr>
+            <w:tcW w:type="dxa" w:w="9360"/>
+            <w:tcBorders>
+              <w:top w:val="single" w:color="1A6B3C" w:sz="12"/>
+              <w:left w:val="none" w:color="FFFFFF" w:sz="0"/>
+              <w:bottom w:val="single" w:color="CCCCCC" w:sz="1"/>
+              <w:right w:val="none" w:color="FFFFFF" w:sz="0"/>
+            </w:tcBorders>
+            <w:shd w:fill="E8F5EE" w:val="clear"/>
+            <w:tcMar>
+              <w:top w:type="dxa" w:w="120"/>
+              <w:left w:type="dxa" w:w="200"/>
+              <w:bottom w:type="dxa" w:w="120"/>
+              <w:right w:type="dxa" w:w="200"/>
+            </w:tcMar>
+          </w:tcPr>
+          <w:p>
+            <w:pPr>
+              <w:spacing w:before="80" w:after="60"/>
+            </w:pPr>
+            <w:r>
+              <w:rPr>
+                <w:rFonts w:ascii="Arial" w:cs="Arial" w:eastAsia="Arial" w:hAnsi="Arial"/>
+                <w:b w:val="false"/>
+                <w:bCs w:val="false"/>
+                <w:color w:val="1A6B3C"/>
+                <w:sz w:val="22"/>
+                <w:szCs w:val="22"/>
+              </w:rPr>
+              <w:t xml:space="preserve">Everything below (0.1–0.10) is the detail that makes these ten sentences click.</w:t>
+            </w:r>
+          </w:p>
+        </w:tc>
+      </w:tr>
+    </w:tbl>
+    <w:p>
+      <w:pPr>
+        <w:pStyle w:val="Heading2"/>
+        <w:spacing w:before="280" w:after="100"/>
+      </w:pPr>
+      <w:r>
+        <w:rPr>
+          <w:rFonts w:ascii="Georgia" w:cs="Georgia" w:eastAsia="Georgia" w:hAnsi="Georgia"/>
+          <w:b/>
+          <w:bCs/>
+          <w:color w:val="1A6B3C"/>
+          <w:sz w:val="28"/>
+          <w:szCs w:val="28"/>
+        </w:rPr>
         <w:t xml:space="preserve">0.1  Pronunciation — Say It Right From Day One</w:t>
       </w:r>
     </w:p>
@@ -7836,6 +8984,3113 @@
     <w:p>
       <w:r>
         <w:br w:type="page"/>
+      </w:r>
+    </w:p>
+    <w:p>
+      <w:pPr>
+        <w:pStyle w:val="Heading2"/>
+        <w:spacing w:before="280" w:after="100"/>
+      </w:pPr>
+      <w:r>
+        <w:rPr>
+          <w:rFonts w:ascii="Georgia" w:cs="Georgia" w:eastAsia="Georgia" w:hAnsi="Georgia"/>
+          <w:b/>
+          <w:bCs/>
+          <w:color w:val="1A6B3C"/>
+          <w:sz w:val="28"/>
+          <w:szCs w:val="28"/>
+        </w:rPr>
+        <w:t xml:space="preserve">0.5  Cognate Rules — You Already Know Thousands of Words</w:t>
+      </w:r>
+    </w:p>
+    <w:p>
+      <w:pPr>
+        <w:spacing w:before="40" w:after="40"/>
+      </w:pPr>
+      <w:r>
+        <w:rPr>
+          <w:rFonts w:ascii="Arial" w:cs="Arial" w:eastAsia="Arial" w:hAnsi="Arial"/>
+          <w:b w:val="false"/>
+          <w:bCs w:val="false"/>
+          <w:color w:val="1C1C1C"/>
+          <w:sz w:val="22"/>
+          <w:szCs w:val="22"/>
+        </w:rPr>
+        <w:t xml:space="preserve">English and Italian share Latin roots. Swap the ending and most 'big' words appear for free.</w:t>
+      </w:r>
+    </w:p>
+    <w:tbl>
+      <w:tblPr>
+        <w:tblW w:type="dxa" w:w="9360"/>
+        <w:tblBorders>
+          <w:top w:val="single" w:color="auto" w:sz="4"/>
+          <w:left w:val="single" w:color="auto" w:sz="4"/>
+          <w:bottom w:val="single" w:color="auto" w:sz="4"/>
+          <w:right w:val="single" w:color="auto" w:sz="4"/>
+          <w:insideH w:val="single" w:color="auto" w:sz="4"/>
+          <w:insideV w:val="single" w:color="auto" w:sz="4"/>
+        </w:tblBorders>
+      </w:tblPr>
+      <w:tblGrid>
+        <w:gridCol w:w="2800"/>
+        <w:gridCol w:w="2200"/>
+        <w:gridCol w:w="4360"/>
+      </w:tblGrid>
+      <w:tr>
+        <w:tc>
+          <w:tcPr>
+            <w:tcW w:type="dxa" w:w="2800"/>
+            <w:tcBorders>
+              <w:top w:val="single" w:color="CCCCCC" w:sz="1"/>
+              <w:left w:val="single" w:color="CCCCCC" w:sz="1"/>
+              <w:bottom w:val="single" w:color="CCCCCC" w:sz="1"/>
+              <w:right w:val="single" w:color="CCCCCC" w:sz="1"/>
+            </w:tcBorders>
+            <w:shd w:fill="1A6B3C" w:val="clear"/>
+            <w:tcMar>
+              <w:top w:type="dxa" w:w="80"/>
+              <w:left w:type="dxa" w:w="120"/>
+              <w:bottom w:type="dxa" w:w="80"/>
+              <w:right w:type="dxa" w:w="120"/>
+            </w:tcMar>
+          </w:tcPr>
+          <w:p>
+            <w:r>
+              <w:rPr>
+                <w:rFonts w:ascii="Arial" w:cs="Arial" w:eastAsia="Arial" w:hAnsi="Arial"/>
+                <w:b/>
+                <w:bCs/>
+                <w:color w:val="FFFFFF"/>
+                <w:sz w:val="21"/>
+                <w:szCs w:val="21"/>
+              </w:rPr>
+              <w:t xml:space="preserve">English ending</w:t>
+            </w:r>
+          </w:p>
+        </w:tc>
+        <w:tc>
+          <w:tcPr>
+            <w:tcW w:type="dxa" w:w="2200"/>
+            <w:tcBorders>
+              <w:top w:val="single" w:color="CCCCCC" w:sz="1"/>
+              <w:left w:val="single" w:color="CCCCCC" w:sz="1"/>
+              <w:bottom w:val="single" w:color="CCCCCC" w:sz="1"/>
+              <w:right w:val="single" w:color="CCCCCC" w:sz="1"/>
+            </w:tcBorders>
+            <w:shd w:fill="1A6B3C" w:val="clear"/>
+            <w:tcMar>
+              <w:top w:type="dxa" w:w="80"/>
+              <w:left w:type="dxa" w:w="120"/>
+              <w:bottom w:type="dxa" w:w="80"/>
+              <w:right w:type="dxa" w:w="120"/>
+            </w:tcMar>
+          </w:tcPr>
+          <w:p>
+            <w:r>
+              <w:rPr>
+                <w:rFonts w:ascii="Arial" w:cs="Arial" w:eastAsia="Arial" w:hAnsi="Arial"/>
+                <w:b/>
+                <w:bCs/>
+                <w:color w:val="FFFFFF"/>
+                <w:sz w:val="21"/>
+                <w:szCs w:val="21"/>
+              </w:rPr>
+              <w:t xml:space="preserve">Italian</w:t>
+            </w:r>
+          </w:p>
+        </w:tc>
+        <w:tc>
+          <w:tcPr>
+            <w:tcW w:type="dxa" w:w="4360"/>
+            <w:tcBorders>
+              <w:top w:val="single" w:color="CCCCCC" w:sz="1"/>
+              <w:left w:val="single" w:color="CCCCCC" w:sz="1"/>
+              <w:bottom w:val="single" w:color="CCCCCC" w:sz="1"/>
+              <w:right w:val="single" w:color="CCCCCC" w:sz="1"/>
+            </w:tcBorders>
+            <w:shd w:fill="1A6B3C" w:val="clear"/>
+            <w:tcMar>
+              <w:top w:type="dxa" w:w="80"/>
+              <w:left w:type="dxa" w:w="120"/>
+              <w:bottom w:type="dxa" w:w="80"/>
+              <w:right w:type="dxa" w:w="120"/>
+            </w:tcMar>
+          </w:tcPr>
+          <w:p>
+            <w:r>
+              <w:rPr>
+                <w:rFonts w:ascii="Arial" w:cs="Arial" w:eastAsia="Arial" w:hAnsi="Arial"/>
+                <w:b/>
+                <w:bCs/>
+                <w:color w:val="FFFFFF"/>
+                <w:sz w:val="21"/>
+                <w:szCs w:val="21"/>
+              </w:rPr>
+              <w:t xml:space="preserve">Example</w:t>
+            </w:r>
+          </w:p>
+        </w:tc>
+      </w:tr>
+      <w:tr>
+        <w:tc>
+          <w:tcPr>
+            <w:tcW w:type="dxa" w:w="2800"/>
+            <w:tcBorders>
+              <w:top w:val="single" w:color="CCCCCC" w:sz="1"/>
+              <w:left w:val="single" w:color="CCCCCC" w:sz="1"/>
+              <w:bottom w:val="single" w:color="CCCCCC" w:sz="1"/>
+              <w:right w:val="single" w:color="CCCCCC" w:sz="1"/>
+            </w:tcBorders>
+            <w:shd w:fill="FFFFFF" w:val="clear"/>
+            <w:tcMar>
+              <w:top w:type="dxa" w:w="80"/>
+              <w:left w:type="dxa" w:w="120"/>
+              <w:bottom w:type="dxa" w:w="80"/>
+              <w:right w:type="dxa" w:w="120"/>
+            </w:tcMar>
+          </w:tcPr>
+          <w:p>
+            <w:r>
+              <w:rPr>
+                <w:rFonts w:ascii="Arial" w:cs="Arial" w:eastAsia="Arial" w:hAnsi="Arial"/>
+                <w:b w:val="false"/>
+                <w:bCs w:val="false"/>
+                <w:color w:val="1C1C1C"/>
+                <w:sz w:val="21"/>
+                <w:szCs w:val="21"/>
+              </w:rPr>
+              <w:t xml:space="preserve">-tion</w:t>
+            </w:r>
+          </w:p>
+        </w:tc>
+        <w:tc>
+          <w:tcPr>
+            <w:tcW w:type="dxa" w:w="2200"/>
+            <w:tcBorders>
+              <w:top w:val="single" w:color="CCCCCC" w:sz="1"/>
+              <w:left w:val="single" w:color="CCCCCC" w:sz="1"/>
+              <w:bottom w:val="single" w:color="CCCCCC" w:sz="1"/>
+              <w:right w:val="single" w:color="CCCCCC" w:sz="1"/>
+            </w:tcBorders>
+            <w:shd w:fill="FFFFFF" w:val="clear"/>
+            <w:tcMar>
+              <w:top w:type="dxa" w:w="80"/>
+              <w:left w:type="dxa" w:w="120"/>
+              <w:bottom w:type="dxa" w:w="80"/>
+              <w:right w:type="dxa" w:w="120"/>
+            </w:tcMar>
+          </w:tcPr>
+          <w:p>
+            <w:r>
+              <w:rPr>
+                <w:rFonts w:ascii="Arial" w:cs="Arial" w:eastAsia="Arial" w:hAnsi="Arial"/>
+                <w:b w:val="false"/>
+                <w:bCs w:val="false"/>
+                <w:color w:val="1C1C1C"/>
+                <w:sz w:val="21"/>
+                <w:szCs w:val="21"/>
+              </w:rPr>
+              <w:t xml:space="preserve">-zione</w:t>
+            </w:r>
+          </w:p>
+        </w:tc>
+        <w:tc>
+          <w:tcPr>
+            <w:tcW w:type="dxa" w:w="4360"/>
+            <w:tcBorders>
+              <w:top w:val="single" w:color="CCCCCC" w:sz="1"/>
+              <w:left w:val="single" w:color="CCCCCC" w:sz="1"/>
+              <w:bottom w:val="single" w:color="CCCCCC" w:sz="1"/>
+              <w:right w:val="single" w:color="CCCCCC" w:sz="1"/>
+            </w:tcBorders>
+            <w:shd w:fill="FFFFFF" w:val="clear"/>
+            <w:tcMar>
+              <w:top w:type="dxa" w:w="80"/>
+              <w:left w:type="dxa" w:w="120"/>
+              <w:bottom w:type="dxa" w:w="80"/>
+              <w:right w:type="dxa" w:w="120"/>
+            </w:tcMar>
+          </w:tcPr>
+          <w:p>
+            <w:r>
+              <w:rPr>
+                <w:rFonts w:ascii="Arial" w:cs="Arial" w:eastAsia="Arial" w:hAnsi="Arial"/>
+                <w:b w:val="false"/>
+                <w:bCs w:val="false"/>
+                <w:color w:val="1C1C1C"/>
+                <w:sz w:val="21"/>
+                <w:szCs w:val="21"/>
+              </w:rPr>
+              <w:t xml:space="preserve">information → informazione</w:t>
+            </w:r>
+          </w:p>
+        </w:tc>
+      </w:tr>
+      <w:tr>
+        <w:tc>
+          <w:tcPr>
+            <w:tcW w:type="dxa" w:w="2800"/>
+            <w:tcBorders>
+              <w:top w:val="single" w:color="CCCCCC" w:sz="1"/>
+              <w:left w:val="single" w:color="CCCCCC" w:sz="1"/>
+              <w:bottom w:val="single" w:color="CCCCCC" w:sz="1"/>
+              <w:right w:val="single" w:color="CCCCCC" w:sz="1"/>
+            </w:tcBorders>
+            <w:shd w:fill="F5F5F5" w:val="clear"/>
+            <w:tcMar>
+              <w:top w:type="dxa" w:w="80"/>
+              <w:left w:type="dxa" w:w="120"/>
+              <w:bottom w:type="dxa" w:w="80"/>
+              <w:right w:type="dxa" w:w="120"/>
+            </w:tcMar>
+          </w:tcPr>
+          <w:p>
+            <w:r>
+              <w:rPr>
+                <w:rFonts w:ascii="Arial" w:cs="Arial" w:eastAsia="Arial" w:hAnsi="Arial"/>
+                <w:b w:val="false"/>
+                <w:bCs w:val="false"/>
+                <w:color w:val="1C1C1C"/>
+                <w:sz w:val="21"/>
+                <w:szCs w:val="21"/>
+              </w:rPr>
+              <w:t xml:space="preserve">-ty</w:t>
+            </w:r>
+          </w:p>
+        </w:tc>
+        <w:tc>
+          <w:tcPr>
+            <w:tcW w:type="dxa" w:w="2200"/>
+            <w:tcBorders>
+              <w:top w:val="single" w:color="CCCCCC" w:sz="1"/>
+              <w:left w:val="single" w:color="CCCCCC" w:sz="1"/>
+              <w:bottom w:val="single" w:color="CCCCCC" w:sz="1"/>
+              <w:right w:val="single" w:color="CCCCCC" w:sz="1"/>
+            </w:tcBorders>
+            <w:shd w:fill="F5F5F5" w:val="clear"/>
+            <w:tcMar>
+              <w:top w:type="dxa" w:w="80"/>
+              <w:left w:type="dxa" w:w="120"/>
+              <w:bottom w:type="dxa" w:w="80"/>
+              <w:right w:type="dxa" w:w="120"/>
+            </w:tcMar>
+          </w:tcPr>
+          <w:p>
+            <w:r>
+              <w:rPr>
+                <w:rFonts w:ascii="Arial" w:cs="Arial" w:eastAsia="Arial" w:hAnsi="Arial"/>
+                <w:b w:val="false"/>
+                <w:bCs w:val="false"/>
+                <w:color w:val="1C1C1C"/>
+                <w:sz w:val="21"/>
+                <w:szCs w:val="21"/>
+              </w:rPr>
+              <w:t xml:space="preserve">-tà</w:t>
+            </w:r>
+          </w:p>
+        </w:tc>
+        <w:tc>
+          <w:tcPr>
+            <w:tcW w:type="dxa" w:w="4360"/>
+            <w:tcBorders>
+              <w:top w:val="single" w:color="CCCCCC" w:sz="1"/>
+              <w:left w:val="single" w:color="CCCCCC" w:sz="1"/>
+              <w:bottom w:val="single" w:color="CCCCCC" w:sz="1"/>
+              <w:right w:val="single" w:color="CCCCCC" w:sz="1"/>
+            </w:tcBorders>
+            <w:shd w:fill="F5F5F5" w:val="clear"/>
+            <w:tcMar>
+              <w:top w:type="dxa" w:w="80"/>
+              <w:left w:type="dxa" w:w="120"/>
+              <w:bottom w:type="dxa" w:w="80"/>
+              <w:right w:type="dxa" w:w="120"/>
+            </w:tcMar>
+          </w:tcPr>
+          <w:p>
+            <w:r>
+              <w:rPr>
+                <w:rFonts w:ascii="Arial" w:cs="Arial" w:eastAsia="Arial" w:hAnsi="Arial"/>
+                <w:b w:val="false"/>
+                <w:bCs w:val="false"/>
+                <w:color w:val="1C1C1C"/>
+                <w:sz w:val="21"/>
+                <w:szCs w:val="21"/>
+              </w:rPr>
+              <w:t xml:space="preserve">city → città, university → università</w:t>
+            </w:r>
+          </w:p>
+        </w:tc>
+      </w:tr>
+      <w:tr>
+        <w:tc>
+          <w:tcPr>
+            <w:tcW w:type="dxa" w:w="2800"/>
+            <w:tcBorders>
+              <w:top w:val="single" w:color="CCCCCC" w:sz="1"/>
+              <w:left w:val="single" w:color="CCCCCC" w:sz="1"/>
+              <w:bottom w:val="single" w:color="CCCCCC" w:sz="1"/>
+              <w:right w:val="single" w:color="CCCCCC" w:sz="1"/>
+            </w:tcBorders>
+            <w:shd w:fill="FFFFFF" w:val="clear"/>
+            <w:tcMar>
+              <w:top w:type="dxa" w:w="80"/>
+              <w:left w:type="dxa" w:w="120"/>
+              <w:bottom w:type="dxa" w:w="80"/>
+              <w:right w:type="dxa" w:w="120"/>
+            </w:tcMar>
+          </w:tcPr>
+          <w:p>
+            <w:r>
+              <w:rPr>
+                <w:rFonts w:ascii="Arial" w:cs="Arial" w:eastAsia="Arial" w:hAnsi="Arial"/>
+                <w:b w:val="false"/>
+                <w:bCs w:val="false"/>
+                <w:color w:val="1C1C1C"/>
+                <w:sz w:val="21"/>
+                <w:szCs w:val="21"/>
+              </w:rPr>
+              <w:t xml:space="preserve">-ble</w:t>
+            </w:r>
+          </w:p>
+        </w:tc>
+        <w:tc>
+          <w:tcPr>
+            <w:tcW w:type="dxa" w:w="2200"/>
+            <w:tcBorders>
+              <w:top w:val="single" w:color="CCCCCC" w:sz="1"/>
+              <w:left w:val="single" w:color="CCCCCC" w:sz="1"/>
+              <w:bottom w:val="single" w:color="CCCCCC" w:sz="1"/>
+              <w:right w:val="single" w:color="CCCCCC" w:sz="1"/>
+            </w:tcBorders>
+            <w:shd w:fill="FFFFFF" w:val="clear"/>
+            <w:tcMar>
+              <w:top w:type="dxa" w:w="80"/>
+              <w:left w:type="dxa" w:w="120"/>
+              <w:bottom w:type="dxa" w:w="80"/>
+              <w:right w:type="dxa" w:w="120"/>
+            </w:tcMar>
+          </w:tcPr>
+          <w:p>
+            <w:r>
+              <w:rPr>
+                <w:rFonts w:ascii="Arial" w:cs="Arial" w:eastAsia="Arial" w:hAnsi="Arial"/>
+                <w:b w:val="false"/>
+                <w:bCs w:val="false"/>
+                <w:color w:val="1C1C1C"/>
+                <w:sz w:val="21"/>
+                <w:szCs w:val="21"/>
+              </w:rPr>
+              <w:t xml:space="preserve">-bile</w:t>
+            </w:r>
+          </w:p>
+        </w:tc>
+        <w:tc>
+          <w:tcPr>
+            <w:tcW w:type="dxa" w:w="4360"/>
+            <w:tcBorders>
+              <w:top w:val="single" w:color="CCCCCC" w:sz="1"/>
+              <w:left w:val="single" w:color="CCCCCC" w:sz="1"/>
+              <w:bottom w:val="single" w:color="CCCCCC" w:sz="1"/>
+              <w:right w:val="single" w:color="CCCCCC" w:sz="1"/>
+            </w:tcBorders>
+            <w:shd w:fill="FFFFFF" w:val="clear"/>
+            <w:tcMar>
+              <w:top w:type="dxa" w:w="80"/>
+              <w:left w:type="dxa" w:w="120"/>
+              <w:bottom w:type="dxa" w:w="80"/>
+              <w:right w:type="dxa" w:w="120"/>
+            </w:tcMar>
+          </w:tcPr>
+          <w:p>
+            <w:r>
+              <w:rPr>
+                <w:rFonts w:ascii="Arial" w:cs="Arial" w:eastAsia="Arial" w:hAnsi="Arial"/>
+                <w:b w:val="false"/>
+                <w:bCs w:val="false"/>
+                <w:color w:val="1C1C1C"/>
+                <w:sz w:val="21"/>
+                <w:szCs w:val="21"/>
+              </w:rPr>
+              <w:t xml:space="preserve">possible → possibile</w:t>
+            </w:r>
+          </w:p>
+        </w:tc>
+      </w:tr>
+      <w:tr>
+        <w:tc>
+          <w:tcPr>
+            <w:tcW w:type="dxa" w:w="2800"/>
+            <w:tcBorders>
+              <w:top w:val="single" w:color="CCCCCC" w:sz="1"/>
+              <w:left w:val="single" w:color="CCCCCC" w:sz="1"/>
+              <w:bottom w:val="single" w:color="CCCCCC" w:sz="1"/>
+              <w:right w:val="single" w:color="CCCCCC" w:sz="1"/>
+            </w:tcBorders>
+            <w:shd w:fill="F5F5F5" w:val="clear"/>
+            <w:tcMar>
+              <w:top w:type="dxa" w:w="80"/>
+              <w:left w:type="dxa" w:w="120"/>
+              <w:bottom w:type="dxa" w:w="80"/>
+              <w:right w:type="dxa" w:w="120"/>
+            </w:tcMar>
+          </w:tcPr>
+          <w:p>
+            <w:r>
+              <w:rPr>
+                <w:rFonts w:ascii="Arial" w:cs="Arial" w:eastAsia="Arial" w:hAnsi="Arial"/>
+                <w:b w:val="false"/>
+                <w:bCs w:val="false"/>
+                <w:color w:val="1C1C1C"/>
+                <w:sz w:val="21"/>
+                <w:szCs w:val="21"/>
+              </w:rPr>
+              <w:t xml:space="preserve">-ous</w:t>
+            </w:r>
+          </w:p>
+        </w:tc>
+        <w:tc>
+          <w:tcPr>
+            <w:tcW w:type="dxa" w:w="2200"/>
+            <w:tcBorders>
+              <w:top w:val="single" w:color="CCCCCC" w:sz="1"/>
+              <w:left w:val="single" w:color="CCCCCC" w:sz="1"/>
+              <w:bottom w:val="single" w:color="CCCCCC" w:sz="1"/>
+              <w:right w:val="single" w:color="CCCCCC" w:sz="1"/>
+            </w:tcBorders>
+            <w:shd w:fill="F5F5F5" w:val="clear"/>
+            <w:tcMar>
+              <w:top w:type="dxa" w:w="80"/>
+              <w:left w:type="dxa" w:w="120"/>
+              <w:bottom w:type="dxa" w:w="80"/>
+              <w:right w:type="dxa" w:w="120"/>
+            </w:tcMar>
+          </w:tcPr>
+          <w:p>
+            <w:r>
+              <w:rPr>
+                <w:rFonts w:ascii="Arial" w:cs="Arial" w:eastAsia="Arial" w:hAnsi="Arial"/>
+                <w:b w:val="false"/>
+                <w:bCs w:val="false"/>
+                <w:color w:val="1C1C1C"/>
+                <w:sz w:val="21"/>
+                <w:szCs w:val="21"/>
+              </w:rPr>
+              <w:t xml:space="preserve">-oso</w:t>
+            </w:r>
+          </w:p>
+        </w:tc>
+        <w:tc>
+          <w:tcPr>
+            <w:tcW w:type="dxa" w:w="4360"/>
+            <w:tcBorders>
+              <w:top w:val="single" w:color="CCCCCC" w:sz="1"/>
+              <w:left w:val="single" w:color="CCCCCC" w:sz="1"/>
+              <w:bottom w:val="single" w:color="CCCCCC" w:sz="1"/>
+              <w:right w:val="single" w:color="CCCCCC" w:sz="1"/>
+            </w:tcBorders>
+            <w:shd w:fill="F5F5F5" w:val="clear"/>
+            <w:tcMar>
+              <w:top w:type="dxa" w:w="80"/>
+              <w:left w:type="dxa" w:w="120"/>
+              <w:bottom w:type="dxa" w:w="80"/>
+              <w:right w:type="dxa" w:w="120"/>
+            </w:tcMar>
+          </w:tcPr>
+          <w:p>
+            <w:r>
+              <w:rPr>
+                <w:rFonts w:ascii="Arial" w:cs="Arial" w:eastAsia="Arial" w:hAnsi="Arial"/>
+                <w:b w:val="false"/>
+                <w:bCs w:val="false"/>
+                <w:color w:val="1C1C1C"/>
+                <w:sz w:val="21"/>
+                <w:szCs w:val="21"/>
+              </w:rPr>
+              <w:t xml:space="preserve">famous → famoso</w:t>
+            </w:r>
+          </w:p>
+        </w:tc>
+      </w:tr>
+      <w:tr>
+        <w:tc>
+          <w:tcPr>
+            <w:tcW w:type="dxa" w:w="2800"/>
+            <w:tcBorders>
+              <w:top w:val="single" w:color="CCCCCC" w:sz="1"/>
+              <w:left w:val="single" w:color="CCCCCC" w:sz="1"/>
+              <w:bottom w:val="single" w:color="CCCCCC" w:sz="1"/>
+              <w:right w:val="single" w:color="CCCCCC" w:sz="1"/>
+            </w:tcBorders>
+            <w:shd w:fill="FFFFFF" w:val="clear"/>
+            <w:tcMar>
+              <w:top w:type="dxa" w:w="80"/>
+              <w:left w:type="dxa" w:w="120"/>
+              <w:bottom w:type="dxa" w:w="80"/>
+              <w:right w:type="dxa" w:w="120"/>
+            </w:tcMar>
+          </w:tcPr>
+          <w:p>
+            <w:r>
+              <w:rPr>
+                <w:rFonts w:ascii="Arial" w:cs="Arial" w:eastAsia="Arial" w:hAnsi="Arial"/>
+                <w:b w:val="false"/>
+                <w:bCs w:val="false"/>
+                <w:color w:val="1C1C1C"/>
+                <w:sz w:val="21"/>
+                <w:szCs w:val="21"/>
+              </w:rPr>
+              <w:t xml:space="preserve">-ly</w:t>
+            </w:r>
+          </w:p>
+        </w:tc>
+        <w:tc>
+          <w:tcPr>
+            <w:tcW w:type="dxa" w:w="2200"/>
+            <w:tcBorders>
+              <w:top w:val="single" w:color="CCCCCC" w:sz="1"/>
+              <w:left w:val="single" w:color="CCCCCC" w:sz="1"/>
+              <w:bottom w:val="single" w:color="CCCCCC" w:sz="1"/>
+              <w:right w:val="single" w:color="CCCCCC" w:sz="1"/>
+            </w:tcBorders>
+            <w:shd w:fill="FFFFFF" w:val="clear"/>
+            <w:tcMar>
+              <w:top w:type="dxa" w:w="80"/>
+              <w:left w:type="dxa" w:w="120"/>
+              <w:bottom w:type="dxa" w:w="80"/>
+              <w:right w:type="dxa" w:w="120"/>
+            </w:tcMar>
+          </w:tcPr>
+          <w:p>
+            <w:r>
+              <w:rPr>
+                <w:rFonts w:ascii="Arial" w:cs="Arial" w:eastAsia="Arial" w:hAnsi="Arial"/>
+                <w:b w:val="false"/>
+                <w:bCs w:val="false"/>
+                <w:color w:val="1C1C1C"/>
+                <w:sz w:val="21"/>
+                <w:szCs w:val="21"/>
+              </w:rPr>
+              <w:t xml:space="preserve">-mente</w:t>
+            </w:r>
+          </w:p>
+        </w:tc>
+        <w:tc>
+          <w:tcPr>
+            <w:tcW w:type="dxa" w:w="4360"/>
+            <w:tcBorders>
+              <w:top w:val="single" w:color="CCCCCC" w:sz="1"/>
+              <w:left w:val="single" w:color="CCCCCC" w:sz="1"/>
+              <w:bottom w:val="single" w:color="CCCCCC" w:sz="1"/>
+              <w:right w:val="single" w:color="CCCCCC" w:sz="1"/>
+            </w:tcBorders>
+            <w:shd w:fill="FFFFFF" w:val="clear"/>
+            <w:tcMar>
+              <w:top w:type="dxa" w:w="80"/>
+              <w:left w:type="dxa" w:w="120"/>
+              <w:bottom w:type="dxa" w:w="80"/>
+              <w:right w:type="dxa" w:w="120"/>
+            </w:tcMar>
+          </w:tcPr>
+          <w:p>
+            <w:r>
+              <w:rPr>
+                <w:rFonts w:ascii="Arial" w:cs="Arial" w:eastAsia="Arial" w:hAnsi="Arial"/>
+                <w:b w:val="false"/>
+                <w:bCs w:val="false"/>
+                <w:color w:val="1C1C1C"/>
+                <w:sz w:val="21"/>
+                <w:szCs w:val="21"/>
+              </w:rPr>
+              <w:t xml:space="preserve">normally → normalmente</w:t>
+            </w:r>
+          </w:p>
+        </w:tc>
+      </w:tr>
+      <w:tr>
+        <w:tc>
+          <w:tcPr>
+            <w:tcW w:type="dxa" w:w="2800"/>
+            <w:tcBorders>
+              <w:top w:val="single" w:color="CCCCCC" w:sz="1"/>
+              <w:left w:val="single" w:color="CCCCCC" w:sz="1"/>
+              <w:bottom w:val="single" w:color="CCCCCC" w:sz="1"/>
+              <w:right w:val="single" w:color="CCCCCC" w:sz="1"/>
+            </w:tcBorders>
+            <w:shd w:fill="F5F5F5" w:val="clear"/>
+            <w:tcMar>
+              <w:top w:type="dxa" w:w="80"/>
+              <w:left w:type="dxa" w:w="120"/>
+              <w:bottom w:type="dxa" w:w="80"/>
+              <w:right w:type="dxa" w:w="120"/>
+            </w:tcMar>
+          </w:tcPr>
+          <w:p>
+            <w:r>
+              <w:rPr>
+                <w:rFonts w:ascii="Arial" w:cs="Arial" w:eastAsia="Arial" w:hAnsi="Arial"/>
+                <w:b w:val="false"/>
+                <w:bCs w:val="false"/>
+                <w:color w:val="1C1C1C"/>
+                <w:sz w:val="21"/>
+                <w:szCs w:val="21"/>
+              </w:rPr>
+              <w:t xml:space="preserve">-ant / -ent</w:t>
+            </w:r>
+          </w:p>
+        </w:tc>
+        <w:tc>
+          <w:tcPr>
+            <w:tcW w:type="dxa" w:w="2200"/>
+            <w:tcBorders>
+              <w:top w:val="single" w:color="CCCCCC" w:sz="1"/>
+              <w:left w:val="single" w:color="CCCCCC" w:sz="1"/>
+              <w:bottom w:val="single" w:color="CCCCCC" w:sz="1"/>
+              <w:right w:val="single" w:color="CCCCCC" w:sz="1"/>
+            </w:tcBorders>
+            <w:shd w:fill="F5F5F5" w:val="clear"/>
+            <w:tcMar>
+              <w:top w:type="dxa" w:w="80"/>
+              <w:left w:type="dxa" w:w="120"/>
+              <w:bottom w:type="dxa" w:w="80"/>
+              <w:right w:type="dxa" w:w="120"/>
+            </w:tcMar>
+          </w:tcPr>
+          <w:p>
+            <w:r>
+              <w:rPr>
+                <w:rFonts w:ascii="Arial" w:cs="Arial" w:eastAsia="Arial" w:hAnsi="Arial"/>
+                <w:b w:val="false"/>
+                <w:bCs w:val="false"/>
+                <w:color w:val="1C1C1C"/>
+                <w:sz w:val="21"/>
+                <w:szCs w:val="21"/>
+              </w:rPr>
+              <w:t xml:space="preserve">-ante / -ente</w:t>
+            </w:r>
+          </w:p>
+        </w:tc>
+        <w:tc>
+          <w:tcPr>
+            <w:tcW w:type="dxa" w:w="4360"/>
+            <w:tcBorders>
+              <w:top w:val="single" w:color="CCCCCC" w:sz="1"/>
+              <w:left w:val="single" w:color="CCCCCC" w:sz="1"/>
+              <w:bottom w:val="single" w:color="CCCCCC" w:sz="1"/>
+              <w:right w:val="single" w:color="CCCCCC" w:sz="1"/>
+            </w:tcBorders>
+            <w:shd w:fill="F5F5F5" w:val="clear"/>
+            <w:tcMar>
+              <w:top w:type="dxa" w:w="80"/>
+              <w:left w:type="dxa" w:w="120"/>
+              <w:bottom w:type="dxa" w:w="80"/>
+              <w:right w:type="dxa" w:w="120"/>
+            </w:tcMar>
+          </w:tcPr>
+          <w:p>
+            <w:r>
+              <w:rPr>
+                <w:rFonts w:ascii="Arial" w:cs="Arial" w:eastAsia="Arial" w:hAnsi="Arial"/>
+                <w:b w:val="false"/>
+                <w:bCs w:val="false"/>
+                <w:color w:val="1C1C1C"/>
+                <w:sz w:val="21"/>
+                <w:szCs w:val="21"/>
+              </w:rPr>
+              <w:t xml:space="preserve">important → importante</w:t>
+            </w:r>
+          </w:p>
+        </w:tc>
+      </w:tr>
+      <w:tr>
+        <w:tc>
+          <w:tcPr>
+            <w:tcW w:type="dxa" w:w="2800"/>
+            <w:tcBorders>
+              <w:top w:val="single" w:color="CCCCCC" w:sz="1"/>
+              <w:left w:val="single" w:color="CCCCCC" w:sz="1"/>
+              <w:bottom w:val="single" w:color="CCCCCC" w:sz="1"/>
+              <w:right w:val="single" w:color="CCCCCC" w:sz="1"/>
+            </w:tcBorders>
+            <w:shd w:fill="FFFFFF" w:val="clear"/>
+            <w:tcMar>
+              <w:top w:type="dxa" w:w="80"/>
+              <w:left w:type="dxa" w:w="120"/>
+              <w:bottom w:type="dxa" w:w="80"/>
+              <w:right w:type="dxa" w:w="120"/>
+            </w:tcMar>
+          </w:tcPr>
+          <w:p>
+            <w:r>
+              <w:rPr>
+                <w:rFonts w:ascii="Arial" w:cs="Arial" w:eastAsia="Arial" w:hAnsi="Arial"/>
+                <w:b w:val="false"/>
+                <w:bCs w:val="false"/>
+                <w:color w:val="1C1C1C"/>
+                <w:sz w:val="21"/>
+                <w:szCs w:val="21"/>
+              </w:rPr>
+              <w:t xml:space="preserve">-ism / -ist</w:t>
+            </w:r>
+          </w:p>
+        </w:tc>
+        <w:tc>
+          <w:tcPr>
+            <w:tcW w:type="dxa" w:w="2200"/>
+            <w:tcBorders>
+              <w:top w:val="single" w:color="CCCCCC" w:sz="1"/>
+              <w:left w:val="single" w:color="CCCCCC" w:sz="1"/>
+              <w:bottom w:val="single" w:color="CCCCCC" w:sz="1"/>
+              <w:right w:val="single" w:color="CCCCCC" w:sz="1"/>
+            </w:tcBorders>
+            <w:shd w:fill="FFFFFF" w:val="clear"/>
+            <w:tcMar>
+              <w:top w:type="dxa" w:w="80"/>
+              <w:left w:type="dxa" w:w="120"/>
+              <w:bottom w:type="dxa" w:w="80"/>
+              <w:right w:type="dxa" w:w="120"/>
+            </w:tcMar>
+          </w:tcPr>
+          <w:p>
+            <w:r>
+              <w:rPr>
+                <w:rFonts w:ascii="Arial" w:cs="Arial" w:eastAsia="Arial" w:hAnsi="Arial"/>
+                <w:b w:val="false"/>
+                <w:bCs w:val="false"/>
+                <w:color w:val="1C1C1C"/>
+                <w:sz w:val="21"/>
+                <w:szCs w:val="21"/>
+              </w:rPr>
+              <w:t xml:space="preserve">-ismo / -ista</w:t>
+            </w:r>
+          </w:p>
+        </w:tc>
+        <w:tc>
+          <w:tcPr>
+            <w:tcW w:type="dxa" w:w="4360"/>
+            <w:tcBorders>
+              <w:top w:val="single" w:color="CCCCCC" w:sz="1"/>
+              <w:left w:val="single" w:color="CCCCCC" w:sz="1"/>
+              <w:bottom w:val="single" w:color="CCCCCC" w:sz="1"/>
+              <w:right w:val="single" w:color="CCCCCC" w:sz="1"/>
+            </w:tcBorders>
+            <w:shd w:fill="FFFFFF" w:val="clear"/>
+            <w:tcMar>
+              <w:top w:type="dxa" w:w="80"/>
+              <w:left w:type="dxa" w:w="120"/>
+              <w:bottom w:type="dxa" w:w="80"/>
+              <w:right w:type="dxa" w:w="120"/>
+            </w:tcMar>
+          </w:tcPr>
+          <w:p>
+            <w:r>
+              <w:rPr>
+                <w:rFonts w:ascii="Arial" w:cs="Arial" w:eastAsia="Arial" w:hAnsi="Arial"/>
+                <w:b w:val="false"/>
+                <w:bCs w:val="false"/>
+                <w:color w:val="1C1C1C"/>
+                <w:sz w:val="21"/>
+                <w:szCs w:val="21"/>
+              </w:rPr>
+              <w:t xml:space="preserve">tourism → turismo, artist → artista</w:t>
+            </w:r>
+          </w:p>
+        </w:tc>
+      </w:tr>
+    </w:tbl>
+    <w:tbl>
+      <w:tblPr>
+        <w:tblW w:type="dxa" w:w="9360"/>
+        <w:tblBorders>
+          <w:top w:val="single" w:color="auto" w:sz="4"/>
+          <w:left w:val="single" w:color="auto" w:sz="4"/>
+          <w:bottom w:val="single" w:color="auto" w:sz="4"/>
+          <w:right w:val="single" w:color="auto" w:sz="4"/>
+          <w:insideH w:val="single" w:color="auto" w:sz="4"/>
+          <w:insideV w:val="single" w:color="auto" w:sz="4"/>
+        </w:tblBorders>
+      </w:tblPr>
+      <w:tblGrid>
+        <w:gridCol w:w="9360"/>
+      </w:tblGrid>
+      <w:tr>
+        <w:tc>
+          <w:tcPr>
+            <w:tcW w:type="dxa" w:w="9360"/>
+            <w:tcBorders>
+              <w:top w:val="single" w:color="1A6B3C" w:sz="12"/>
+              <w:left w:val="none" w:color="FFFFFF" w:sz="0"/>
+              <w:bottom w:val="single" w:color="CCCCCC" w:sz="1"/>
+              <w:right w:val="none" w:color="FFFFFF" w:sz="0"/>
+            </w:tcBorders>
+            <w:shd w:fill="E8F5EE" w:val="clear"/>
+            <w:tcMar>
+              <w:top w:type="dxa" w:w="120"/>
+              <w:left w:type="dxa" w:w="200"/>
+              <w:bottom w:type="dxa" w:w="120"/>
+              <w:right w:type="dxa" w:w="200"/>
+            </w:tcMar>
+          </w:tcPr>
+          <w:p>
+            <w:pPr>
+              <w:spacing w:before="80" w:after="60"/>
+            </w:pPr>
+            <w:r>
+              <w:rPr>
+                <w:rFonts w:ascii="Arial" w:cs="Arial" w:eastAsia="Arial" w:hAnsi="Arial"/>
+                <w:b w:val="false"/>
+                <w:bCs w:val="false"/>
+                <w:color w:val="1A6B3C"/>
+                <w:sz w:val="22"/>
+                <w:szCs w:val="22"/>
+              </w:rPr>
+              <w:t xml:space="preserve">False friends: parente = relative (not parent); libreria = bookshop (biblioteca = library); caldo = hot (not cold); morbido = soft (not morbid); fattoria = farm (not factory).</w:t>
+            </w:r>
+          </w:p>
+        </w:tc>
+      </w:tr>
+    </w:tbl>
+    <w:p>
+      <w:pPr>
+        <w:pStyle w:val="Heading2"/>
+        <w:spacing w:before="280" w:after="100"/>
+      </w:pPr>
+      <w:r>
+        <w:rPr>
+          <w:rFonts w:ascii="Georgia" w:cs="Georgia" w:eastAsia="Georgia" w:hAnsi="Georgia"/>
+          <w:b/>
+          <w:bCs/>
+          <w:color w:val="1A6B3C"/>
+          <w:sz w:val="28"/>
+          <w:szCs w:val="28"/>
+        </w:rPr>
+        <w:t xml:space="preserve">0.6  Object Pronouns &amp; Where They Go</w:t>
+      </w:r>
+    </w:p>
+    <w:tbl>
+      <w:tblPr>
+        <w:tblW w:type="dxa" w:w="9360"/>
+        <w:tblBorders>
+          <w:top w:val="single" w:color="auto" w:sz="4"/>
+          <w:left w:val="single" w:color="auto" w:sz="4"/>
+          <w:bottom w:val="single" w:color="auto" w:sz="4"/>
+          <w:right w:val="single" w:color="auto" w:sz="4"/>
+          <w:insideH w:val="single" w:color="auto" w:sz="4"/>
+          <w:insideV w:val="single" w:color="auto" w:sz="4"/>
+        </w:tblBorders>
+      </w:tblPr>
+      <w:tblGrid>
+        <w:gridCol w:w="1860"/>
+        <w:gridCol w:w="1100"/>
+        <w:gridCol w:w="1100"/>
+        <w:gridCol w:w="1500"/>
+        <w:gridCol w:w="1100"/>
+        <w:gridCol w:w="1300"/>
+        <w:gridCol w:w="1400"/>
+      </w:tblGrid>
+      <w:tr>
+        <w:tc>
+          <w:tcPr>
+            <w:tcW w:type="dxa" w:w="1860"/>
+            <w:tcBorders>
+              <w:top w:val="single" w:color="CCCCCC" w:sz="1"/>
+              <w:left w:val="single" w:color="CCCCCC" w:sz="1"/>
+              <w:bottom w:val="single" w:color="CCCCCC" w:sz="1"/>
+              <w:right w:val="single" w:color="CCCCCC" w:sz="1"/>
+            </w:tcBorders>
+            <w:shd w:fill="1A6B3C" w:val="clear"/>
+            <w:tcMar>
+              <w:top w:type="dxa" w:w="80"/>
+              <w:left w:type="dxa" w:w="120"/>
+              <w:bottom w:type="dxa" w:w="80"/>
+              <w:right w:type="dxa" w:w="120"/>
+            </w:tcMar>
+          </w:tcPr>
+          <w:p>
+            <w:r>
+              <w:rPr>
+                <w:rFonts w:ascii="Arial" w:cs="Arial" w:eastAsia="Arial" w:hAnsi="Arial"/>
+                <w:b/>
+                <w:bCs/>
+                <w:color w:val="FFFFFF"/>
+                <w:sz w:val="21"/>
+                <w:szCs w:val="21"/>
+              </w:rPr>
+              <w:t xml:space="preserve">Type</w:t>
+            </w:r>
+          </w:p>
+        </w:tc>
+        <w:tc>
+          <w:tcPr>
+            <w:tcW w:type="dxa" w:w="1100"/>
+            <w:tcBorders>
+              <w:top w:val="single" w:color="CCCCCC" w:sz="1"/>
+              <w:left w:val="single" w:color="CCCCCC" w:sz="1"/>
+              <w:bottom w:val="single" w:color="CCCCCC" w:sz="1"/>
+              <w:right w:val="single" w:color="CCCCCC" w:sz="1"/>
+            </w:tcBorders>
+            <w:shd w:fill="1A6B3C" w:val="clear"/>
+            <w:tcMar>
+              <w:top w:type="dxa" w:w="80"/>
+              <w:left w:type="dxa" w:w="120"/>
+              <w:bottom w:type="dxa" w:w="80"/>
+              <w:right w:type="dxa" w:w="120"/>
+            </w:tcMar>
+          </w:tcPr>
+          <w:p>
+            <w:r>
+              <w:rPr>
+                <w:rFonts w:ascii="Arial" w:cs="Arial" w:eastAsia="Arial" w:hAnsi="Arial"/>
+                <w:b/>
+                <w:bCs/>
+                <w:color w:val="FFFFFF"/>
+                <w:sz w:val="21"/>
+                <w:szCs w:val="21"/>
+              </w:rPr>
+              <w:t xml:space="preserve">me</w:t>
+            </w:r>
+          </w:p>
+        </w:tc>
+        <w:tc>
+          <w:tcPr>
+            <w:tcW w:type="dxa" w:w="1100"/>
+            <w:tcBorders>
+              <w:top w:val="single" w:color="CCCCCC" w:sz="1"/>
+              <w:left w:val="single" w:color="CCCCCC" w:sz="1"/>
+              <w:bottom w:val="single" w:color="CCCCCC" w:sz="1"/>
+              <w:right w:val="single" w:color="CCCCCC" w:sz="1"/>
+            </w:tcBorders>
+            <w:shd w:fill="1A6B3C" w:val="clear"/>
+            <w:tcMar>
+              <w:top w:type="dxa" w:w="80"/>
+              <w:left w:type="dxa" w:w="120"/>
+              <w:bottom w:type="dxa" w:w="80"/>
+              <w:right w:type="dxa" w:w="120"/>
+            </w:tcMar>
+          </w:tcPr>
+          <w:p>
+            <w:r>
+              <w:rPr>
+                <w:rFonts w:ascii="Arial" w:cs="Arial" w:eastAsia="Arial" w:hAnsi="Arial"/>
+                <w:b/>
+                <w:bCs/>
+                <w:color w:val="FFFFFF"/>
+                <w:sz w:val="21"/>
+                <w:szCs w:val="21"/>
+              </w:rPr>
+              <w:t xml:space="preserve">you</w:t>
+            </w:r>
+          </w:p>
+        </w:tc>
+        <w:tc>
+          <w:tcPr>
+            <w:tcW w:type="dxa" w:w="1500"/>
+            <w:tcBorders>
+              <w:top w:val="single" w:color="CCCCCC" w:sz="1"/>
+              <w:left w:val="single" w:color="CCCCCC" w:sz="1"/>
+              <w:bottom w:val="single" w:color="CCCCCC" w:sz="1"/>
+              <w:right w:val="single" w:color="CCCCCC" w:sz="1"/>
+            </w:tcBorders>
+            <w:shd w:fill="1A6B3C" w:val="clear"/>
+            <w:tcMar>
+              <w:top w:type="dxa" w:w="80"/>
+              <w:left w:type="dxa" w:w="120"/>
+              <w:bottom w:type="dxa" w:w="80"/>
+              <w:right w:type="dxa" w:w="120"/>
+            </w:tcMar>
+          </w:tcPr>
+          <w:p>
+            <w:r>
+              <w:rPr>
+                <w:rFonts w:ascii="Arial" w:cs="Arial" w:eastAsia="Arial" w:hAnsi="Arial"/>
+                <w:b/>
+                <w:bCs/>
+                <w:color w:val="FFFFFF"/>
+                <w:sz w:val="21"/>
+                <w:szCs w:val="21"/>
+              </w:rPr>
+              <w:t xml:space="preserve">him/her/it</w:t>
+            </w:r>
+          </w:p>
+        </w:tc>
+        <w:tc>
+          <w:tcPr>
+            <w:tcW w:type="dxa" w:w="1100"/>
+            <w:tcBorders>
+              <w:top w:val="single" w:color="CCCCCC" w:sz="1"/>
+              <w:left w:val="single" w:color="CCCCCC" w:sz="1"/>
+              <w:bottom w:val="single" w:color="CCCCCC" w:sz="1"/>
+              <w:right w:val="single" w:color="CCCCCC" w:sz="1"/>
+            </w:tcBorders>
+            <w:shd w:fill="1A6B3C" w:val="clear"/>
+            <w:tcMar>
+              <w:top w:type="dxa" w:w="80"/>
+              <w:left w:type="dxa" w:w="120"/>
+              <w:bottom w:type="dxa" w:w="80"/>
+              <w:right w:type="dxa" w:w="120"/>
+            </w:tcMar>
+          </w:tcPr>
+          <w:p>
+            <w:r>
+              <w:rPr>
+                <w:rFonts w:ascii="Arial" w:cs="Arial" w:eastAsia="Arial" w:hAnsi="Arial"/>
+                <w:b/>
+                <w:bCs/>
+                <w:color w:val="FFFFFF"/>
+                <w:sz w:val="21"/>
+                <w:szCs w:val="21"/>
+              </w:rPr>
+              <w:t xml:space="preserve">us</w:t>
+            </w:r>
+          </w:p>
+        </w:tc>
+        <w:tc>
+          <w:tcPr>
+            <w:tcW w:type="dxa" w:w="1300"/>
+            <w:tcBorders>
+              <w:top w:val="single" w:color="CCCCCC" w:sz="1"/>
+              <w:left w:val="single" w:color="CCCCCC" w:sz="1"/>
+              <w:bottom w:val="single" w:color="CCCCCC" w:sz="1"/>
+              <w:right w:val="single" w:color="CCCCCC" w:sz="1"/>
+            </w:tcBorders>
+            <w:shd w:fill="1A6B3C" w:val="clear"/>
+            <w:tcMar>
+              <w:top w:type="dxa" w:w="80"/>
+              <w:left w:type="dxa" w:w="120"/>
+              <w:bottom w:type="dxa" w:w="80"/>
+              <w:right w:type="dxa" w:w="120"/>
+            </w:tcMar>
+          </w:tcPr>
+          <w:p>
+            <w:r>
+              <w:rPr>
+                <w:rFonts w:ascii="Arial" w:cs="Arial" w:eastAsia="Arial" w:hAnsi="Arial"/>
+                <w:b/>
+                <w:bCs/>
+                <w:color w:val="FFFFFF"/>
+                <w:sz w:val="21"/>
+                <w:szCs w:val="21"/>
+              </w:rPr>
+              <w:t xml:space="preserve">you (pl)</w:t>
+            </w:r>
+          </w:p>
+        </w:tc>
+        <w:tc>
+          <w:tcPr>
+            <w:tcW w:type="dxa" w:w="1400"/>
+            <w:tcBorders>
+              <w:top w:val="single" w:color="CCCCCC" w:sz="1"/>
+              <w:left w:val="single" w:color="CCCCCC" w:sz="1"/>
+              <w:bottom w:val="single" w:color="CCCCCC" w:sz="1"/>
+              <w:right w:val="single" w:color="CCCCCC" w:sz="1"/>
+            </w:tcBorders>
+            <w:shd w:fill="1A6B3C" w:val="clear"/>
+            <w:tcMar>
+              <w:top w:type="dxa" w:w="80"/>
+              <w:left w:type="dxa" w:w="120"/>
+              <w:bottom w:type="dxa" w:w="80"/>
+              <w:right w:type="dxa" w:w="120"/>
+            </w:tcMar>
+          </w:tcPr>
+          <w:p>
+            <w:r>
+              <w:rPr>
+                <w:rFonts w:ascii="Arial" w:cs="Arial" w:eastAsia="Arial" w:hAnsi="Arial"/>
+                <w:b/>
+                <w:bCs/>
+                <w:color w:val="FFFFFF"/>
+                <w:sz w:val="21"/>
+                <w:szCs w:val="21"/>
+              </w:rPr>
+              <w:t xml:space="preserve">them</w:t>
+            </w:r>
+          </w:p>
+        </w:tc>
+      </w:tr>
+      <w:tr>
+        <w:tc>
+          <w:tcPr>
+            <w:tcW w:type="dxa" w:w="1860"/>
+            <w:tcBorders>
+              <w:top w:val="single" w:color="CCCCCC" w:sz="1"/>
+              <w:left w:val="single" w:color="CCCCCC" w:sz="1"/>
+              <w:bottom w:val="single" w:color="CCCCCC" w:sz="1"/>
+              <w:right w:val="single" w:color="CCCCCC" w:sz="1"/>
+            </w:tcBorders>
+            <w:shd w:fill="FFFFFF" w:val="clear"/>
+            <w:tcMar>
+              <w:top w:type="dxa" w:w="80"/>
+              <w:left w:type="dxa" w:w="120"/>
+              <w:bottom w:type="dxa" w:w="80"/>
+              <w:right w:type="dxa" w:w="120"/>
+            </w:tcMar>
+          </w:tcPr>
+          <w:p>
+            <w:r>
+              <w:rPr>
+                <w:rFonts w:ascii="Arial" w:cs="Arial" w:eastAsia="Arial" w:hAnsi="Arial"/>
+                <w:b w:val="false"/>
+                <w:bCs w:val="false"/>
+                <w:color w:val="1C1C1C"/>
+                <w:sz w:val="21"/>
+                <w:szCs w:val="21"/>
+              </w:rPr>
+              <w:t xml:space="preserve">Direct (it/him)</w:t>
+            </w:r>
+          </w:p>
+        </w:tc>
+        <w:tc>
+          <w:tcPr>
+            <w:tcW w:type="dxa" w:w="1100"/>
+            <w:tcBorders>
+              <w:top w:val="single" w:color="CCCCCC" w:sz="1"/>
+              <w:left w:val="single" w:color="CCCCCC" w:sz="1"/>
+              <w:bottom w:val="single" w:color="CCCCCC" w:sz="1"/>
+              <w:right w:val="single" w:color="CCCCCC" w:sz="1"/>
+            </w:tcBorders>
+            <w:shd w:fill="FFFFFF" w:val="clear"/>
+            <w:tcMar>
+              <w:top w:type="dxa" w:w="80"/>
+              <w:left w:type="dxa" w:w="120"/>
+              <w:bottom w:type="dxa" w:w="80"/>
+              <w:right w:type="dxa" w:w="120"/>
+            </w:tcMar>
+          </w:tcPr>
+          <w:p>
+            <w:r>
+              <w:rPr>
+                <w:rFonts w:ascii="Arial" w:cs="Arial" w:eastAsia="Arial" w:hAnsi="Arial"/>
+                <w:b w:val="false"/>
+                <w:bCs w:val="false"/>
+                <w:color w:val="1C1C1C"/>
+                <w:sz w:val="21"/>
+                <w:szCs w:val="21"/>
+              </w:rPr>
+              <w:t xml:space="preserve">mi</w:t>
+            </w:r>
+          </w:p>
+        </w:tc>
+        <w:tc>
+          <w:tcPr>
+            <w:tcW w:type="dxa" w:w="1100"/>
+            <w:tcBorders>
+              <w:top w:val="single" w:color="CCCCCC" w:sz="1"/>
+              <w:left w:val="single" w:color="CCCCCC" w:sz="1"/>
+              <w:bottom w:val="single" w:color="CCCCCC" w:sz="1"/>
+              <w:right w:val="single" w:color="CCCCCC" w:sz="1"/>
+            </w:tcBorders>
+            <w:shd w:fill="FFFFFF" w:val="clear"/>
+            <w:tcMar>
+              <w:top w:type="dxa" w:w="80"/>
+              <w:left w:type="dxa" w:w="120"/>
+              <w:bottom w:type="dxa" w:w="80"/>
+              <w:right w:type="dxa" w:w="120"/>
+            </w:tcMar>
+          </w:tcPr>
+          <w:p>
+            <w:r>
+              <w:rPr>
+                <w:rFonts w:ascii="Arial" w:cs="Arial" w:eastAsia="Arial" w:hAnsi="Arial"/>
+                <w:b w:val="false"/>
+                <w:bCs w:val="false"/>
+                <w:color w:val="1C1C1C"/>
+                <w:sz w:val="21"/>
+                <w:szCs w:val="21"/>
+              </w:rPr>
+              <w:t xml:space="preserve">ti</w:t>
+            </w:r>
+          </w:p>
+        </w:tc>
+        <w:tc>
+          <w:tcPr>
+            <w:tcW w:type="dxa" w:w="1500"/>
+            <w:tcBorders>
+              <w:top w:val="single" w:color="CCCCCC" w:sz="1"/>
+              <w:left w:val="single" w:color="CCCCCC" w:sz="1"/>
+              <w:bottom w:val="single" w:color="CCCCCC" w:sz="1"/>
+              <w:right w:val="single" w:color="CCCCCC" w:sz="1"/>
+            </w:tcBorders>
+            <w:shd w:fill="FFFFFF" w:val="clear"/>
+            <w:tcMar>
+              <w:top w:type="dxa" w:w="80"/>
+              <w:left w:type="dxa" w:w="120"/>
+              <w:bottom w:type="dxa" w:w="80"/>
+              <w:right w:type="dxa" w:w="120"/>
+            </w:tcMar>
+          </w:tcPr>
+          <w:p>
+            <w:r>
+              <w:rPr>
+                <w:rFonts w:ascii="Arial" w:cs="Arial" w:eastAsia="Arial" w:hAnsi="Arial"/>
+                <w:b w:val="false"/>
+                <w:bCs w:val="false"/>
+                <w:color w:val="1C1C1C"/>
+                <w:sz w:val="21"/>
+                <w:szCs w:val="21"/>
+              </w:rPr>
+              <w:t xml:space="preserve">lo / la</w:t>
+            </w:r>
+          </w:p>
+        </w:tc>
+        <w:tc>
+          <w:tcPr>
+            <w:tcW w:type="dxa" w:w="1100"/>
+            <w:tcBorders>
+              <w:top w:val="single" w:color="CCCCCC" w:sz="1"/>
+              <w:left w:val="single" w:color="CCCCCC" w:sz="1"/>
+              <w:bottom w:val="single" w:color="CCCCCC" w:sz="1"/>
+              <w:right w:val="single" w:color="CCCCCC" w:sz="1"/>
+            </w:tcBorders>
+            <w:shd w:fill="FFFFFF" w:val="clear"/>
+            <w:tcMar>
+              <w:top w:type="dxa" w:w="80"/>
+              <w:left w:type="dxa" w:w="120"/>
+              <w:bottom w:type="dxa" w:w="80"/>
+              <w:right w:type="dxa" w:w="120"/>
+            </w:tcMar>
+          </w:tcPr>
+          <w:p>
+            <w:r>
+              <w:rPr>
+                <w:rFonts w:ascii="Arial" w:cs="Arial" w:eastAsia="Arial" w:hAnsi="Arial"/>
+                <w:b w:val="false"/>
+                <w:bCs w:val="false"/>
+                <w:color w:val="1C1C1C"/>
+                <w:sz w:val="21"/>
+                <w:szCs w:val="21"/>
+              </w:rPr>
+              <w:t xml:space="preserve">ci</w:t>
+            </w:r>
+          </w:p>
+        </w:tc>
+        <w:tc>
+          <w:tcPr>
+            <w:tcW w:type="dxa" w:w="1300"/>
+            <w:tcBorders>
+              <w:top w:val="single" w:color="CCCCCC" w:sz="1"/>
+              <w:left w:val="single" w:color="CCCCCC" w:sz="1"/>
+              <w:bottom w:val="single" w:color="CCCCCC" w:sz="1"/>
+              <w:right w:val="single" w:color="CCCCCC" w:sz="1"/>
+            </w:tcBorders>
+            <w:shd w:fill="FFFFFF" w:val="clear"/>
+            <w:tcMar>
+              <w:top w:type="dxa" w:w="80"/>
+              <w:left w:type="dxa" w:w="120"/>
+              <w:bottom w:type="dxa" w:w="80"/>
+              <w:right w:type="dxa" w:w="120"/>
+            </w:tcMar>
+          </w:tcPr>
+          <w:p>
+            <w:r>
+              <w:rPr>
+                <w:rFonts w:ascii="Arial" w:cs="Arial" w:eastAsia="Arial" w:hAnsi="Arial"/>
+                <w:b w:val="false"/>
+                <w:bCs w:val="false"/>
+                <w:color w:val="1C1C1C"/>
+                <w:sz w:val="21"/>
+                <w:szCs w:val="21"/>
+              </w:rPr>
+              <w:t xml:space="preserve">vi</w:t>
+            </w:r>
+          </w:p>
+        </w:tc>
+        <w:tc>
+          <w:tcPr>
+            <w:tcW w:type="dxa" w:w="1400"/>
+            <w:tcBorders>
+              <w:top w:val="single" w:color="CCCCCC" w:sz="1"/>
+              <w:left w:val="single" w:color="CCCCCC" w:sz="1"/>
+              <w:bottom w:val="single" w:color="CCCCCC" w:sz="1"/>
+              <w:right w:val="single" w:color="CCCCCC" w:sz="1"/>
+            </w:tcBorders>
+            <w:shd w:fill="FFFFFF" w:val="clear"/>
+            <w:tcMar>
+              <w:top w:type="dxa" w:w="80"/>
+              <w:left w:type="dxa" w:w="120"/>
+              <w:bottom w:type="dxa" w:w="80"/>
+              <w:right w:type="dxa" w:w="120"/>
+            </w:tcMar>
+          </w:tcPr>
+          <w:p>
+            <w:r>
+              <w:rPr>
+                <w:rFonts w:ascii="Arial" w:cs="Arial" w:eastAsia="Arial" w:hAnsi="Arial"/>
+                <w:b w:val="false"/>
+                <w:bCs w:val="false"/>
+                <w:color w:val="1C1C1C"/>
+                <w:sz w:val="21"/>
+                <w:szCs w:val="21"/>
+              </w:rPr>
+              <w:t xml:space="preserve">li / le</w:t>
+            </w:r>
+          </w:p>
+        </w:tc>
+      </w:tr>
+      <w:tr>
+        <w:tc>
+          <w:tcPr>
+            <w:tcW w:type="dxa" w:w="1860"/>
+            <w:tcBorders>
+              <w:top w:val="single" w:color="CCCCCC" w:sz="1"/>
+              <w:left w:val="single" w:color="CCCCCC" w:sz="1"/>
+              <w:bottom w:val="single" w:color="CCCCCC" w:sz="1"/>
+              <w:right w:val="single" w:color="CCCCCC" w:sz="1"/>
+            </w:tcBorders>
+            <w:shd w:fill="F5F5F5" w:val="clear"/>
+            <w:tcMar>
+              <w:top w:type="dxa" w:w="80"/>
+              <w:left w:type="dxa" w:w="120"/>
+              <w:bottom w:type="dxa" w:w="80"/>
+              <w:right w:type="dxa" w:w="120"/>
+            </w:tcMar>
+          </w:tcPr>
+          <w:p>
+            <w:r>
+              <w:rPr>
+                <w:rFonts w:ascii="Arial" w:cs="Arial" w:eastAsia="Arial" w:hAnsi="Arial"/>
+                <w:b w:val="false"/>
+                <w:bCs w:val="false"/>
+                <w:color w:val="1C1C1C"/>
+                <w:sz w:val="21"/>
+                <w:szCs w:val="21"/>
+              </w:rPr>
+              <w:t xml:space="preserve">Indirect (to…)</w:t>
+            </w:r>
+          </w:p>
+        </w:tc>
+        <w:tc>
+          <w:tcPr>
+            <w:tcW w:type="dxa" w:w="1100"/>
+            <w:tcBorders>
+              <w:top w:val="single" w:color="CCCCCC" w:sz="1"/>
+              <w:left w:val="single" w:color="CCCCCC" w:sz="1"/>
+              <w:bottom w:val="single" w:color="CCCCCC" w:sz="1"/>
+              <w:right w:val="single" w:color="CCCCCC" w:sz="1"/>
+            </w:tcBorders>
+            <w:shd w:fill="F5F5F5" w:val="clear"/>
+            <w:tcMar>
+              <w:top w:type="dxa" w:w="80"/>
+              <w:left w:type="dxa" w:w="120"/>
+              <w:bottom w:type="dxa" w:w="80"/>
+              <w:right w:type="dxa" w:w="120"/>
+            </w:tcMar>
+          </w:tcPr>
+          <w:p>
+            <w:r>
+              <w:rPr>
+                <w:rFonts w:ascii="Arial" w:cs="Arial" w:eastAsia="Arial" w:hAnsi="Arial"/>
+                <w:b w:val="false"/>
+                <w:bCs w:val="false"/>
+                <w:color w:val="1C1C1C"/>
+                <w:sz w:val="21"/>
+                <w:szCs w:val="21"/>
+              </w:rPr>
+              <w:t xml:space="preserve">mi</w:t>
+            </w:r>
+          </w:p>
+        </w:tc>
+        <w:tc>
+          <w:tcPr>
+            <w:tcW w:type="dxa" w:w="1100"/>
+            <w:tcBorders>
+              <w:top w:val="single" w:color="CCCCCC" w:sz="1"/>
+              <w:left w:val="single" w:color="CCCCCC" w:sz="1"/>
+              <w:bottom w:val="single" w:color="CCCCCC" w:sz="1"/>
+              <w:right w:val="single" w:color="CCCCCC" w:sz="1"/>
+            </w:tcBorders>
+            <w:shd w:fill="F5F5F5" w:val="clear"/>
+            <w:tcMar>
+              <w:top w:type="dxa" w:w="80"/>
+              <w:left w:type="dxa" w:w="120"/>
+              <w:bottom w:type="dxa" w:w="80"/>
+              <w:right w:type="dxa" w:w="120"/>
+            </w:tcMar>
+          </w:tcPr>
+          <w:p>
+            <w:r>
+              <w:rPr>
+                <w:rFonts w:ascii="Arial" w:cs="Arial" w:eastAsia="Arial" w:hAnsi="Arial"/>
+                <w:b w:val="false"/>
+                <w:bCs w:val="false"/>
+                <w:color w:val="1C1C1C"/>
+                <w:sz w:val="21"/>
+                <w:szCs w:val="21"/>
+              </w:rPr>
+              <w:t xml:space="preserve">ti</w:t>
+            </w:r>
+          </w:p>
+        </w:tc>
+        <w:tc>
+          <w:tcPr>
+            <w:tcW w:type="dxa" w:w="1500"/>
+            <w:tcBorders>
+              <w:top w:val="single" w:color="CCCCCC" w:sz="1"/>
+              <w:left w:val="single" w:color="CCCCCC" w:sz="1"/>
+              <w:bottom w:val="single" w:color="CCCCCC" w:sz="1"/>
+              <w:right w:val="single" w:color="CCCCCC" w:sz="1"/>
+            </w:tcBorders>
+            <w:shd w:fill="F5F5F5" w:val="clear"/>
+            <w:tcMar>
+              <w:top w:type="dxa" w:w="80"/>
+              <w:left w:type="dxa" w:w="120"/>
+              <w:bottom w:type="dxa" w:w="80"/>
+              <w:right w:type="dxa" w:w="120"/>
+            </w:tcMar>
+          </w:tcPr>
+          <w:p>
+            <w:r>
+              <w:rPr>
+                <w:rFonts w:ascii="Arial" w:cs="Arial" w:eastAsia="Arial" w:hAnsi="Arial"/>
+                <w:b w:val="false"/>
+                <w:bCs w:val="false"/>
+                <w:color w:val="1C1C1C"/>
+                <w:sz w:val="21"/>
+                <w:szCs w:val="21"/>
+              </w:rPr>
+              <w:t xml:space="preserve">gli / le</w:t>
+            </w:r>
+          </w:p>
+        </w:tc>
+        <w:tc>
+          <w:tcPr>
+            <w:tcW w:type="dxa" w:w="1100"/>
+            <w:tcBorders>
+              <w:top w:val="single" w:color="CCCCCC" w:sz="1"/>
+              <w:left w:val="single" w:color="CCCCCC" w:sz="1"/>
+              <w:bottom w:val="single" w:color="CCCCCC" w:sz="1"/>
+              <w:right w:val="single" w:color="CCCCCC" w:sz="1"/>
+            </w:tcBorders>
+            <w:shd w:fill="F5F5F5" w:val="clear"/>
+            <w:tcMar>
+              <w:top w:type="dxa" w:w="80"/>
+              <w:left w:type="dxa" w:w="120"/>
+              <w:bottom w:type="dxa" w:w="80"/>
+              <w:right w:type="dxa" w:w="120"/>
+            </w:tcMar>
+          </w:tcPr>
+          <w:p>
+            <w:r>
+              <w:rPr>
+                <w:rFonts w:ascii="Arial" w:cs="Arial" w:eastAsia="Arial" w:hAnsi="Arial"/>
+                <w:b w:val="false"/>
+                <w:bCs w:val="false"/>
+                <w:color w:val="1C1C1C"/>
+                <w:sz w:val="21"/>
+                <w:szCs w:val="21"/>
+              </w:rPr>
+              <w:t xml:space="preserve">ci</w:t>
+            </w:r>
+          </w:p>
+        </w:tc>
+        <w:tc>
+          <w:tcPr>
+            <w:tcW w:type="dxa" w:w="1300"/>
+            <w:tcBorders>
+              <w:top w:val="single" w:color="CCCCCC" w:sz="1"/>
+              <w:left w:val="single" w:color="CCCCCC" w:sz="1"/>
+              <w:bottom w:val="single" w:color="CCCCCC" w:sz="1"/>
+              <w:right w:val="single" w:color="CCCCCC" w:sz="1"/>
+            </w:tcBorders>
+            <w:shd w:fill="F5F5F5" w:val="clear"/>
+            <w:tcMar>
+              <w:top w:type="dxa" w:w="80"/>
+              <w:left w:type="dxa" w:w="120"/>
+              <w:bottom w:type="dxa" w:w="80"/>
+              <w:right w:type="dxa" w:w="120"/>
+            </w:tcMar>
+          </w:tcPr>
+          <w:p>
+            <w:r>
+              <w:rPr>
+                <w:rFonts w:ascii="Arial" w:cs="Arial" w:eastAsia="Arial" w:hAnsi="Arial"/>
+                <w:b w:val="false"/>
+                <w:bCs w:val="false"/>
+                <w:color w:val="1C1C1C"/>
+                <w:sz w:val="21"/>
+                <w:szCs w:val="21"/>
+              </w:rPr>
+              <w:t xml:space="preserve">vi</w:t>
+            </w:r>
+          </w:p>
+        </w:tc>
+        <w:tc>
+          <w:tcPr>
+            <w:tcW w:type="dxa" w:w="1400"/>
+            <w:tcBorders>
+              <w:top w:val="single" w:color="CCCCCC" w:sz="1"/>
+              <w:left w:val="single" w:color="CCCCCC" w:sz="1"/>
+              <w:bottom w:val="single" w:color="CCCCCC" w:sz="1"/>
+              <w:right w:val="single" w:color="CCCCCC" w:sz="1"/>
+            </w:tcBorders>
+            <w:shd w:fill="F5F5F5" w:val="clear"/>
+            <w:tcMar>
+              <w:top w:type="dxa" w:w="80"/>
+              <w:left w:type="dxa" w:w="120"/>
+              <w:bottom w:type="dxa" w:w="80"/>
+              <w:right w:type="dxa" w:w="120"/>
+            </w:tcMar>
+          </w:tcPr>
+          <w:p>
+            <w:r>
+              <w:rPr>
+                <w:rFonts w:ascii="Arial" w:cs="Arial" w:eastAsia="Arial" w:hAnsi="Arial"/>
+                <w:b w:val="false"/>
+                <w:bCs w:val="false"/>
+                <w:color w:val="1C1C1C"/>
+                <w:sz w:val="21"/>
+                <w:szCs w:val="21"/>
+              </w:rPr>
+              <w:t xml:space="preserve">gli</w:t>
+            </w:r>
+          </w:p>
+        </w:tc>
+      </w:tr>
+    </w:tbl>
+    <w:p>
+      <w:pPr>
+        <w:spacing w:before="40" w:after="40"/>
+      </w:pPr>
+      <w:r>
+        <w:rPr>
+          <w:rFonts w:ascii="Arial" w:cs="Arial" w:eastAsia="Arial" w:hAnsi="Arial"/>
+          <w:b w:val="false"/>
+          <w:bCs w:val="false"/>
+          <w:color w:val="1C1C1C"/>
+          <w:sz w:val="22"/>
+          <w:szCs w:val="22"/>
+        </w:rPr>
+        <w:t xml:space="preserve">Placement: before a conjugated verb — Lo vedo (I see it/him), Ti chiamo (I call you). Attach to an infinitive — Voglio vederlo (I want to see it); with modals both work: Lo voglio vedere = Voglio vederlo. Stacking (indirect + direct): mi/ti/ci/vi → me/te/ce/ve, and gli/le → glie- : Me lo dai? (Will you give it to me?), Glielo do (I give it to him/her).</w:t>
+      </w:r>
+    </w:p>
+    <w:p>
+      <w:pPr>
+        <w:pStyle w:val="Heading2"/>
+        <w:spacing w:before="280" w:after="100"/>
+      </w:pPr>
+      <w:r>
+        <w:rPr>
+          <w:rFonts w:ascii="Georgia" w:cs="Georgia" w:eastAsia="Georgia" w:hAnsi="Georgia"/>
+          <w:b/>
+          <w:bCs/>
+          <w:color w:val="1A6B3C"/>
+          <w:sz w:val="28"/>
+          <w:szCs w:val="28"/>
+        </w:rPr>
+        <w:t xml:space="preserve">0.7  Modal + Infinitive — The Request Engine</w:t>
+      </w:r>
+    </w:p>
+    <w:p>
+      <w:pPr>
+        <w:spacing w:before="40" w:after="40"/>
+      </w:pPr>
+      <w:r>
+        <w:rPr>
+          <w:rFonts w:ascii="Arial" w:cs="Arial" w:eastAsia="Arial" w:hAnsi="Arial"/>
+          <w:b w:val="false"/>
+          <w:bCs w:val="false"/>
+          <w:color w:val="1C1C1C"/>
+          <w:sz w:val="22"/>
+          <w:szCs w:val="22"/>
+        </w:rPr>
+        <w:t xml:space="preserve">volere / potere / dovere + an infinitive builds hundreds of sentences: Voglio mangiare (I want to eat), Posso pagare? (Can I pay?), Devo andare (I have to go). Polite forms you'll lean on: Vorrei… (I'd like…) and Potrei…? (Could I…?) — Vorrei un caffè. Potrei avere il conto?</w:t>
+      </w:r>
+    </w:p>
+    <w:p>
+      <w:pPr>
+        <w:pStyle w:val="Heading2"/>
+        <w:spacing w:before="280" w:after="100"/>
+      </w:pPr>
+      <w:r>
+        <w:rPr>
+          <w:rFonts w:ascii="Georgia" w:cs="Georgia" w:eastAsia="Georgia" w:hAnsi="Georgia"/>
+          <w:b/>
+          <w:bCs/>
+          <w:color w:val="1A6B3C"/>
+          <w:sz w:val="28"/>
+          <w:szCs w:val="28"/>
+        </w:rPr>
+        <w:t xml:space="preserve">0.8  Preposition + Article Contractions</w:t>
+      </w:r>
+    </w:p>
+    <w:p>
+      <w:pPr>
+        <w:spacing w:before="40" w:after="40"/>
+      </w:pPr>
+      <w:r>
+        <w:rPr>
+          <w:rFonts w:ascii="Arial" w:cs="Arial" w:eastAsia="Arial" w:hAnsi="Arial"/>
+          <w:b w:val="false"/>
+          <w:bCs w:val="false"/>
+          <w:color w:val="1C1C1C"/>
+          <w:sz w:val="22"/>
+          <w:szCs w:val="22"/>
+        </w:rPr>
+        <w:t xml:space="preserve">Five prepositions fuse with the article. Learn the pattern, not 30 separate words. (con and per do not contract.)</w:t>
+      </w:r>
+    </w:p>
+    <w:tbl>
+      <w:tblPr>
+        <w:tblW w:type="dxa" w:w="9360"/>
+        <w:tblBorders>
+          <w:top w:val="single" w:color="auto" w:sz="4"/>
+          <w:left w:val="single" w:color="auto" w:sz="4"/>
+          <w:bottom w:val="single" w:color="auto" w:sz="4"/>
+          <w:right w:val="single" w:color="auto" w:sz="4"/>
+          <w:insideH w:val="single" w:color="auto" w:sz="4"/>
+          <w:insideV w:val="single" w:color="auto" w:sz="4"/>
+        </w:tblBorders>
+      </w:tblPr>
+      <w:tblGrid>
+        <w:gridCol w:w="1260"/>
+        <w:gridCol w:w="1300"/>
+        <w:gridCol w:w="1400"/>
+        <w:gridCol w:w="1300"/>
+        <w:gridCol w:w="1100"/>
+        <w:gridCol w:w="1500"/>
+        <w:gridCol w:w="1500"/>
+      </w:tblGrid>
+      <w:tr>
+        <w:tc>
+          <w:tcPr>
+            <w:tcW w:type="dxa" w:w="1260"/>
+            <w:tcBorders>
+              <w:top w:val="single" w:color="CCCCCC" w:sz="1"/>
+              <w:left w:val="single" w:color="CCCCCC" w:sz="1"/>
+              <w:bottom w:val="single" w:color="CCCCCC" w:sz="1"/>
+              <w:right w:val="single" w:color="CCCCCC" w:sz="1"/>
+            </w:tcBorders>
+            <w:shd w:fill="1A6B3C" w:val="clear"/>
+            <w:tcMar>
+              <w:top w:type="dxa" w:w="80"/>
+              <w:left w:type="dxa" w:w="120"/>
+              <w:bottom w:type="dxa" w:w="80"/>
+              <w:right w:type="dxa" w:w="120"/>
+            </w:tcMar>
+          </w:tcPr>
+          <w:p>
+            <w:r>
+              <w:rPr>
+                <w:rFonts w:ascii="Arial" w:cs="Arial" w:eastAsia="Arial" w:hAnsi="Arial"/>
+                <w:b/>
+                <w:bCs/>
+                <w:color w:val="FFFFFF"/>
+                <w:sz w:val="21"/>
+                <w:szCs w:val="21"/>
+              </w:rPr>
+              <w:t xml:space="preserve">+</w:t>
+            </w:r>
+          </w:p>
+        </w:tc>
+        <w:tc>
+          <w:tcPr>
+            <w:tcW w:type="dxa" w:w="1300"/>
+            <w:tcBorders>
+              <w:top w:val="single" w:color="CCCCCC" w:sz="1"/>
+              <w:left w:val="single" w:color="CCCCCC" w:sz="1"/>
+              <w:bottom w:val="single" w:color="CCCCCC" w:sz="1"/>
+              <w:right w:val="single" w:color="CCCCCC" w:sz="1"/>
+            </w:tcBorders>
+            <w:shd w:fill="1A6B3C" w:val="clear"/>
+            <w:tcMar>
+              <w:top w:type="dxa" w:w="80"/>
+              <w:left w:type="dxa" w:w="120"/>
+              <w:bottom w:type="dxa" w:w="80"/>
+              <w:right w:type="dxa" w:w="120"/>
+            </w:tcMar>
+          </w:tcPr>
+          <w:p>
+            <w:r>
+              <w:rPr>
+                <w:rFonts w:ascii="Arial" w:cs="Arial" w:eastAsia="Arial" w:hAnsi="Arial"/>
+                <w:b/>
+                <w:bCs/>
+                <w:color w:val="FFFFFF"/>
+                <w:sz w:val="21"/>
+                <w:szCs w:val="21"/>
+              </w:rPr>
+              <w:t xml:space="preserve">il</w:t>
+            </w:r>
+          </w:p>
+        </w:tc>
+        <w:tc>
+          <w:tcPr>
+            <w:tcW w:type="dxa" w:w="1400"/>
+            <w:tcBorders>
+              <w:top w:val="single" w:color="CCCCCC" w:sz="1"/>
+              <w:left w:val="single" w:color="CCCCCC" w:sz="1"/>
+              <w:bottom w:val="single" w:color="CCCCCC" w:sz="1"/>
+              <w:right w:val="single" w:color="CCCCCC" w:sz="1"/>
+            </w:tcBorders>
+            <w:shd w:fill="1A6B3C" w:val="clear"/>
+            <w:tcMar>
+              <w:top w:type="dxa" w:w="80"/>
+              <w:left w:type="dxa" w:w="120"/>
+              <w:bottom w:type="dxa" w:w="80"/>
+              <w:right w:type="dxa" w:w="120"/>
+            </w:tcMar>
+          </w:tcPr>
+          <w:p>
+            <w:r>
+              <w:rPr>
+                <w:rFonts w:ascii="Arial" w:cs="Arial" w:eastAsia="Arial" w:hAnsi="Arial"/>
+                <w:b/>
+                <w:bCs/>
+                <w:color w:val="FFFFFF"/>
+                <w:sz w:val="21"/>
+                <w:szCs w:val="21"/>
+              </w:rPr>
+              <w:t xml:space="preserve">la</w:t>
+            </w:r>
+          </w:p>
+        </w:tc>
+        <w:tc>
+          <w:tcPr>
+            <w:tcW w:type="dxa" w:w="1300"/>
+            <w:tcBorders>
+              <w:top w:val="single" w:color="CCCCCC" w:sz="1"/>
+              <w:left w:val="single" w:color="CCCCCC" w:sz="1"/>
+              <w:bottom w:val="single" w:color="CCCCCC" w:sz="1"/>
+              <w:right w:val="single" w:color="CCCCCC" w:sz="1"/>
+            </w:tcBorders>
+            <w:shd w:fill="1A6B3C" w:val="clear"/>
+            <w:tcMar>
+              <w:top w:type="dxa" w:w="80"/>
+              <w:left w:type="dxa" w:w="120"/>
+              <w:bottom w:type="dxa" w:w="80"/>
+              <w:right w:type="dxa" w:w="120"/>
+            </w:tcMar>
+          </w:tcPr>
+          <w:p>
+            <w:r>
+              <w:rPr>
+                <w:rFonts w:ascii="Arial" w:cs="Arial" w:eastAsia="Arial" w:hAnsi="Arial"/>
+                <w:b/>
+                <w:bCs/>
+                <w:color w:val="FFFFFF"/>
+                <w:sz w:val="21"/>
+                <w:szCs w:val="21"/>
+              </w:rPr>
+              <w:t xml:space="preserve">l'</w:t>
+            </w:r>
+          </w:p>
+        </w:tc>
+        <w:tc>
+          <w:tcPr>
+            <w:tcW w:type="dxa" w:w="1100"/>
+            <w:tcBorders>
+              <w:top w:val="single" w:color="CCCCCC" w:sz="1"/>
+              <w:left w:val="single" w:color="CCCCCC" w:sz="1"/>
+              <w:bottom w:val="single" w:color="CCCCCC" w:sz="1"/>
+              <w:right w:val="single" w:color="CCCCCC" w:sz="1"/>
+            </w:tcBorders>
+            <w:shd w:fill="1A6B3C" w:val="clear"/>
+            <w:tcMar>
+              <w:top w:type="dxa" w:w="80"/>
+              <w:left w:type="dxa" w:w="120"/>
+              <w:bottom w:type="dxa" w:w="80"/>
+              <w:right w:type="dxa" w:w="120"/>
+            </w:tcMar>
+          </w:tcPr>
+          <w:p>
+            <w:r>
+              <w:rPr>
+                <w:rFonts w:ascii="Arial" w:cs="Arial" w:eastAsia="Arial" w:hAnsi="Arial"/>
+                <w:b/>
+                <w:bCs/>
+                <w:color w:val="FFFFFF"/>
+                <w:sz w:val="21"/>
+                <w:szCs w:val="21"/>
+              </w:rPr>
+              <w:t xml:space="preserve">i</w:t>
+            </w:r>
+          </w:p>
+        </w:tc>
+        <w:tc>
+          <w:tcPr>
+            <w:tcW w:type="dxa" w:w="1500"/>
+            <w:tcBorders>
+              <w:top w:val="single" w:color="CCCCCC" w:sz="1"/>
+              <w:left w:val="single" w:color="CCCCCC" w:sz="1"/>
+              <w:bottom w:val="single" w:color="CCCCCC" w:sz="1"/>
+              <w:right w:val="single" w:color="CCCCCC" w:sz="1"/>
+            </w:tcBorders>
+            <w:shd w:fill="1A6B3C" w:val="clear"/>
+            <w:tcMar>
+              <w:top w:type="dxa" w:w="80"/>
+              <w:left w:type="dxa" w:w="120"/>
+              <w:bottom w:type="dxa" w:w="80"/>
+              <w:right w:type="dxa" w:w="120"/>
+            </w:tcMar>
+          </w:tcPr>
+          <w:p>
+            <w:r>
+              <w:rPr>
+                <w:rFonts w:ascii="Arial" w:cs="Arial" w:eastAsia="Arial" w:hAnsi="Arial"/>
+                <w:b/>
+                <w:bCs/>
+                <w:color w:val="FFFFFF"/>
+                <w:sz w:val="21"/>
+                <w:szCs w:val="21"/>
+              </w:rPr>
+              <w:t xml:space="preserve">gli</w:t>
+            </w:r>
+          </w:p>
+        </w:tc>
+        <w:tc>
+          <w:tcPr>
+            <w:tcW w:type="dxa" w:w="1500"/>
+            <w:tcBorders>
+              <w:top w:val="single" w:color="CCCCCC" w:sz="1"/>
+              <w:left w:val="single" w:color="CCCCCC" w:sz="1"/>
+              <w:bottom w:val="single" w:color="CCCCCC" w:sz="1"/>
+              <w:right w:val="single" w:color="CCCCCC" w:sz="1"/>
+            </w:tcBorders>
+            <w:shd w:fill="1A6B3C" w:val="clear"/>
+            <w:tcMar>
+              <w:top w:type="dxa" w:w="80"/>
+              <w:left w:type="dxa" w:w="120"/>
+              <w:bottom w:type="dxa" w:w="80"/>
+              <w:right w:type="dxa" w:w="120"/>
+            </w:tcMar>
+          </w:tcPr>
+          <w:p>
+            <w:r>
+              <w:rPr>
+                <w:rFonts w:ascii="Arial" w:cs="Arial" w:eastAsia="Arial" w:hAnsi="Arial"/>
+                <w:b/>
+                <w:bCs/>
+                <w:color w:val="FFFFFF"/>
+                <w:sz w:val="21"/>
+                <w:szCs w:val="21"/>
+              </w:rPr>
+              <w:t xml:space="preserve">le</w:t>
+            </w:r>
+          </w:p>
+        </w:tc>
+      </w:tr>
+      <w:tr>
+        <w:tc>
+          <w:tcPr>
+            <w:tcW w:type="dxa" w:w="1260"/>
+            <w:tcBorders>
+              <w:top w:val="single" w:color="CCCCCC" w:sz="1"/>
+              <w:left w:val="single" w:color="CCCCCC" w:sz="1"/>
+              <w:bottom w:val="single" w:color="CCCCCC" w:sz="1"/>
+              <w:right w:val="single" w:color="CCCCCC" w:sz="1"/>
+            </w:tcBorders>
+            <w:shd w:fill="FFFFFF" w:val="clear"/>
+            <w:tcMar>
+              <w:top w:type="dxa" w:w="80"/>
+              <w:left w:type="dxa" w:w="120"/>
+              <w:bottom w:type="dxa" w:w="80"/>
+              <w:right w:type="dxa" w:w="120"/>
+            </w:tcMar>
+          </w:tcPr>
+          <w:p>
+            <w:r>
+              <w:rPr>
+                <w:rFonts w:ascii="Arial" w:cs="Arial" w:eastAsia="Arial" w:hAnsi="Arial"/>
+                <w:b w:val="false"/>
+                <w:bCs w:val="false"/>
+                <w:color w:val="1C1C1C"/>
+                <w:sz w:val="21"/>
+                <w:szCs w:val="21"/>
+              </w:rPr>
+              <w:t xml:space="preserve">di</w:t>
+            </w:r>
+          </w:p>
+        </w:tc>
+        <w:tc>
+          <w:tcPr>
+            <w:tcW w:type="dxa" w:w="1300"/>
+            <w:tcBorders>
+              <w:top w:val="single" w:color="CCCCCC" w:sz="1"/>
+              <w:left w:val="single" w:color="CCCCCC" w:sz="1"/>
+              <w:bottom w:val="single" w:color="CCCCCC" w:sz="1"/>
+              <w:right w:val="single" w:color="CCCCCC" w:sz="1"/>
+            </w:tcBorders>
+            <w:shd w:fill="FFFFFF" w:val="clear"/>
+            <w:tcMar>
+              <w:top w:type="dxa" w:w="80"/>
+              <w:left w:type="dxa" w:w="120"/>
+              <w:bottom w:type="dxa" w:w="80"/>
+              <w:right w:type="dxa" w:w="120"/>
+            </w:tcMar>
+          </w:tcPr>
+          <w:p>
+            <w:r>
+              <w:rPr>
+                <w:rFonts w:ascii="Arial" w:cs="Arial" w:eastAsia="Arial" w:hAnsi="Arial"/>
+                <w:b w:val="false"/>
+                <w:bCs w:val="false"/>
+                <w:color w:val="1C1C1C"/>
+                <w:sz w:val="21"/>
+                <w:szCs w:val="21"/>
+              </w:rPr>
+              <w:t xml:space="preserve">del</w:t>
+            </w:r>
+          </w:p>
+        </w:tc>
+        <w:tc>
+          <w:tcPr>
+            <w:tcW w:type="dxa" w:w="1400"/>
+            <w:tcBorders>
+              <w:top w:val="single" w:color="CCCCCC" w:sz="1"/>
+              <w:left w:val="single" w:color="CCCCCC" w:sz="1"/>
+              <w:bottom w:val="single" w:color="CCCCCC" w:sz="1"/>
+              <w:right w:val="single" w:color="CCCCCC" w:sz="1"/>
+            </w:tcBorders>
+            <w:shd w:fill="FFFFFF" w:val="clear"/>
+            <w:tcMar>
+              <w:top w:type="dxa" w:w="80"/>
+              <w:left w:type="dxa" w:w="120"/>
+              <w:bottom w:type="dxa" w:w="80"/>
+              <w:right w:type="dxa" w:w="120"/>
+            </w:tcMar>
+          </w:tcPr>
+          <w:p>
+            <w:r>
+              <w:rPr>
+                <w:rFonts w:ascii="Arial" w:cs="Arial" w:eastAsia="Arial" w:hAnsi="Arial"/>
+                <w:b w:val="false"/>
+                <w:bCs w:val="false"/>
+                <w:color w:val="1C1C1C"/>
+                <w:sz w:val="21"/>
+                <w:szCs w:val="21"/>
+              </w:rPr>
+              <w:t xml:space="preserve">della</w:t>
+            </w:r>
+          </w:p>
+        </w:tc>
+        <w:tc>
+          <w:tcPr>
+            <w:tcW w:type="dxa" w:w="1300"/>
+            <w:tcBorders>
+              <w:top w:val="single" w:color="CCCCCC" w:sz="1"/>
+              <w:left w:val="single" w:color="CCCCCC" w:sz="1"/>
+              <w:bottom w:val="single" w:color="CCCCCC" w:sz="1"/>
+              <w:right w:val="single" w:color="CCCCCC" w:sz="1"/>
+            </w:tcBorders>
+            <w:shd w:fill="FFFFFF" w:val="clear"/>
+            <w:tcMar>
+              <w:top w:type="dxa" w:w="80"/>
+              <w:left w:type="dxa" w:w="120"/>
+              <w:bottom w:type="dxa" w:w="80"/>
+              <w:right w:type="dxa" w:w="120"/>
+            </w:tcMar>
+          </w:tcPr>
+          <w:p>
+            <w:r>
+              <w:rPr>
+                <w:rFonts w:ascii="Arial" w:cs="Arial" w:eastAsia="Arial" w:hAnsi="Arial"/>
+                <w:b w:val="false"/>
+                <w:bCs w:val="false"/>
+                <w:color w:val="1C1C1C"/>
+                <w:sz w:val="21"/>
+                <w:szCs w:val="21"/>
+              </w:rPr>
+              <w:t xml:space="preserve">dell'</w:t>
+            </w:r>
+          </w:p>
+        </w:tc>
+        <w:tc>
+          <w:tcPr>
+            <w:tcW w:type="dxa" w:w="1100"/>
+            <w:tcBorders>
+              <w:top w:val="single" w:color="CCCCCC" w:sz="1"/>
+              <w:left w:val="single" w:color="CCCCCC" w:sz="1"/>
+              <w:bottom w:val="single" w:color="CCCCCC" w:sz="1"/>
+              <w:right w:val="single" w:color="CCCCCC" w:sz="1"/>
+            </w:tcBorders>
+            <w:shd w:fill="FFFFFF" w:val="clear"/>
+            <w:tcMar>
+              <w:top w:type="dxa" w:w="80"/>
+              <w:left w:type="dxa" w:w="120"/>
+              <w:bottom w:type="dxa" w:w="80"/>
+              <w:right w:type="dxa" w:w="120"/>
+            </w:tcMar>
+          </w:tcPr>
+          <w:p>
+            <w:r>
+              <w:rPr>
+                <w:rFonts w:ascii="Arial" w:cs="Arial" w:eastAsia="Arial" w:hAnsi="Arial"/>
+                <w:b w:val="false"/>
+                <w:bCs w:val="false"/>
+                <w:color w:val="1C1C1C"/>
+                <w:sz w:val="21"/>
+                <w:szCs w:val="21"/>
+              </w:rPr>
+              <w:t xml:space="preserve">dei</w:t>
+            </w:r>
+          </w:p>
+        </w:tc>
+        <w:tc>
+          <w:tcPr>
+            <w:tcW w:type="dxa" w:w="1500"/>
+            <w:tcBorders>
+              <w:top w:val="single" w:color="CCCCCC" w:sz="1"/>
+              <w:left w:val="single" w:color="CCCCCC" w:sz="1"/>
+              <w:bottom w:val="single" w:color="CCCCCC" w:sz="1"/>
+              <w:right w:val="single" w:color="CCCCCC" w:sz="1"/>
+            </w:tcBorders>
+            <w:shd w:fill="FFFFFF" w:val="clear"/>
+            <w:tcMar>
+              <w:top w:type="dxa" w:w="80"/>
+              <w:left w:type="dxa" w:w="120"/>
+              <w:bottom w:type="dxa" w:w="80"/>
+              <w:right w:type="dxa" w:w="120"/>
+            </w:tcMar>
+          </w:tcPr>
+          <w:p>
+            <w:r>
+              <w:rPr>
+                <w:rFonts w:ascii="Arial" w:cs="Arial" w:eastAsia="Arial" w:hAnsi="Arial"/>
+                <w:b w:val="false"/>
+                <w:bCs w:val="false"/>
+                <w:color w:val="1C1C1C"/>
+                <w:sz w:val="21"/>
+                <w:szCs w:val="21"/>
+              </w:rPr>
+              <w:t xml:space="preserve">degli</w:t>
+            </w:r>
+          </w:p>
+        </w:tc>
+        <w:tc>
+          <w:tcPr>
+            <w:tcW w:type="dxa" w:w="1500"/>
+            <w:tcBorders>
+              <w:top w:val="single" w:color="CCCCCC" w:sz="1"/>
+              <w:left w:val="single" w:color="CCCCCC" w:sz="1"/>
+              <w:bottom w:val="single" w:color="CCCCCC" w:sz="1"/>
+              <w:right w:val="single" w:color="CCCCCC" w:sz="1"/>
+            </w:tcBorders>
+            <w:shd w:fill="FFFFFF" w:val="clear"/>
+            <w:tcMar>
+              <w:top w:type="dxa" w:w="80"/>
+              <w:left w:type="dxa" w:w="120"/>
+              <w:bottom w:type="dxa" w:w="80"/>
+              <w:right w:type="dxa" w:w="120"/>
+            </w:tcMar>
+          </w:tcPr>
+          <w:p>
+            <w:r>
+              <w:rPr>
+                <w:rFonts w:ascii="Arial" w:cs="Arial" w:eastAsia="Arial" w:hAnsi="Arial"/>
+                <w:b w:val="false"/>
+                <w:bCs w:val="false"/>
+                <w:color w:val="1C1C1C"/>
+                <w:sz w:val="21"/>
+                <w:szCs w:val="21"/>
+              </w:rPr>
+              <w:t xml:space="preserve">delle</w:t>
+            </w:r>
+          </w:p>
+        </w:tc>
+      </w:tr>
+      <w:tr>
+        <w:tc>
+          <w:tcPr>
+            <w:tcW w:type="dxa" w:w="1260"/>
+            <w:tcBorders>
+              <w:top w:val="single" w:color="CCCCCC" w:sz="1"/>
+              <w:left w:val="single" w:color="CCCCCC" w:sz="1"/>
+              <w:bottom w:val="single" w:color="CCCCCC" w:sz="1"/>
+              <w:right w:val="single" w:color="CCCCCC" w:sz="1"/>
+            </w:tcBorders>
+            <w:shd w:fill="F5F5F5" w:val="clear"/>
+            <w:tcMar>
+              <w:top w:type="dxa" w:w="80"/>
+              <w:left w:type="dxa" w:w="120"/>
+              <w:bottom w:type="dxa" w:w="80"/>
+              <w:right w:type="dxa" w:w="120"/>
+            </w:tcMar>
+          </w:tcPr>
+          <w:p>
+            <w:r>
+              <w:rPr>
+                <w:rFonts w:ascii="Arial" w:cs="Arial" w:eastAsia="Arial" w:hAnsi="Arial"/>
+                <w:b w:val="false"/>
+                <w:bCs w:val="false"/>
+                <w:color w:val="1C1C1C"/>
+                <w:sz w:val="21"/>
+                <w:szCs w:val="21"/>
+              </w:rPr>
+              <w:t xml:space="preserve">a</w:t>
+            </w:r>
+          </w:p>
+        </w:tc>
+        <w:tc>
+          <w:tcPr>
+            <w:tcW w:type="dxa" w:w="1300"/>
+            <w:tcBorders>
+              <w:top w:val="single" w:color="CCCCCC" w:sz="1"/>
+              <w:left w:val="single" w:color="CCCCCC" w:sz="1"/>
+              <w:bottom w:val="single" w:color="CCCCCC" w:sz="1"/>
+              <w:right w:val="single" w:color="CCCCCC" w:sz="1"/>
+            </w:tcBorders>
+            <w:shd w:fill="F5F5F5" w:val="clear"/>
+            <w:tcMar>
+              <w:top w:type="dxa" w:w="80"/>
+              <w:left w:type="dxa" w:w="120"/>
+              <w:bottom w:type="dxa" w:w="80"/>
+              <w:right w:type="dxa" w:w="120"/>
+            </w:tcMar>
+          </w:tcPr>
+          <w:p>
+            <w:r>
+              <w:rPr>
+                <w:rFonts w:ascii="Arial" w:cs="Arial" w:eastAsia="Arial" w:hAnsi="Arial"/>
+                <w:b w:val="false"/>
+                <w:bCs w:val="false"/>
+                <w:color w:val="1C1C1C"/>
+                <w:sz w:val="21"/>
+                <w:szCs w:val="21"/>
+              </w:rPr>
+              <w:t xml:space="preserve">al</w:t>
+            </w:r>
+          </w:p>
+        </w:tc>
+        <w:tc>
+          <w:tcPr>
+            <w:tcW w:type="dxa" w:w="1400"/>
+            <w:tcBorders>
+              <w:top w:val="single" w:color="CCCCCC" w:sz="1"/>
+              <w:left w:val="single" w:color="CCCCCC" w:sz="1"/>
+              <w:bottom w:val="single" w:color="CCCCCC" w:sz="1"/>
+              <w:right w:val="single" w:color="CCCCCC" w:sz="1"/>
+            </w:tcBorders>
+            <w:shd w:fill="F5F5F5" w:val="clear"/>
+            <w:tcMar>
+              <w:top w:type="dxa" w:w="80"/>
+              <w:left w:type="dxa" w:w="120"/>
+              <w:bottom w:type="dxa" w:w="80"/>
+              <w:right w:type="dxa" w:w="120"/>
+            </w:tcMar>
+          </w:tcPr>
+          <w:p>
+            <w:r>
+              <w:rPr>
+                <w:rFonts w:ascii="Arial" w:cs="Arial" w:eastAsia="Arial" w:hAnsi="Arial"/>
+                <w:b w:val="false"/>
+                <w:bCs w:val="false"/>
+                <w:color w:val="1C1C1C"/>
+                <w:sz w:val="21"/>
+                <w:szCs w:val="21"/>
+              </w:rPr>
+              <w:t xml:space="preserve">alla</w:t>
+            </w:r>
+          </w:p>
+        </w:tc>
+        <w:tc>
+          <w:tcPr>
+            <w:tcW w:type="dxa" w:w="1300"/>
+            <w:tcBorders>
+              <w:top w:val="single" w:color="CCCCCC" w:sz="1"/>
+              <w:left w:val="single" w:color="CCCCCC" w:sz="1"/>
+              <w:bottom w:val="single" w:color="CCCCCC" w:sz="1"/>
+              <w:right w:val="single" w:color="CCCCCC" w:sz="1"/>
+            </w:tcBorders>
+            <w:shd w:fill="F5F5F5" w:val="clear"/>
+            <w:tcMar>
+              <w:top w:type="dxa" w:w="80"/>
+              <w:left w:type="dxa" w:w="120"/>
+              <w:bottom w:type="dxa" w:w="80"/>
+              <w:right w:type="dxa" w:w="120"/>
+            </w:tcMar>
+          </w:tcPr>
+          <w:p>
+            <w:r>
+              <w:rPr>
+                <w:rFonts w:ascii="Arial" w:cs="Arial" w:eastAsia="Arial" w:hAnsi="Arial"/>
+                <w:b w:val="false"/>
+                <w:bCs w:val="false"/>
+                <w:color w:val="1C1C1C"/>
+                <w:sz w:val="21"/>
+                <w:szCs w:val="21"/>
+              </w:rPr>
+              <w:t xml:space="preserve">all'</w:t>
+            </w:r>
+          </w:p>
+        </w:tc>
+        <w:tc>
+          <w:tcPr>
+            <w:tcW w:type="dxa" w:w="1100"/>
+            <w:tcBorders>
+              <w:top w:val="single" w:color="CCCCCC" w:sz="1"/>
+              <w:left w:val="single" w:color="CCCCCC" w:sz="1"/>
+              <w:bottom w:val="single" w:color="CCCCCC" w:sz="1"/>
+              <w:right w:val="single" w:color="CCCCCC" w:sz="1"/>
+            </w:tcBorders>
+            <w:shd w:fill="F5F5F5" w:val="clear"/>
+            <w:tcMar>
+              <w:top w:type="dxa" w:w="80"/>
+              <w:left w:type="dxa" w:w="120"/>
+              <w:bottom w:type="dxa" w:w="80"/>
+              <w:right w:type="dxa" w:w="120"/>
+            </w:tcMar>
+          </w:tcPr>
+          <w:p>
+            <w:r>
+              <w:rPr>
+                <w:rFonts w:ascii="Arial" w:cs="Arial" w:eastAsia="Arial" w:hAnsi="Arial"/>
+                <w:b w:val="false"/>
+                <w:bCs w:val="false"/>
+                <w:color w:val="1C1C1C"/>
+                <w:sz w:val="21"/>
+                <w:szCs w:val="21"/>
+              </w:rPr>
+              <w:t xml:space="preserve">ai</w:t>
+            </w:r>
+          </w:p>
+        </w:tc>
+        <w:tc>
+          <w:tcPr>
+            <w:tcW w:type="dxa" w:w="1500"/>
+            <w:tcBorders>
+              <w:top w:val="single" w:color="CCCCCC" w:sz="1"/>
+              <w:left w:val="single" w:color="CCCCCC" w:sz="1"/>
+              <w:bottom w:val="single" w:color="CCCCCC" w:sz="1"/>
+              <w:right w:val="single" w:color="CCCCCC" w:sz="1"/>
+            </w:tcBorders>
+            <w:shd w:fill="F5F5F5" w:val="clear"/>
+            <w:tcMar>
+              <w:top w:type="dxa" w:w="80"/>
+              <w:left w:type="dxa" w:w="120"/>
+              <w:bottom w:type="dxa" w:w="80"/>
+              <w:right w:type="dxa" w:w="120"/>
+            </w:tcMar>
+          </w:tcPr>
+          <w:p>
+            <w:r>
+              <w:rPr>
+                <w:rFonts w:ascii="Arial" w:cs="Arial" w:eastAsia="Arial" w:hAnsi="Arial"/>
+                <w:b w:val="false"/>
+                <w:bCs w:val="false"/>
+                <w:color w:val="1C1C1C"/>
+                <w:sz w:val="21"/>
+                <w:szCs w:val="21"/>
+              </w:rPr>
+              <w:t xml:space="preserve">agli</w:t>
+            </w:r>
+          </w:p>
+        </w:tc>
+        <w:tc>
+          <w:tcPr>
+            <w:tcW w:type="dxa" w:w="1500"/>
+            <w:tcBorders>
+              <w:top w:val="single" w:color="CCCCCC" w:sz="1"/>
+              <w:left w:val="single" w:color="CCCCCC" w:sz="1"/>
+              <w:bottom w:val="single" w:color="CCCCCC" w:sz="1"/>
+              <w:right w:val="single" w:color="CCCCCC" w:sz="1"/>
+            </w:tcBorders>
+            <w:shd w:fill="F5F5F5" w:val="clear"/>
+            <w:tcMar>
+              <w:top w:type="dxa" w:w="80"/>
+              <w:left w:type="dxa" w:w="120"/>
+              <w:bottom w:type="dxa" w:w="80"/>
+              <w:right w:type="dxa" w:w="120"/>
+            </w:tcMar>
+          </w:tcPr>
+          <w:p>
+            <w:r>
+              <w:rPr>
+                <w:rFonts w:ascii="Arial" w:cs="Arial" w:eastAsia="Arial" w:hAnsi="Arial"/>
+                <w:b w:val="false"/>
+                <w:bCs w:val="false"/>
+                <w:color w:val="1C1C1C"/>
+                <w:sz w:val="21"/>
+                <w:szCs w:val="21"/>
+              </w:rPr>
+              <w:t xml:space="preserve">alle</w:t>
+            </w:r>
+          </w:p>
+        </w:tc>
+      </w:tr>
+      <w:tr>
+        <w:tc>
+          <w:tcPr>
+            <w:tcW w:type="dxa" w:w="1260"/>
+            <w:tcBorders>
+              <w:top w:val="single" w:color="CCCCCC" w:sz="1"/>
+              <w:left w:val="single" w:color="CCCCCC" w:sz="1"/>
+              <w:bottom w:val="single" w:color="CCCCCC" w:sz="1"/>
+              <w:right w:val="single" w:color="CCCCCC" w:sz="1"/>
+            </w:tcBorders>
+            <w:shd w:fill="FFFFFF" w:val="clear"/>
+            <w:tcMar>
+              <w:top w:type="dxa" w:w="80"/>
+              <w:left w:type="dxa" w:w="120"/>
+              <w:bottom w:type="dxa" w:w="80"/>
+              <w:right w:type="dxa" w:w="120"/>
+            </w:tcMar>
+          </w:tcPr>
+          <w:p>
+            <w:r>
+              <w:rPr>
+                <w:rFonts w:ascii="Arial" w:cs="Arial" w:eastAsia="Arial" w:hAnsi="Arial"/>
+                <w:b w:val="false"/>
+                <w:bCs w:val="false"/>
+                <w:color w:val="1C1C1C"/>
+                <w:sz w:val="21"/>
+                <w:szCs w:val="21"/>
+              </w:rPr>
+              <w:t xml:space="preserve">da</w:t>
+            </w:r>
+          </w:p>
+        </w:tc>
+        <w:tc>
+          <w:tcPr>
+            <w:tcW w:type="dxa" w:w="1300"/>
+            <w:tcBorders>
+              <w:top w:val="single" w:color="CCCCCC" w:sz="1"/>
+              <w:left w:val="single" w:color="CCCCCC" w:sz="1"/>
+              <w:bottom w:val="single" w:color="CCCCCC" w:sz="1"/>
+              <w:right w:val="single" w:color="CCCCCC" w:sz="1"/>
+            </w:tcBorders>
+            <w:shd w:fill="FFFFFF" w:val="clear"/>
+            <w:tcMar>
+              <w:top w:type="dxa" w:w="80"/>
+              <w:left w:type="dxa" w:w="120"/>
+              <w:bottom w:type="dxa" w:w="80"/>
+              <w:right w:type="dxa" w:w="120"/>
+            </w:tcMar>
+          </w:tcPr>
+          <w:p>
+            <w:r>
+              <w:rPr>
+                <w:rFonts w:ascii="Arial" w:cs="Arial" w:eastAsia="Arial" w:hAnsi="Arial"/>
+                <w:b w:val="false"/>
+                <w:bCs w:val="false"/>
+                <w:color w:val="1C1C1C"/>
+                <w:sz w:val="21"/>
+                <w:szCs w:val="21"/>
+              </w:rPr>
+              <w:t xml:space="preserve">dal</w:t>
+            </w:r>
+          </w:p>
+        </w:tc>
+        <w:tc>
+          <w:tcPr>
+            <w:tcW w:type="dxa" w:w="1400"/>
+            <w:tcBorders>
+              <w:top w:val="single" w:color="CCCCCC" w:sz="1"/>
+              <w:left w:val="single" w:color="CCCCCC" w:sz="1"/>
+              <w:bottom w:val="single" w:color="CCCCCC" w:sz="1"/>
+              <w:right w:val="single" w:color="CCCCCC" w:sz="1"/>
+            </w:tcBorders>
+            <w:shd w:fill="FFFFFF" w:val="clear"/>
+            <w:tcMar>
+              <w:top w:type="dxa" w:w="80"/>
+              <w:left w:type="dxa" w:w="120"/>
+              <w:bottom w:type="dxa" w:w="80"/>
+              <w:right w:type="dxa" w:w="120"/>
+            </w:tcMar>
+          </w:tcPr>
+          <w:p>
+            <w:r>
+              <w:rPr>
+                <w:rFonts w:ascii="Arial" w:cs="Arial" w:eastAsia="Arial" w:hAnsi="Arial"/>
+                <w:b w:val="false"/>
+                <w:bCs w:val="false"/>
+                <w:color w:val="1C1C1C"/>
+                <w:sz w:val="21"/>
+                <w:szCs w:val="21"/>
+              </w:rPr>
+              <w:t xml:space="preserve">dalla</w:t>
+            </w:r>
+          </w:p>
+        </w:tc>
+        <w:tc>
+          <w:tcPr>
+            <w:tcW w:type="dxa" w:w="1300"/>
+            <w:tcBorders>
+              <w:top w:val="single" w:color="CCCCCC" w:sz="1"/>
+              <w:left w:val="single" w:color="CCCCCC" w:sz="1"/>
+              <w:bottom w:val="single" w:color="CCCCCC" w:sz="1"/>
+              <w:right w:val="single" w:color="CCCCCC" w:sz="1"/>
+            </w:tcBorders>
+            <w:shd w:fill="FFFFFF" w:val="clear"/>
+            <w:tcMar>
+              <w:top w:type="dxa" w:w="80"/>
+              <w:left w:type="dxa" w:w="120"/>
+              <w:bottom w:type="dxa" w:w="80"/>
+              <w:right w:type="dxa" w:w="120"/>
+            </w:tcMar>
+          </w:tcPr>
+          <w:p>
+            <w:r>
+              <w:rPr>
+                <w:rFonts w:ascii="Arial" w:cs="Arial" w:eastAsia="Arial" w:hAnsi="Arial"/>
+                <w:b w:val="false"/>
+                <w:bCs w:val="false"/>
+                <w:color w:val="1C1C1C"/>
+                <w:sz w:val="21"/>
+                <w:szCs w:val="21"/>
+              </w:rPr>
+              <w:t xml:space="preserve">dall'</w:t>
+            </w:r>
+          </w:p>
+        </w:tc>
+        <w:tc>
+          <w:tcPr>
+            <w:tcW w:type="dxa" w:w="1100"/>
+            <w:tcBorders>
+              <w:top w:val="single" w:color="CCCCCC" w:sz="1"/>
+              <w:left w:val="single" w:color="CCCCCC" w:sz="1"/>
+              <w:bottom w:val="single" w:color="CCCCCC" w:sz="1"/>
+              <w:right w:val="single" w:color="CCCCCC" w:sz="1"/>
+            </w:tcBorders>
+            <w:shd w:fill="FFFFFF" w:val="clear"/>
+            <w:tcMar>
+              <w:top w:type="dxa" w:w="80"/>
+              <w:left w:type="dxa" w:w="120"/>
+              <w:bottom w:type="dxa" w:w="80"/>
+              <w:right w:type="dxa" w:w="120"/>
+            </w:tcMar>
+          </w:tcPr>
+          <w:p>
+            <w:r>
+              <w:rPr>
+                <w:rFonts w:ascii="Arial" w:cs="Arial" w:eastAsia="Arial" w:hAnsi="Arial"/>
+                <w:b w:val="false"/>
+                <w:bCs w:val="false"/>
+                <w:color w:val="1C1C1C"/>
+                <w:sz w:val="21"/>
+                <w:szCs w:val="21"/>
+              </w:rPr>
+              <w:t xml:space="preserve">dai</w:t>
+            </w:r>
+          </w:p>
+        </w:tc>
+        <w:tc>
+          <w:tcPr>
+            <w:tcW w:type="dxa" w:w="1500"/>
+            <w:tcBorders>
+              <w:top w:val="single" w:color="CCCCCC" w:sz="1"/>
+              <w:left w:val="single" w:color="CCCCCC" w:sz="1"/>
+              <w:bottom w:val="single" w:color="CCCCCC" w:sz="1"/>
+              <w:right w:val="single" w:color="CCCCCC" w:sz="1"/>
+            </w:tcBorders>
+            <w:shd w:fill="FFFFFF" w:val="clear"/>
+            <w:tcMar>
+              <w:top w:type="dxa" w:w="80"/>
+              <w:left w:type="dxa" w:w="120"/>
+              <w:bottom w:type="dxa" w:w="80"/>
+              <w:right w:type="dxa" w:w="120"/>
+            </w:tcMar>
+          </w:tcPr>
+          <w:p>
+            <w:r>
+              <w:rPr>
+                <w:rFonts w:ascii="Arial" w:cs="Arial" w:eastAsia="Arial" w:hAnsi="Arial"/>
+                <w:b w:val="false"/>
+                <w:bCs w:val="false"/>
+                <w:color w:val="1C1C1C"/>
+                <w:sz w:val="21"/>
+                <w:szCs w:val="21"/>
+              </w:rPr>
+              <w:t xml:space="preserve">dagli</w:t>
+            </w:r>
+          </w:p>
+        </w:tc>
+        <w:tc>
+          <w:tcPr>
+            <w:tcW w:type="dxa" w:w="1500"/>
+            <w:tcBorders>
+              <w:top w:val="single" w:color="CCCCCC" w:sz="1"/>
+              <w:left w:val="single" w:color="CCCCCC" w:sz="1"/>
+              <w:bottom w:val="single" w:color="CCCCCC" w:sz="1"/>
+              <w:right w:val="single" w:color="CCCCCC" w:sz="1"/>
+            </w:tcBorders>
+            <w:shd w:fill="FFFFFF" w:val="clear"/>
+            <w:tcMar>
+              <w:top w:type="dxa" w:w="80"/>
+              <w:left w:type="dxa" w:w="120"/>
+              <w:bottom w:type="dxa" w:w="80"/>
+              <w:right w:type="dxa" w:w="120"/>
+            </w:tcMar>
+          </w:tcPr>
+          <w:p>
+            <w:r>
+              <w:rPr>
+                <w:rFonts w:ascii="Arial" w:cs="Arial" w:eastAsia="Arial" w:hAnsi="Arial"/>
+                <w:b w:val="false"/>
+                <w:bCs w:val="false"/>
+                <w:color w:val="1C1C1C"/>
+                <w:sz w:val="21"/>
+                <w:szCs w:val="21"/>
+              </w:rPr>
+              <w:t xml:space="preserve">dalle</w:t>
+            </w:r>
+          </w:p>
+        </w:tc>
+      </w:tr>
+      <w:tr>
+        <w:tc>
+          <w:tcPr>
+            <w:tcW w:type="dxa" w:w="1260"/>
+            <w:tcBorders>
+              <w:top w:val="single" w:color="CCCCCC" w:sz="1"/>
+              <w:left w:val="single" w:color="CCCCCC" w:sz="1"/>
+              <w:bottom w:val="single" w:color="CCCCCC" w:sz="1"/>
+              <w:right w:val="single" w:color="CCCCCC" w:sz="1"/>
+            </w:tcBorders>
+            <w:shd w:fill="F5F5F5" w:val="clear"/>
+            <w:tcMar>
+              <w:top w:type="dxa" w:w="80"/>
+              <w:left w:type="dxa" w:w="120"/>
+              <w:bottom w:type="dxa" w:w="80"/>
+              <w:right w:type="dxa" w:w="120"/>
+            </w:tcMar>
+          </w:tcPr>
+          <w:p>
+            <w:r>
+              <w:rPr>
+                <w:rFonts w:ascii="Arial" w:cs="Arial" w:eastAsia="Arial" w:hAnsi="Arial"/>
+                <w:b w:val="false"/>
+                <w:bCs w:val="false"/>
+                <w:color w:val="1C1C1C"/>
+                <w:sz w:val="21"/>
+                <w:szCs w:val="21"/>
+              </w:rPr>
+              <w:t xml:space="preserve">in</w:t>
+            </w:r>
+          </w:p>
+        </w:tc>
+        <w:tc>
+          <w:tcPr>
+            <w:tcW w:type="dxa" w:w="1300"/>
+            <w:tcBorders>
+              <w:top w:val="single" w:color="CCCCCC" w:sz="1"/>
+              <w:left w:val="single" w:color="CCCCCC" w:sz="1"/>
+              <w:bottom w:val="single" w:color="CCCCCC" w:sz="1"/>
+              <w:right w:val="single" w:color="CCCCCC" w:sz="1"/>
+            </w:tcBorders>
+            <w:shd w:fill="F5F5F5" w:val="clear"/>
+            <w:tcMar>
+              <w:top w:type="dxa" w:w="80"/>
+              <w:left w:type="dxa" w:w="120"/>
+              <w:bottom w:type="dxa" w:w="80"/>
+              <w:right w:type="dxa" w:w="120"/>
+            </w:tcMar>
+          </w:tcPr>
+          <w:p>
+            <w:r>
+              <w:rPr>
+                <w:rFonts w:ascii="Arial" w:cs="Arial" w:eastAsia="Arial" w:hAnsi="Arial"/>
+                <w:b w:val="false"/>
+                <w:bCs w:val="false"/>
+                <w:color w:val="1C1C1C"/>
+                <w:sz w:val="21"/>
+                <w:szCs w:val="21"/>
+              </w:rPr>
+              <w:t xml:space="preserve">nel</w:t>
+            </w:r>
+          </w:p>
+        </w:tc>
+        <w:tc>
+          <w:tcPr>
+            <w:tcW w:type="dxa" w:w="1400"/>
+            <w:tcBorders>
+              <w:top w:val="single" w:color="CCCCCC" w:sz="1"/>
+              <w:left w:val="single" w:color="CCCCCC" w:sz="1"/>
+              <w:bottom w:val="single" w:color="CCCCCC" w:sz="1"/>
+              <w:right w:val="single" w:color="CCCCCC" w:sz="1"/>
+            </w:tcBorders>
+            <w:shd w:fill="F5F5F5" w:val="clear"/>
+            <w:tcMar>
+              <w:top w:type="dxa" w:w="80"/>
+              <w:left w:type="dxa" w:w="120"/>
+              <w:bottom w:type="dxa" w:w="80"/>
+              <w:right w:type="dxa" w:w="120"/>
+            </w:tcMar>
+          </w:tcPr>
+          <w:p>
+            <w:r>
+              <w:rPr>
+                <w:rFonts w:ascii="Arial" w:cs="Arial" w:eastAsia="Arial" w:hAnsi="Arial"/>
+                <w:b w:val="false"/>
+                <w:bCs w:val="false"/>
+                <w:color w:val="1C1C1C"/>
+                <w:sz w:val="21"/>
+                <w:szCs w:val="21"/>
+              </w:rPr>
+              <w:t xml:space="preserve">nella</w:t>
+            </w:r>
+          </w:p>
+        </w:tc>
+        <w:tc>
+          <w:tcPr>
+            <w:tcW w:type="dxa" w:w="1300"/>
+            <w:tcBorders>
+              <w:top w:val="single" w:color="CCCCCC" w:sz="1"/>
+              <w:left w:val="single" w:color="CCCCCC" w:sz="1"/>
+              <w:bottom w:val="single" w:color="CCCCCC" w:sz="1"/>
+              <w:right w:val="single" w:color="CCCCCC" w:sz="1"/>
+            </w:tcBorders>
+            <w:shd w:fill="F5F5F5" w:val="clear"/>
+            <w:tcMar>
+              <w:top w:type="dxa" w:w="80"/>
+              <w:left w:type="dxa" w:w="120"/>
+              <w:bottom w:type="dxa" w:w="80"/>
+              <w:right w:type="dxa" w:w="120"/>
+            </w:tcMar>
+          </w:tcPr>
+          <w:p>
+            <w:r>
+              <w:rPr>
+                <w:rFonts w:ascii="Arial" w:cs="Arial" w:eastAsia="Arial" w:hAnsi="Arial"/>
+                <w:b w:val="false"/>
+                <w:bCs w:val="false"/>
+                <w:color w:val="1C1C1C"/>
+                <w:sz w:val="21"/>
+                <w:szCs w:val="21"/>
+              </w:rPr>
+              <w:t xml:space="preserve">nell'</w:t>
+            </w:r>
+          </w:p>
+        </w:tc>
+        <w:tc>
+          <w:tcPr>
+            <w:tcW w:type="dxa" w:w="1100"/>
+            <w:tcBorders>
+              <w:top w:val="single" w:color="CCCCCC" w:sz="1"/>
+              <w:left w:val="single" w:color="CCCCCC" w:sz="1"/>
+              <w:bottom w:val="single" w:color="CCCCCC" w:sz="1"/>
+              <w:right w:val="single" w:color="CCCCCC" w:sz="1"/>
+            </w:tcBorders>
+            <w:shd w:fill="F5F5F5" w:val="clear"/>
+            <w:tcMar>
+              <w:top w:type="dxa" w:w="80"/>
+              <w:left w:type="dxa" w:w="120"/>
+              <w:bottom w:type="dxa" w:w="80"/>
+              <w:right w:type="dxa" w:w="120"/>
+            </w:tcMar>
+          </w:tcPr>
+          <w:p>
+            <w:r>
+              <w:rPr>
+                <w:rFonts w:ascii="Arial" w:cs="Arial" w:eastAsia="Arial" w:hAnsi="Arial"/>
+                <w:b w:val="false"/>
+                <w:bCs w:val="false"/>
+                <w:color w:val="1C1C1C"/>
+                <w:sz w:val="21"/>
+                <w:szCs w:val="21"/>
+              </w:rPr>
+              <w:t xml:space="preserve">nei</w:t>
+            </w:r>
+          </w:p>
+        </w:tc>
+        <w:tc>
+          <w:tcPr>
+            <w:tcW w:type="dxa" w:w="1500"/>
+            <w:tcBorders>
+              <w:top w:val="single" w:color="CCCCCC" w:sz="1"/>
+              <w:left w:val="single" w:color="CCCCCC" w:sz="1"/>
+              <w:bottom w:val="single" w:color="CCCCCC" w:sz="1"/>
+              <w:right w:val="single" w:color="CCCCCC" w:sz="1"/>
+            </w:tcBorders>
+            <w:shd w:fill="F5F5F5" w:val="clear"/>
+            <w:tcMar>
+              <w:top w:type="dxa" w:w="80"/>
+              <w:left w:type="dxa" w:w="120"/>
+              <w:bottom w:type="dxa" w:w="80"/>
+              <w:right w:type="dxa" w:w="120"/>
+            </w:tcMar>
+          </w:tcPr>
+          <w:p>
+            <w:r>
+              <w:rPr>
+                <w:rFonts w:ascii="Arial" w:cs="Arial" w:eastAsia="Arial" w:hAnsi="Arial"/>
+                <w:b w:val="false"/>
+                <w:bCs w:val="false"/>
+                <w:color w:val="1C1C1C"/>
+                <w:sz w:val="21"/>
+                <w:szCs w:val="21"/>
+              </w:rPr>
+              <w:t xml:space="preserve">negli</w:t>
+            </w:r>
+          </w:p>
+        </w:tc>
+        <w:tc>
+          <w:tcPr>
+            <w:tcW w:type="dxa" w:w="1500"/>
+            <w:tcBorders>
+              <w:top w:val="single" w:color="CCCCCC" w:sz="1"/>
+              <w:left w:val="single" w:color="CCCCCC" w:sz="1"/>
+              <w:bottom w:val="single" w:color="CCCCCC" w:sz="1"/>
+              <w:right w:val="single" w:color="CCCCCC" w:sz="1"/>
+            </w:tcBorders>
+            <w:shd w:fill="F5F5F5" w:val="clear"/>
+            <w:tcMar>
+              <w:top w:type="dxa" w:w="80"/>
+              <w:left w:type="dxa" w:w="120"/>
+              <w:bottom w:type="dxa" w:w="80"/>
+              <w:right w:type="dxa" w:w="120"/>
+            </w:tcMar>
+          </w:tcPr>
+          <w:p>
+            <w:r>
+              <w:rPr>
+                <w:rFonts w:ascii="Arial" w:cs="Arial" w:eastAsia="Arial" w:hAnsi="Arial"/>
+                <w:b w:val="false"/>
+                <w:bCs w:val="false"/>
+                <w:color w:val="1C1C1C"/>
+                <w:sz w:val="21"/>
+                <w:szCs w:val="21"/>
+              </w:rPr>
+              <w:t xml:space="preserve">nelle</w:t>
+            </w:r>
+          </w:p>
+        </w:tc>
+      </w:tr>
+      <w:tr>
+        <w:tc>
+          <w:tcPr>
+            <w:tcW w:type="dxa" w:w="1260"/>
+            <w:tcBorders>
+              <w:top w:val="single" w:color="CCCCCC" w:sz="1"/>
+              <w:left w:val="single" w:color="CCCCCC" w:sz="1"/>
+              <w:bottom w:val="single" w:color="CCCCCC" w:sz="1"/>
+              <w:right w:val="single" w:color="CCCCCC" w:sz="1"/>
+            </w:tcBorders>
+            <w:shd w:fill="FFFFFF" w:val="clear"/>
+            <w:tcMar>
+              <w:top w:type="dxa" w:w="80"/>
+              <w:left w:type="dxa" w:w="120"/>
+              <w:bottom w:type="dxa" w:w="80"/>
+              <w:right w:type="dxa" w:w="120"/>
+            </w:tcMar>
+          </w:tcPr>
+          <w:p>
+            <w:r>
+              <w:rPr>
+                <w:rFonts w:ascii="Arial" w:cs="Arial" w:eastAsia="Arial" w:hAnsi="Arial"/>
+                <w:b w:val="false"/>
+                <w:bCs w:val="false"/>
+                <w:color w:val="1C1C1C"/>
+                <w:sz w:val="21"/>
+                <w:szCs w:val="21"/>
+              </w:rPr>
+              <w:t xml:space="preserve">su</w:t>
+            </w:r>
+          </w:p>
+        </w:tc>
+        <w:tc>
+          <w:tcPr>
+            <w:tcW w:type="dxa" w:w="1300"/>
+            <w:tcBorders>
+              <w:top w:val="single" w:color="CCCCCC" w:sz="1"/>
+              <w:left w:val="single" w:color="CCCCCC" w:sz="1"/>
+              <w:bottom w:val="single" w:color="CCCCCC" w:sz="1"/>
+              <w:right w:val="single" w:color="CCCCCC" w:sz="1"/>
+            </w:tcBorders>
+            <w:shd w:fill="FFFFFF" w:val="clear"/>
+            <w:tcMar>
+              <w:top w:type="dxa" w:w="80"/>
+              <w:left w:type="dxa" w:w="120"/>
+              <w:bottom w:type="dxa" w:w="80"/>
+              <w:right w:type="dxa" w:w="120"/>
+            </w:tcMar>
+          </w:tcPr>
+          <w:p>
+            <w:r>
+              <w:rPr>
+                <w:rFonts w:ascii="Arial" w:cs="Arial" w:eastAsia="Arial" w:hAnsi="Arial"/>
+                <w:b w:val="false"/>
+                <w:bCs w:val="false"/>
+                <w:color w:val="1C1C1C"/>
+                <w:sz w:val="21"/>
+                <w:szCs w:val="21"/>
+              </w:rPr>
+              <w:t xml:space="preserve">sul</w:t>
+            </w:r>
+          </w:p>
+        </w:tc>
+        <w:tc>
+          <w:tcPr>
+            <w:tcW w:type="dxa" w:w="1400"/>
+            <w:tcBorders>
+              <w:top w:val="single" w:color="CCCCCC" w:sz="1"/>
+              <w:left w:val="single" w:color="CCCCCC" w:sz="1"/>
+              <w:bottom w:val="single" w:color="CCCCCC" w:sz="1"/>
+              <w:right w:val="single" w:color="CCCCCC" w:sz="1"/>
+            </w:tcBorders>
+            <w:shd w:fill="FFFFFF" w:val="clear"/>
+            <w:tcMar>
+              <w:top w:type="dxa" w:w="80"/>
+              <w:left w:type="dxa" w:w="120"/>
+              <w:bottom w:type="dxa" w:w="80"/>
+              <w:right w:type="dxa" w:w="120"/>
+            </w:tcMar>
+          </w:tcPr>
+          <w:p>
+            <w:r>
+              <w:rPr>
+                <w:rFonts w:ascii="Arial" w:cs="Arial" w:eastAsia="Arial" w:hAnsi="Arial"/>
+                <w:b w:val="false"/>
+                <w:bCs w:val="false"/>
+                <w:color w:val="1C1C1C"/>
+                <w:sz w:val="21"/>
+                <w:szCs w:val="21"/>
+              </w:rPr>
+              <w:t xml:space="preserve">sulla</w:t>
+            </w:r>
+          </w:p>
+        </w:tc>
+        <w:tc>
+          <w:tcPr>
+            <w:tcW w:type="dxa" w:w="1300"/>
+            <w:tcBorders>
+              <w:top w:val="single" w:color="CCCCCC" w:sz="1"/>
+              <w:left w:val="single" w:color="CCCCCC" w:sz="1"/>
+              <w:bottom w:val="single" w:color="CCCCCC" w:sz="1"/>
+              <w:right w:val="single" w:color="CCCCCC" w:sz="1"/>
+            </w:tcBorders>
+            <w:shd w:fill="FFFFFF" w:val="clear"/>
+            <w:tcMar>
+              <w:top w:type="dxa" w:w="80"/>
+              <w:left w:type="dxa" w:w="120"/>
+              <w:bottom w:type="dxa" w:w="80"/>
+              <w:right w:type="dxa" w:w="120"/>
+            </w:tcMar>
+          </w:tcPr>
+          <w:p>
+            <w:r>
+              <w:rPr>
+                <w:rFonts w:ascii="Arial" w:cs="Arial" w:eastAsia="Arial" w:hAnsi="Arial"/>
+                <w:b w:val="false"/>
+                <w:bCs w:val="false"/>
+                <w:color w:val="1C1C1C"/>
+                <w:sz w:val="21"/>
+                <w:szCs w:val="21"/>
+              </w:rPr>
+              <w:t xml:space="preserve">sull'</w:t>
+            </w:r>
+          </w:p>
+        </w:tc>
+        <w:tc>
+          <w:tcPr>
+            <w:tcW w:type="dxa" w:w="1100"/>
+            <w:tcBorders>
+              <w:top w:val="single" w:color="CCCCCC" w:sz="1"/>
+              <w:left w:val="single" w:color="CCCCCC" w:sz="1"/>
+              <w:bottom w:val="single" w:color="CCCCCC" w:sz="1"/>
+              <w:right w:val="single" w:color="CCCCCC" w:sz="1"/>
+            </w:tcBorders>
+            <w:shd w:fill="FFFFFF" w:val="clear"/>
+            <w:tcMar>
+              <w:top w:type="dxa" w:w="80"/>
+              <w:left w:type="dxa" w:w="120"/>
+              <w:bottom w:type="dxa" w:w="80"/>
+              <w:right w:type="dxa" w:w="120"/>
+            </w:tcMar>
+          </w:tcPr>
+          <w:p>
+            <w:r>
+              <w:rPr>
+                <w:rFonts w:ascii="Arial" w:cs="Arial" w:eastAsia="Arial" w:hAnsi="Arial"/>
+                <w:b w:val="false"/>
+                <w:bCs w:val="false"/>
+                <w:color w:val="1C1C1C"/>
+                <w:sz w:val="21"/>
+                <w:szCs w:val="21"/>
+              </w:rPr>
+              <w:t xml:space="preserve">sui</w:t>
+            </w:r>
+          </w:p>
+        </w:tc>
+        <w:tc>
+          <w:tcPr>
+            <w:tcW w:type="dxa" w:w="1500"/>
+            <w:tcBorders>
+              <w:top w:val="single" w:color="CCCCCC" w:sz="1"/>
+              <w:left w:val="single" w:color="CCCCCC" w:sz="1"/>
+              <w:bottom w:val="single" w:color="CCCCCC" w:sz="1"/>
+              <w:right w:val="single" w:color="CCCCCC" w:sz="1"/>
+            </w:tcBorders>
+            <w:shd w:fill="FFFFFF" w:val="clear"/>
+            <w:tcMar>
+              <w:top w:type="dxa" w:w="80"/>
+              <w:left w:type="dxa" w:w="120"/>
+              <w:bottom w:type="dxa" w:w="80"/>
+              <w:right w:type="dxa" w:w="120"/>
+            </w:tcMar>
+          </w:tcPr>
+          <w:p>
+            <w:r>
+              <w:rPr>
+                <w:rFonts w:ascii="Arial" w:cs="Arial" w:eastAsia="Arial" w:hAnsi="Arial"/>
+                <w:b w:val="false"/>
+                <w:bCs w:val="false"/>
+                <w:color w:val="1C1C1C"/>
+                <w:sz w:val="21"/>
+                <w:szCs w:val="21"/>
+              </w:rPr>
+              <w:t xml:space="preserve">sugli</w:t>
+            </w:r>
+          </w:p>
+        </w:tc>
+        <w:tc>
+          <w:tcPr>
+            <w:tcW w:type="dxa" w:w="1500"/>
+            <w:tcBorders>
+              <w:top w:val="single" w:color="CCCCCC" w:sz="1"/>
+              <w:left w:val="single" w:color="CCCCCC" w:sz="1"/>
+              <w:bottom w:val="single" w:color="CCCCCC" w:sz="1"/>
+              <w:right w:val="single" w:color="CCCCCC" w:sz="1"/>
+            </w:tcBorders>
+            <w:shd w:fill="FFFFFF" w:val="clear"/>
+            <w:tcMar>
+              <w:top w:type="dxa" w:w="80"/>
+              <w:left w:type="dxa" w:w="120"/>
+              <w:bottom w:type="dxa" w:w="80"/>
+              <w:right w:type="dxa" w:w="120"/>
+            </w:tcMar>
+          </w:tcPr>
+          <w:p>
+            <w:r>
+              <w:rPr>
+                <w:rFonts w:ascii="Arial" w:cs="Arial" w:eastAsia="Arial" w:hAnsi="Arial"/>
+                <w:b w:val="false"/>
+                <w:bCs w:val="false"/>
+                <w:color w:val="1C1C1C"/>
+                <w:sz w:val="21"/>
+                <w:szCs w:val="21"/>
+              </w:rPr>
+              <w:t xml:space="preserve">sulle</w:t>
+            </w:r>
+          </w:p>
+        </w:tc>
+      </w:tr>
+    </w:tbl>
+    <w:p>
+      <w:pPr>
+        <w:spacing w:before="40" w:after="40"/>
+      </w:pPr>
+      <w:r>
+        <w:rPr>
+          <w:rFonts w:ascii="Arial" w:cs="Arial" w:eastAsia="Arial" w:hAnsi="Arial"/>
+          <w:b w:val="false"/>
+          <w:bCs w:val="false"/>
+          <w:color w:val="1C1C1C"/>
+          <w:sz w:val="22"/>
+          <w:szCs w:val="22"/>
+        </w:rPr>
+        <w:t xml:space="preserve">Examples: la chiave della porta (the key of the door), vado al lavoro (I go to work), sono nel negozio (I'm in the shop).</w:t>
+      </w:r>
+    </w:p>
+    <w:p>
+      <w:pPr>
+        <w:pStyle w:val="Heading2"/>
+        <w:spacing w:before="280" w:after="100"/>
+      </w:pPr>
+      <w:r>
+        <w:rPr>
+          <w:rFonts w:ascii="Georgia" w:cs="Georgia" w:eastAsia="Georgia" w:hAnsi="Georgia"/>
+          <w:b/>
+          <w:bCs/>
+          <w:color w:val="1A6B3C"/>
+          <w:sz w:val="28"/>
+          <w:szCs w:val="28"/>
+        </w:rPr>
+        <w:t xml:space="preserve">0.9  Questions, Negation &amp; 'There Is'</w:t>
+      </w:r>
+    </w:p>
+    <w:p>
+      <w:pPr>
+        <w:spacing w:before="40" w:after="40"/>
+      </w:pPr>
+      <w:r>
+        <w:rPr>
+          <w:rFonts w:ascii="Arial" w:cs="Arial" w:eastAsia="Arial" w:hAnsi="Arial"/>
+          <w:b w:val="false"/>
+          <w:bCs w:val="false"/>
+          <w:color w:val="1C1C1C"/>
+          <w:sz w:val="22"/>
+          <w:szCs w:val="22"/>
+        </w:rPr>
+        <w:t xml:space="preserve">Questions: no 'do', no inversion — just raise your pitch. Parli inglese? (Do you speak English?). Add a question word in front: chi, (che) cosa, dove, quando, perché, come, quanto — Dove abiti? Quanto costa?</w:t>
+      </w:r>
+    </w:p>
+    <w:p>
+      <w:pPr>
+        <w:spacing w:before="40" w:after="40"/>
+      </w:pPr>
+      <w:r>
+        <w:rPr>
+          <w:rFonts w:ascii="Arial" w:cs="Arial" w:eastAsia="Arial" w:hAnsi="Arial"/>
+          <w:b w:val="false"/>
+          <w:bCs w:val="false"/>
+          <w:color w:val="1C1C1C"/>
+          <w:sz w:val="22"/>
+          <w:szCs w:val="22"/>
+        </w:rPr>
+        <w:t xml:space="preserve">Negation: put non before the verb — Non capisco. Double negatives are correct: Non c'è nessuno (there's no one), Non ho mai visto niente.</w:t>
+      </w:r>
+    </w:p>
+    <w:p>
+      <w:pPr>
+        <w:spacing w:before="40" w:after="40"/>
+      </w:pPr>
+      <w:r>
+        <w:rPr>
+          <w:rFonts w:ascii="Arial" w:cs="Arial" w:eastAsia="Arial" w:hAnsi="Arial"/>
+          <w:b w:val="false"/>
+          <w:bCs w:val="false"/>
+          <w:color w:val="1C1C1C"/>
+          <w:sz w:val="22"/>
+          <w:szCs w:val="22"/>
+        </w:rPr>
+        <w:t xml:space="preserve">There is / there are: c'è (singular) and ci sono (plural) — C'è un problema. Ci sono due persone.</w:t>
+      </w:r>
+    </w:p>
+    <w:p>
+      <w:pPr>
+        <w:pStyle w:val="Heading2"/>
+        <w:spacing w:before="280" w:after="100"/>
+      </w:pPr>
+      <w:r>
+        <w:rPr>
+          <w:rFonts w:ascii="Georgia" w:cs="Georgia" w:eastAsia="Georgia" w:hAnsi="Georgia"/>
+          <w:b/>
+          <w:bCs/>
+          <w:color w:val="1A6B3C"/>
+          <w:sz w:val="28"/>
+          <w:szCs w:val="28"/>
+        </w:rPr>
+        <w:t xml:space="preserve">0.10  Possessives &amp; essere vs stare</w:t>
+      </w:r>
+    </w:p>
+    <w:p>
+      <w:pPr>
+        <w:spacing w:before="40" w:after="40"/>
+      </w:pPr>
+      <w:r>
+        <w:rPr>
+          <w:rFonts w:ascii="Arial" w:cs="Arial" w:eastAsia="Arial" w:hAnsi="Arial"/>
+          <w:b w:val="false"/>
+          <w:bCs w:val="false"/>
+          <w:color w:val="1C1C1C"/>
+          <w:sz w:val="22"/>
+          <w:szCs w:val="22"/>
+        </w:rPr>
+        <w:t xml:space="preserve">Possessives take the article: il mio / la mia / i miei / le mie; then tuo, suo (his/her/your-formal), nostro, vostro, loro. la mia casa, il tuo numero. Drop the article with one family member: mia madre, tuo fratello.</w:t>
+      </w:r>
+    </w:p>
+    <w:p>
+      <w:pPr>
+        <w:spacing w:before="40" w:after="40"/>
+      </w:pPr>
+      <w:r>
+        <w:rPr>
+          <w:rFonts w:ascii="Arial" w:cs="Arial" w:eastAsia="Arial" w:hAnsi="Arial"/>
+          <w:b w:val="false"/>
+          <w:bCs w:val="false"/>
+          <w:color w:val="1C1C1C"/>
+          <w:sz w:val="22"/>
+          <w:szCs w:val="22"/>
+        </w:rPr>
+        <w:t xml:space="preserve">essere vs stare (both ≈ 'to be'): essere = identity / permanent (Sono australiano. È difficile.); stare = state / health / location / -ing (Come stai? Sto bene. Sto mangiando = I'm eating).</w:t>
       </w:r>
     </w:p>
     <w:p>

</xml_diff>

<commit_message>
Add piacere note, sync docx with full course, update review
- Foundations §0.11: piacere works backwards (mi piace vs mi piacciono,
  plus the mi manca/serve/sembra family); mirrored into the docx + Anki.
- docx "How to Use This Course" front page: lays out the three daily modes
  (INPUT/LISTEN/PRODUCE) and points to the study plan, audio, Anki, and
  missions, so the docx is no longer writing-centric.
- REVIEW.md: mark the docx-sync and piacere gaps resolved.

Co-Authored-By: Claude Opus 4.8 (1M context) <noreply@anthropic.com>
</commit_message>
<xml_diff>
--- a/Learn_Italian_80_20.docx
+++ b/Learn_Italian_80_20.docx
@@ -593,6 +593,417 @@
       </w:r>
     </w:p>
     <w:p>
+      <w:pPr>
+        <w:pStyle w:val="Heading1"/>
+        <w:pBdr>
+          <w:bottom w:val="single" w:color="1A6B3C" w:sz="8" w:space="4"/>
+        </w:pBdr>
+        <w:spacing w:before="360" w:after="120"/>
+      </w:pPr>
+      <w:r>
+        <w:rPr>
+          <w:rFonts w:ascii="Georgia" w:cs="Georgia" w:eastAsia="Georgia" w:hAnsi="Georgia"/>
+          <w:b/>
+          <w:bCs/>
+          <w:color w:val="1A6B3C"/>
+          <w:sz w:val="36"/>
+          <w:szCs w:val="36"/>
+        </w:rPr>
+        <w:t xml:space="preserve">How to Use This Course</w:t>
+      </w:r>
+    </w:p>
+    <w:p>
+      <w:pPr>
+        <w:spacing w:before="40" w:after="40"/>
+      </w:pPr>
+      <w:r>
+        <w:rPr>
+          <w:rFonts w:ascii="Arial" w:cs="Arial" w:eastAsia="Arial" w:hAnsi="Arial"/>
+          <w:b w:val="false"/>
+          <w:bCs w:val="false"/>
+          <w:color w:val="1C1C1C"/>
+          <w:sz w:val="22"/>
+          <w:szCs w:val="22"/>
+        </w:rPr>
+        <w:t xml:space="preserve">This document is your reference text — the pronunciation, grammar, and core vocabulary. The full course (daily schedule, listening, speaking practice, and flashcards) lives in the companion 'lessons' folder. Writing is one of three daily layers, not the whole method. Do Part 0 first, then work the day-lessons alongside the study plan.</w:t>
+      </w:r>
+    </w:p>
+    <w:p>
+      <w:pPr>
+        <w:pStyle w:val="Heading2"/>
+        <w:spacing w:before="280" w:after="100"/>
+      </w:pPr>
+      <w:r>
+        <w:rPr>
+          <w:rFonts w:ascii="Georgia" w:cs="Georgia" w:eastAsia="Georgia" w:hAnsi="Georgia"/>
+          <w:b/>
+          <w:bCs/>
+          <w:color w:val="1A6B3C"/>
+          <w:sz w:val="28"/>
+          <w:szCs w:val="28"/>
+        </w:rPr>
+        <w:t xml:space="preserve">The Three Daily Modes (3 × 20 minutes)</w:t>
+      </w:r>
+    </w:p>
+    <w:tbl>
+      <w:tblPr>
+        <w:tblW w:type="dxa" w:w="9360"/>
+        <w:tblBorders>
+          <w:top w:val="single" w:color="auto" w:sz="4"/>
+          <w:left w:val="single" w:color="auto" w:sz="4"/>
+          <w:bottom w:val="single" w:color="auto" w:sz="4"/>
+          <w:right w:val="single" w:color="auto" w:sz="4"/>
+          <w:insideH w:val="single" w:color="auto" w:sz="4"/>
+          <w:insideV w:val="single" w:color="auto" w:sz="4"/>
+        </w:tblBorders>
+      </w:tblPr>
+      <w:tblGrid>
+        <w:gridCol w:w="2800"/>
+        <w:gridCol w:w="6560"/>
+      </w:tblGrid>
+      <w:tr>
+        <w:tc>
+          <w:tcPr>
+            <w:tcW w:type="dxa" w:w="2800"/>
+            <w:tcBorders>
+              <w:top w:val="single" w:color="CCCCCC" w:sz="1"/>
+              <w:left w:val="single" w:color="CCCCCC" w:sz="1"/>
+              <w:bottom w:val="single" w:color="CCCCCC" w:sz="1"/>
+              <w:right w:val="single" w:color="CCCCCC" w:sz="1"/>
+            </w:tcBorders>
+            <w:shd w:fill="1A6B3C" w:val="clear"/>
+            <w:tcMar>
+              <w:top w:type="dxa" w:w="80"/>
+              <w:left w:type="dxa" w:w="120"/>
+              <w:bottom w:type="dxa" w:w="80"/>
+              <w:right w:type="dxa" w:w="120"/>
+            </w:tcMar>
+          </w:tcPr>
+          <w:p>
+            <w:r>
+              <w:rPr>
+                <w:rFonts w:ascii="Arial" w:cs="Arial" w:eastAsia="Arial" w:hAnsi="Arial"/>
+                <w:b/>
+                <w:bCs/>
+                <w:color w:val="FFFFFF"/>
+                <w:sz w:val="21"/>
+                <w:szCs w:val="21"/>
+              </w:rPr>
+              <w:t xml:space="preserve">Session</w:t>
+            </w:r>
+          </w:p>
+        </w:tc>
+        <w:tc>
+          <w:tcPr>
+            <w:tcW w:type="dxa" w:w="6560"/>
+            <w:tcBorders>
+              <w:top w:val="single" w:color="CCCCCC" w:sz="1"/>
+              <w:left w:val="single" w:color="CCCCCC" w:sz="1"/>
+              <w:bottom w:val="single" w:color="CCCCCC" w:sz="1"/>
+              <w:right w:val="single" w:color="CCCCCC" w:sz="1"/>
+            </w:tcBorders>
+            <w:shd w:fill="1A6B3C" w:val="clear"/>
+            <w:tcMar>
+              <w:top w:type="dxa" w:w="80"/>
+              <w:left w:type="dxa" w:w="120"/>
+              <w:bottom w:type="dxa" w:w="80"/>
+              <w:right w:type="dxa" w:w="120"/>
+            </w:tcMar>
+          </w:tcPr>
+          <w:p>
+            <w:r>
+              <w:rPr>
+                <w:rFonts w:ascii="Arial" w:cs="Arial" w:eastAsia="Arial" w:hAnsi="Arial"/>
+                <w:b/>
+                <w:bCs/>
+                <w:color w:val="FFFFFF"/>
+                <w:sz w:val="21"/>
+                <w:szCs w:val="21"/>
+              </w:rPr>
+              <w:t xml:space="preserve">What you do</w:t>
+            </w:r>
+          </w:p>
+        </w:tc>
+      </w:tr>
+      <w:tr>
+        <w:tc>
+          <w:tcPr>
+            <w:tcW w:type="dxa" w:w="2800"/>
+            <w:tcBorders>
+              <w:top w:val="single" w:color="CCCCCC" w:sz="1"/>
+              <w:left w:val="single" w:color="CCCCCC" w:sz="1"/>
+              <w:bottom w:val="single" w:color="CCCCCC" w:sz="1"/>
+              <w:right w:val="single" w:color="CCCCCC" w:sz="1"/>
+            </w:tcBorders>
+            <w:shd w:fill="FFFFFF" w:val="clear"/>
+            <w:tcMar>
+              <w:top w:type="dxa" w:w="80"/>
+              <w:left w:type="dxa" w:w="120"/>
+              <w:bottom w:type="dxa" w:w="80"/>
+              <w:right w:type="dxa" w:w="120"/>
+            </w:tcMar>
+          </w:tcPr>
+          <w:p>
+            <w:r>
+              <w:rPr>
+                <w:rFonts w:ascii="Arial" w:cs="Arial" w:eastAsia="Arial" w:hAnsi="Arial"/>
+                <w:b w:val="false"/>
+                <w:bCs w:val="false"/>
+                <w:color w:val="1C1C1C"/>
+                <w:sz w:val="21"/>
+                <w:szCs w:val="21"/>
+              </w:rPr>
+              <w:t xml:space="preserve">INPUT — morning</w:t>
+            </w:r>
+          </w:p>
+        </w:tc>
+        <w:tc>
+          <w:tcPr>
+            <w:tcW w:type="dxa" w:w="6560"/>
+            <w:tcBorders>
+              <w:top w:val="single" w:color="CCCCCC" w:sz="1"/>
+              <w:left w:val="single" w:color="CCCCCC" w:sz="1"/>
+              <w:bottom w:val="single" w:color="CCCCCC" w:sz="1"/>
+              <w:right w:val="single" w:color="CCCCCC" w:sz="1"/>
+            </w:tcBorders>
+            <w:shd w:fill="FFFFFF" w:val="clear"/>
+            <w:tcMar>
+              <w:top w:type="dxa" w:w="80"/>
+              <w:left w:type="dxa" w:w="120"/>
+              <w:bottom w:type="dxa" w:w="80"/>
+              <w:right w:type="dxa" w:w="120"/>
+            </w:tcMar>
+          </w:tcPr>
+          <w:p>
+            <w:r>
+              <w:rPr>
+                <w:rFonts w:ascii="Arial" w:cs="Arial" w:eastAsia="Arial" w:hAnsi="Arial"/>
+                <w:b w:val="false"/>
+                <w:bCs w:val="false"/>
+                <w:color w:val="1C1C1C"/>
+                <w:sz w:val="21"/>
+                <w:szCs w:val="21"/>
+              </w:rPr>
+              <w:t xml:space="preserve">Read the day's lesson; write each word by hand; say it aloud.</w:t>
+            </w:r>
+          </w:p>
+        </w:tc>
+      </w:tr>
+      <w:tr>
+        <w:tc>
+          <w:tcPr>
+            <w:tcW w:type="dxa" w:w="2800"/>
+            <w:tcBorders>
+              <w:top w:val="single" w:color="CCCCCC" w:sz="1"/>
+              <w:left w:val="single" w:color="CCCCCC" w:sz="1"/>
+              <w:bottom w:val="single" w:color="CCCCCC" w:sz="1"/>
+              <w:right w:val="single" w:color="CCCCCC" w:sz="1"/>
+            </w:tcBorders>
+            <w:shd w:fill="F5F5F5" w:val="clear"/>
+            <w:tcMar>
+              <w:top w:type="dxa" w:w="80"/>
+              <w:left w:type="dxa" w:w="120"/>
+              <w:bottom w:type="dxa" w:w="80"/>
+              <w:right w:type="dxa" w:w="120"/>
+            </w:tcMar>
+          </w:tcPr>
+          <w:p>
+            <w:r>
+              <w:rPr>
+                <w:rFonts w:ascii="Arial" w:cs="Arial" w:eastAsia="Arial" w:hAnsi="Arial"/>
+                <w:b w:val="false"/>
+                <w:bCs w:val="false"/>
+                <w:color w:val="1C1C1C"/>
+                <w:sz w:val="21"/>
+                <w:szCs w:val="21"/>
+              </w:rPr>
+              <w:t xml:space="preserve">LISTEN — midday</w:t>
+            </w:r>
+          </w:p>
+        </w:tc>
+        <w:tc>
+          <w:tcPr>
+            <w:tcW w:type="dxa" w:w="6560"/>
+            <w:tcBorders>
+              <w:top w:val="single" w:color="CCCCCC" w:sz="1"/>
+              <w:left w:val="single" w:color="CCCCCC" w:sz="1"/>
+              <w:bottom w:val="single" w:color="CCCCCC" w:sz="1"/>
+              <w:right w:val="single" w:color="CCCCCC" w:sz="1"/>
+            </w:tcBorders>
+            <w:shd w:fill="F5F5F5" w:val="clear"/>
+            <w:tcMar>
+              <w:top w:type="dxa" w:w="80"/>
+              <w:left w:type="dxa" w:w="120"/>
+              <w:bottom w:type="dxa" w:w="80"/>
+              <w:right w:type="dxa" w:w="120"/>
+            </w:tcMar>
+          </w:tcPr>
+          <w:p>
+            <w:r>
+              <w:rPr>
+                <w:rFonts w:ascii="Arial" w:cs="Arial" w:eastAsia="Arial" w:hAnsi="Arial"/>
+                <w:b w:val="false"/>
+                <w:bCs w:val="false"/>
+                <w:color w:val="1C1C1C"/>
+                <w:sz w:val="21"/>
+                <w:szCs w:val="21"/>
+              </w:rPr>
+              <w:t xml:space="preserve">Audio only — Language Transfer, FSI FAST. Train the ear; no reading.</w:t>
+            </w:r>
+          </w:p>
+        </w:tc>
+      </w:tr>
+      <w:tr>
+        <w:tc>
+          <w:tcPr>
+            <w:tcW w:type="dxa" w:w="2800"/>
+            <w:tcBorders>
+              <w:top w:val="single" w:color="CCCCCC" w:sz="1"/>
+              <w:left w:val="single" w:color="CCCCCC" w:sz="1"/>
+              <w:bottom w:val="single" w:color="CCCCCC" w:sz="1"/>
+              <w:right w:val="single" w:color="CCCCCC" w:sz="1"/>
+            </w:tcBorders>
+            <w:shd w:fill="FFFFFF" w:val="clear"/>
+            <w:tcMar>
+              <w:top w:type="dxa" w:w="80"/>
+              <w:left w:type="dxa" w:w="120"/>
+              <w:bottom w:type="dxa" w:w="80"/>
+              <w:right w:type="dxa" w:w="120"/>
+            </w:tcMar>
+          </w:tcPr>
+          <w:p>
+            <w:r>
+              <w:rPr>
+                <w:rFonts w:ascii="Arial" w:cs="Arial" w:eastAsia="Arial" w:hAnsi="Arial"/>
+                <w:b w:val="false"/>
+                <w:bCs w:val="false"/>
+                <w:color w:val="1C1C1C"/>
+                <w:sz w:val="21"/>
+                <w:szCs w:val="21"/>
+              </w:rPr>
+              <w:t xml:space="preserve">PRODUCE — evening</w:t>
+            </w:r>
+          </w:p>
+        </w:tc>
+        <w:tc>
+          <w:tcPr>
+            <w:tcW w:type="dxa" w:w="6560"/>
+            <w:tcBorders>
+              <w:top w:val="single" w:color="CCCCCC" w:sz="1"/>
+              <w:left w:val="single" w:color="CCCCCC" w:sz="1"/>
+              <w:bottom w:val="single" w:color="CCCCCC" w:sz="1"/>
+              <w:right w:val="single" w:color="CCCCCC" w:sz="1"/>
+            </w:tcBorders>
+            <w:shd w:fill="FFFFFF" w:val="clear"/>
+            <w:tcMar>
+              <w:top w:type="dxa" w:w="80"/>
+              <w:left w:type="dxa" w:w="120"/>
+              <w:bottom w:type="dxa" w:w="80"/>
+              <w:right w:type="dxa" w:w="120"/>
+            </w:tcMar>
+          </w:tcPr>
+          <w:p>
+            <w:r>
+              <w:rPr>
+                <w:rFonts w:ascii="Arial" w:cs="Arial" w:eastAsia="Arial" w:hAnsi="Arial"/>
+                <w:b w:val="false"/>
+                <w:bCs w:val="false"/>
+                <w:color w:val="1C1C1C"/>
+                <w:sz w:val="21"/>
+                <w:szCs w:val="21"/>
+              </w:rPr>
+              <w:t xml:space="preserve">Anki flashcards + write and say three original sentences aloud.</w:t>
+            </w:r>
+          </w:p>
+        </w:tc>
+      </w:tr>
+    </w:tbl>
+    <w:p>
+      <w:pPr>
+        <w:pStyle w:val="Heading2"/>
+        <w:spacing w:before="280" w:after="100"/>
+      </w:pPr>
+      <w:r>
+        <w:rPr>
+          <w:rFonts w:ascii="Georgia" w:cs="Georgia" w:eastAsia="Georgia" w:hAnsi="Georgia"/>
+          <w:b/>
+          <w:bCs/>
+          <w:color w:val="1A6B3C"/>
+          <w:sz w:val="28"/>
+          <w:szCs w:val="28"/>
+        </w:rPr>
+        <w:t xml:space="preserve">What Lives Where</w:t>
+      </w:r>
+    </w:p>
+    <w:p>
+      <w:pPr>
+        <w:spacing w:before="40" w:after="40"/>
+      </w:pPr>
+      <w:r>
+        <w:rPr>
+          <w:rFonts w:ascii="Arial" w:cs="Arial" w:eastAsia="Arial" w:hAnsi="Arial"/>
+          <w:b w:val="false"/>
+          <w:bCs w:val="false"/>
+          <w:color w:val="1C1C1C"/>
+          <w:sz w:val="22"/>
+          <w:szCs w:val="22"/>
+        </w:rPr>
+        <w:t xml:space="preserve">Part 0 of this document = Foundations (your grammar compression). The 'lessons' folder = 14 day-lessons + the 8-week study plan. Audio = Language Transfer 'Complete Italian', FSI FAST, Coffee Break Italian. Anki decks = core-vocab + the questura/tennis missions. Missions = the questura permesso appointment and a casual tennis match.</w:t>
+      </w:r>
+    </w:p>
+    <w:tbl>
+      <w:tblPr>
+        <w:tblW w:type="dxa" w:w="9360"/>
+        <w:tblBorders>
+          <w:top w:val="single" w:color="auto" w:sz="4"/>
+          <w:left w:val="single" w:color="auto" w:sz="4"/>
+          <w:bottom w:val="single" w:color="auto" w:sz="4"/>
+          <w:right w:val="single" w:color="auto" w:sz="4"/>
+          <w:insideH w:val="single" w:color="auto" w:sz="4"/>
+          <w:insideV w:val="single" w:color="auto" w:sz="4"/>
+        </w:tblBorders>
+      </w:tblPr>
+      <w:tblGrid>
+        <w:gridCol w:w="9360"/>
+      </w:tblGrid>
+      <w:tr>
+        <w:tc>
+          <w:tcPr>
+            <w:tcW w:type="dxa" w:w="9360"/>
+            <w:tcBorders>
+              <w:top w:val="single" w:color="1A6B3C" w:sz="12"/>
+              <w:left w:val="none" w:color="FFFFFF" w:sz="0"/>
+              <w:bottom w:val="single" w:color="CCCCCC" w:sz="1"/>
+              <w:right w:val="none" w:color="FFFFFF" w:sz="0"/>
+            </w:tcBorders>
+            <w:shd w:fill="E8F5EE" w:val="clear"/>
+            <w:tcMar>
+              <w:top w:type="dxa" w:w="120"/>
+              <w:left w:type="dxa" w:w="200"/>
+              <w:bottom w:type="dxa" w:w="120"/>
+              <w:right w:type="dxa" w:w="200"/>
+            </w:tcMar>
+          </w:tcPr>
+          <w:p>
+            <w:pPr>
+              <w:spacing w:before="80" w:after="60"/>
+            </w:pPr>
+            <w:r>
+              <w:rPr>
+                <w:rFonts w:ascii="Arial" w:cs="Arial" w:eastAsia="Arial" w:hAnsi="Arial"/>
+                <w:b w:val="false"/>
+                <w:bCs w:val="false"/>
+                <w:color w:val="1A6B3C"/>
+                <w:sz w:val="22"/>
+                <w:szCs w:val="22"/>
+              </w:rPr>
+              <w:t xml:space="preserve">The non-negotiables: every word gets a sentence; always say it aloud; keep a Mistakes notebook; and make your stake real — book and pre-pay an italki role-play for your questura date.</w:t>
+            </w:r>
+          </w:p>
+        </w:tc>
+      </w:tr>
+    </w:tbl>
+    <w:p>
       <w:r>
         <w:br w:type="page"/>
       </w:r>
@@ -12093,6 +12504,679 @@
         <w:t xml:space="preserve">essere vs stare (both ≈ 'to be'): essere = identity / permanent (Sono australiano. È difficile.); stare = state / health / location / -ing (Come stai? Sto bene. Sto mangiando = I'm eating).</w:t>
       </w:r>
     </w:p>
+    <w:p>
+      <w:pPr>
+        <w:pStyle w:val="Heading2"/>
+        <w:spacing w:before="280" w:after="100"/>
+      </w:pPr>
+      <w:r>
+        <w:rPr>
+          <w:rFonts w:ascii="Georgia" w:cs="Georgia" w:eastAsia="Georgia" w:hAnsi="Georgia"/>
+          <w:b/>
+          <w:bCs/>
+          <w:color w:val="1A6B3C"/>
+          <w:sz w:val="28"/>
+          <w:szCs w:val="28"/>
+        </w:rPr>
+        <w:t xml:space="preserve">0.11  Saying What You Like — piacere Works Backwards</w:t>
+      </w:r>
+    </w:p>
+    <w:p>
+      <w:pPr>
+        <w:spacing w:before="40" w:after="40"/>
+      </w:pPr>
+      <w:r>
+        <w:rPr>
+          <w:rFonts w:ascii="Arial" w:cs="Arial" w:eastAsia="Arial" w:hAnsi="Arial"/>
+          <w:b w:val="false"/>
+          <w:bCs w:val="false"/>
+          <w:color w:val="1C1C1C"/>
+          <w:sz w:val="22"/>
+          <w:szCs w:val="22"/>
+        </w:rPr>
+        <w:t xml:space="preserve">piacere doesn't mean 'to like' — it means 'to be pleasing.' So the thing you like is the subject, and you are the indirect object. The verb agrees with the thing, not with you.</w:t>
+      </w:r>
+    </w:p>
+    <w:tbl>
+      <w:tblPr>
+        <w:tblW w:type="dxa" w:w="9360"/>
+        <w:tblBorders>
+          <w:top w:val="single" w:color="auto" w:sz="4"/>
+          <w:left w:val="single" w:color="auto" w:sz="4"/>
+          <w:bottom w:val="single" w:color="auto" w:sz="4"/>
+          <w:right w:val="single" w:color="auto" w:sz="4"/>
+          <w:insideH w:val="single" w:color="auto" w:sz="4"/>
+          <w:insideV w:val="single" w:color="auto" w:sz="4"/>
+        </w:tblBorders>
+      </w:tblPr>
+      <w:tblGrid>
+        <w:gridCol w:w="3000"/>
+        <w:gridCol w:w="2600"/>
+        <w:gridCol w:w="3760"/>
+      </w:tblGrid>
+      <w:tr>
+        <w:tc>
+          <w:tcPr>
+            <w:tcW w:type="dxa" w:w="3000"/>
+            <w:tcBorders>
+              <w:top w:val="single" w:color="CCCCCC" w:sz="1"/>
+              <w:left w:val="single" w:color="CCCCCC" w:sz="1"/>
+              <w:bottom w:val="single" w:color="CCCCCC" w:sz="1"/>
+              <w:right w:val="single" w:color="CCCCCC" w:sz="1"/>
+            </w:tcBorders>
+            <w:shd w:fill="1A6B3C" w:val="clear"/>
+            <w:tcMar>
+              <w:top w:type="dxa" w:w="80"/>
+              <w:left w:type="dxa" w:w="120"/>
+              <w:bottom w:type="dxa" w:w="80"/>
+              <w:right w:type="dxa" w:w="120"/>
+            </w:tcMar>
+          </w:tcPr>
+          <w:p>
+            <w:r>
+              <w:rPr>
+                <w:rFonts w:ascii="Arial" w:cs="Arial" w:eastAsia="Arial" w:hAnsi="Arial"/>
+                <w:b/>
+                <w:bCs/>
+                <w:color w:val="FFFFFF"/>
+                <w:sz w:val="21"/>
+                <w:szCs w:val="21"/>
+              </w:rPr>
+              <w:t xml:space="preserve">Italian</w:t>
+            </w:r>
+          </w:p>
+        </w:tc>
+        <w:tc>
+          <w:tcPr>
+            <w:tcW w:type="dxa" w:w="2600"/>
+            <w:tcBorders>
+              <w:top w:val="single" w:color="CCCCCC" w:sz="1"/>
+              <w:left w:val="single" w:color="CCCCCC" w:sz="1"/>
+              <w:bottom w:val="single" w:color="CCCCCC" w:sz="1"/>
+              <w:right w:val="single" w:color="CCCCCC" w:sz="1"/>
+            </w:tcBorders>
+            <w:shd w:fill="1A6B3C" w:val="clear"/>
+            <w:tcMar>
+              <w:top w:type="dxa" w:w="80"/>
+              <w:left w:type="dxa" w:w="120"/>
+              <w:bottom w:type="dxa" w:w="80"/>
+              <w:right w:type="dxa" w:w="120"/>
+            </w:tcMar>
+          </w:tcPr>
+          <w:p>
+            <w:r>
+              <w:rPr>
+                <w:rFonts w:ascii="Arial" w:cs="Arial" w:eastAsia="Arial" w:hAnsi="Arial"/>
+                <w:b/>
+                <w:bCs/>
+                <w:color w:val="FFFFFF"/>
+                <w:sz w:val="21"/>
+                <w:szCs w:val="21"/>
+              </w:rPr>
+              <w:t xml:space="preserve">English</w:t>
+            </w:r>
+          </w:p>
+        </w:tc>
+        <w:tc>
+          <w:tcPr>
+            <w:tcW w:type="dxa" w:w="3760"/>
+            <w:tcBorders>
+              <w:top w:val="single" w:color="CCCCCC" w:sz="1"/>
+              <w:left w:val="single" w:color="CCCCCC" w:sz="1"/>
+              <w:bottom w:val="single" w:color="CCCCCC" w:sz="1"/>
+              <w:right w:val="single" w:color="CCCCCC" w:sz="1"/>
+            </w:tcBorders>
+            <w:shd w:fill="1A6B3C" w:val="clear"/>
+            <w:tcMar>
+              <w:top w:type="dxa" w:w="80"/>
+              <w:left w:type="dxa" w:w="120"/>
+              <w:bottom w:type="dxa" w:w="80"/>
+              <w:right w:type="dxa" w:w="120"/>
+            </w:tcMar>
+          </w:tcPr>
+          <w:p>
+            <w:r>
+              <w:rPr>
+                <w:rFonts w:ascii="Arial" w:cs="Arial" w:eastAsia="Arial" w:hAnsi="Arial"/>
+                <w:b/>
+                <w:bCs/>
+                <w:color w:val="FFFFFF"/>
+                <w:sz w:val="21"/>
+                <w:szCs w:val="21"/>
+              </w:rPr>
+              <w:t xml:space="preserve">Why</w:t>
+            </w:r>
+          </w:p>
+        </w:tc>
+      </w:tr>
+      <w:tr>
+        <w:tc>
+          <w:tcPr>
+            <w:tcW w:type="dxa" w:w="3000"/>
+            <w:tcBorders>
+              <w:top w:val="single" w:color="CCCCCC" w:sz="1"/>
+              <w:left w:val="single" w:color="CCCCCC" w:sz="1"/>
+              <w:bottom w:val="single" w:color="CCCCCC" w:sz="1"/>
+              <w:right w:val="single" w:color="CCCCCC" w:sz="1"/>
+            </w:tcBorders>
+            <w:shd w:fill="FFFFFF" w:val="clear"/>
+            <w:tcMar>
+              <w:top w:type="dxa" w:w="80"/>
+              <w:left w:type="dxa" w:w="120"/>
+              <w:bottom w:type="dxa" w:w="80"/>
+              <w:right w:type="dxa" w:w="120"/>
+            </w:tcMar>
+          </w:tcPr>
+          <w:p>
+            <w:r>
+              <w:rPr>
+                <w:rFonts w:ascii="Arial" w:cs="Arial" w:eastAsia="Arial" w:hAnsi="Arial"/>
+                <w:b w:val="false"/>
+                <w:bCs w:val="false"/>
+                <w:color w:val="1C1C1C"/>
+                <w:sz w:val="21"/>
+                <w:szCs w:val="21"/>
+              </w:rPr>
+              <w:t xml:space="preserve">Mi piace il caffè.</w:t>
+            </w:r>
+          </w:p>
+        </w:tc>
+        <w:tc>
+          <w:tcPr>
+            <w:tcW w:type="dxa" w:w="2600"/>
+            <w:tcBorders>
+              <w:top w:val="single" w:color="CCCCCC" w:sz="1"/>
+              <w:left w:val="single" w:color="CCCCCC" w:sz="1"/>
+              <w:bottom w:val="single" w:color="CCCCCC" w:sz="1"/>
+              <w:right w:val="single" w:color="CCCCCC" w:sz="1"/>
+            </w:tcBorders>
+            <w:shd w:fill="FFFFFF" w:val="clear"/>
+            <w:tcMar>
+              <w:top w:type="dxa" w:w="80"/>
+              <w:left w:type="dxa" w:w="120"/>
+              <w:bottom w:type="dxa" w:w="80"/>
+              <w:right w:type="dxa" w:w="120"/>
+            </w:tcMar>
+          </w:tcPr>
+          <w:p>
+            <w:r>
+              <w:rPr>
+                <w:rFonts w:ascii="Arial" w:cs="Arial" w:eastAsia="Arial" w:hAnsi="Arial"/>
+                <w:b w:val="false"/>
+                <w:bCs w:val="false"/>
+                <w:color w:val="1C1C1C"/>
+                <w:sz w:val="21"/>
+                <w:szCs w:val="21"/>
+              </w:rPr>
+              <w:t xml:space="preserve">I like coffee.</w:t>
+            </w:r>
+          </w:p>
+        </w:tc>
+        <w:tc>
+          <w:tcPr>
+            <w:tcW w:type="dxa" w:w="3760"/>
+            <w:tcBorders>
+              <w:top w:val="single" w:color="CCCCCC" w:sz="1"/>
+              <w:left w:val="single" w:color="CCCCCC" w:sz="1"/>
+              <w:bottom w:val="single" w:color="CCCCCC" w:sz="1"/>
+              <w:right w:val="single" w:color="CCCCCC" w:sz="1"/>
+            </w:tcBorders>
+            <w:shd w:fill="FFFFFF" w:val="clear"/>
+            <w:tcMar>
+              <w:top w:type="dxa" w:w="80"/>
+              <w:left w:type="dxa" w:w="120"/>
+              <w:bottom w:type="dxa" w:w="80"/>
+              <w:right w:type="dxa" w:w="120"/>
+            </w:tcMar>
+          </w:tcPr>
+          <w:p>
+            <w:r>
+              <w:rPr>
+                <w:rFonts w:ascii="Arial" w:cs="Arial" w:eastAsia="Arial" w:hAnsi="Arial"/>
+                <w:b w:val="false"/>
+                <w:bCs w:val="false"/>
+                <w:color w:val="1C1C1C"/>
+                <w:sz w:val="21"/>
+                <w:szCs w:val="21"/>
+              </w:rPr>
+              <w:t xml:space="preserve">one thing → piace ('to-me is-pleasing the coffee')</w:t>
+            </w:r>
+          </w:p>
+        </w:tc>
+      </w:tr>
+      <w:tr>
+        <w:tc>
+          <w:tcPr>
+            <w:tcW w:type="dxa" w:w="3000"/>
+            <w:tcBorders>
+              <w:top w:val="single" w:color="CCCCCC" w:sz="1"/>
+              <w:left w:val="single" w:color="CCCCCC" w:sz="1"/>
+              <w:bottom w:val="single" w:color="CCCCCC" w:sz="1"/>
+              <w:right w:val="single" w:color="CCCCCC" w:sz="1"/>
+            </w:tcBorders>
+            <w:shd w:fill="F5F5F5" w:val="clear"/>
+            <w:tcMar>
+              <w:top w:type="dxa" w:w="80"/>
+              <w:left w:type="dxa" w:w="120"/>
+              <w:bottom w:type="dxa" w:w="80"/>
+              <w:right w:type="dxa" w:w="120"/>
+            </w:tcMar>
+          </w:tcPr>
+          <w:p>
+            <w:r>
+              <w:rPr>
+                <w:rFonts w:ascii="Arial" w:cs="Arial" w:eastAsia="Arial" w:hAnsi="Arial"/>
+                <w:b w:val="false"/>
+                <w:bCs w:val="false"/>
+                <w:color w:val="1C1C1C"/>
+                <w:sz w:val="21"/>
+                <w:szCs w:val="21"/>
+              </w:rPr>
+              <w:t xml:space="preserve">Mi piacciono le città.</w:t>
+            </w:r>
+          </w:p>
+        </w:tc>
+        <w:tc>
+          <w:tcPr>
+            <w:tcW w:type="dxa" w:w="2600"/>
+            <w:tcBorders>
+              <w:top w:val="single" w:color="CCCCCC" w:sz="1"/>
+              <w:left w:val="single" w:color="CCCCCC" w:sz="1"/>
+              <w:bottom w:val="single" w:color="CCCCCC" w:sz="1"/>
+              <w:right w:val="single" w:color="CCCCCC" w:sz="1"/>
+            </w:tcBorders>
+            <w:shd w:fill="F5F5F5" w:val="clear"/>
+            <w:tcMar>
+              <w:top w:type="dxa" w:w="80"/>
+              <w:left w:type="dxa" w:w="120"/>
+              <w:bottom w:type="dxa" w:w="80"/>
+              <w:right w:type="dxa" w:w="120"/>
+            </w:tcMar>
+          </w:tcPr>
+          <w:p>
+            <w:r>
+              <w:rPr>
+                <w:rFonts w:ascii="Arial" w:cs="Arial" w:eastAsia="Arial" w:hAnsi="Arial"/>
+                <w:b w:val="false"/>
+                <w:bCs w:val="false"/>
+                <w:color w:val="1C1C1C"/>
+                <w:sz w:val="21"/>
+                <w:szCs w:val="21"/>
+              </w:rPr>
+              <w:t xml:space="preserve">I like cities.</w:t>
+            </w:r>
+          </w:p>
+        </w:tc>
+        <w:tc>
+          <w:tcPr>
+            <w:tcW w:type="dxa" w:w="3760"/>
+            <w:tcBorders>
+              <w:top w:val="single" w:color="CCCCCC" w:sz="1"/>
+              <w:left w:val="single" w:color="CCCCCC" w:sz="1"/>
+              <w:bottom w:val="single" w:color="CCCCCC" w:sz="1"/>
+              <w:right w:val="single" w:color="CCCCCC" w:sz="1"/>
+            </w:tcBorders>
+            <w:shd w:fill="F5F5F5" w:val="clear"/>
+            <w:tcMar>
+              <w:top w:type="dxa" w:w="80"/>
+              <w:left w:type="dxa" w:w="120"/>
+              <w:bottom w:type="dxa" w:w="80"/>
+              <w:right w:type="dxa" w:w="120"/>
+            </w:tcMar>
+          </w:tcPr>
+          <w:p>
+            <w:r>
+              <w:rPr>
+                <w:rFonts w:ascii="Arial" w:cs="Arial" w:eastAsia="Arial" w:hAnsi="Arial"/>
+                <w:b w:val="false"/>
+                <w:bCs w:val="false"/>
+                <w:color w:val="1C1C1C"/>
+                <w:sz w:val="21"/>
+                <w:szCs w:val="21"/>
+              </w:rPr>
+              <w:t xml:space="preserve">plural thing → piacciono</w:t>
+            </w:r>
+          </w:p>
+        </w:tc>
+      </w:tr>
+      <w:tr>
+        <w:tc>
+          <w:tcPr>
+            <w:tcW w:type="dxa" w:w="3000"/>
+            <w:tcBorders>
+              <w:top w:val="single" w:color="CCCCCC" w:sz="1"/>
+              <w:left w:val="single" w:color="CCCCCC" w:sz="1"/>
+              <w:bottom w:val="single" w:color="CCCCCC" w:sz="1"/>
+              <w:right w:val="single" w:color="CCCCCC" w:sz="1"/>
+            </w:tcBorders>
+            <w:shd w:fill="FFFFFF" w:val="clear"/>
+            <w:tcMar>
+              <w:top w:type="dxa" w:w="80"/>
+              <w:left w:type="dxa" w:w="120"/>
+              <w:bottom w:type="dxa" w:w="80"/>
+              <w:right w:type="dxa" w:w="120"/>
+            </w:tcMar>
+          </w:tcPr>
+          <w:p>
+            <w:r>
+              <w:rPr>
+                <w:rFonts w:ascii="Arial" w:cs="Arial" w:eastAsia="Arial" w:hAnsi="Arial"/>
+                <w:b w:val="false"/>
+                <w:bCs w:val="false"/>
+                <w:color w:val="1C1C1C"/>
+                <w:sz w:val="21"/>
+                <w:szCs w:val="21"/>
+              </w:rPr>
+              <w:t xml:space="preserve">Mi piace mangiare.</w:t>
+            </w:r>
+          </w:p>
+        </w:tc>
+        <w:tc>
+          <w:tcPr>
+            <w:tcW w:type="dxa" w:w="2600"/>
+            <w:tcBorders>
+              <w:top w:val="single" w:color="CCCCCC" w:sz="1"/>
+              <w:left w:val="single" w:color="CCCCCC" w:sz="1"/>
+              <w:bottom w:val="single" w:color="CCCCCC" w:sz="1"/>
+              <w:right w:val="single" w:color="CCCCCC" w:sz="1"/>
+            </w:tcBorders>
+            <w:shd w:fill="FFFFFF" w:val="clear"/>
+            <w:tcMar>
+              <w:top w:type="dxa" w:w="80"/>
+              <w:left w:type="dxa" w:w="120"/>
+              <w:bottom w:type="dxa" w:w="80"/>
+              <w:right w:type="dxa" w:w="120"/>
+            </w:tcMar>
+          </w:tcPr>
+          <w:p>
+            <w:r>
+              <w:rPr>
+                <w:rFonts w:ascii="Arial" w:cs="Arial" w:eastAsia="Arial" w:hAnsi="Arial"/>
+                <w:b w:val="false"/>
+                <w:bCs w:val="false"/>
+                <w:color w:val="1C1C1C"/>
+                <w:sz w:val="21"/>
+                <w:szCs w:val="21"/>
+              </w:rPr>
+              <w:t xml:space="preserve">I like to eat.</w:t>
+            </w:r>
+          </w:p>
+        </w:tc>
+        <w:tc>
+          <w:tcPr>
+            <w:tcW w:type="dxa" w:w="3760"/>
+            <w:tcBorders>
+              <w:top w:val="single" w:color="CCCCCC" w:sz="1"/>
+              <w:left w:val="single" w:color="CCCCCC" w:sz="1"/>
+              <w:bottom w:val="single" w:color="CCCCCC" w:sz="1"/>
+              <w:right w:val="single" w:color="CCCCCC" w:sz="1"/>
+            </w:tcBorders>
+            <w:shd w:fill="FFFFFF" w:val="clear"/>
+            <w:tcMar>
+              <w:top w:type="dxa" w:w="80"/>
+              <w:left w:type="dxa" w:w="120"/>
+              <w:bottom w:type="dxa" w:w="80"/>
+              <w:right w:type="dxa" w:w="120"/>
+            </w:tcMar>
+          </w:tcPr>
+          <w:p>
+            <w:r>
+              <w:rPr>
+                <w:rFonts w:ascii="Arial" w:cs="Arial" w:eastAsia="Arial" w:hAnsi="Arial"/>
+                <w:b w:val="false"/>
+                <w:bCs w:val="false"/>
+                <w:color w:val="1C1C1C"/>
+                <w:sz w:val="21"/>
+                <w:szCs w:val="21"/>
+              </w:rPr>
+              <w:t xml:space="preserve">a verb counts as singular → piace</w:t>
+            </w:r>
+          </w:p>
+        </w:tc>
+      </w:tr>
+      <w:tr>
+        <w:tc>
+          <w:tcPr>
+            <w:tcW w:type="dxa" w:w="3000"/>
+            <w:tcBorders>
+              <w:top w:val="single" w:color="CCCCCC" w:sz="1"/>
+              <w:left w:val="single" w:color="CCCCCC" w:sz="1"/>
+              <w:bottom w:val="single" w:color="CCCCCC" w:sz="1"/>
+              <w:right w:val="single" w:color="CCCCCC" w:sz="1"/>
+            </w:tcBorders>
+            <w:shd w:fill="F5F5F5" w:val="clear"/>
+            <w:tcMar>
+              <w:top w:type="dxa" w:w="80"/>
+              <w:left w:type="dxa" w:w="120"/>
+              <w:bottom w:type="dxa" w:w="80"/>
+              <w:right w:type="dxa" w:w="120"/>
+            </w:tcMar>
+          </w:tcPr>
+          <w:p>
+            <w:r>
+              <w:rPr>
+                <w:rFonts w:ascii="Arial" w:cs="Arial" w:eastAsia="Arial" w:hAnsi="Arial"/>
+                <w:b w:val="false"/>
+                <w:bCs w:val="false"/>
+                <w:color w:val="1C1C1C"/>
+                <w:sz w:val="21"/>
+                <w:szCs w:val="21"/>
+              </w:rPr>
+              <w:t xml:space="preserve">Ti piace? / Le piace Roma.</w:t>
+            </w:r>
+          </w:p>
+        </w:tc>
+        <w:tc>
+          <w:tcPr>
+            <w:tcW w:type="dxa" w:w="2600"/>
+            <w:tcBorders>
+              <w:top w:val="single" w:color="CCCCCC" w:sz="1"/>
+              <w:left w:val="single" w:color="CCCCCC" w:sz="1"/>
+              <w:bottom w:val="single" w:color="CCCCCC" w:sz="1"/>
+              <w:right w:val="single" w:color="CCCCCC" w:sz="1"/>
+            </w:tcBorders>
+            <w:shd w:fill="F5F5F5" w:val="clear"/>
+            <w:tcMar>
+              <w:top w:type="dxa" w:w="80"/>
+              <w:left w:type="dxa" w:w="120"/>
+              <w:bottom w:type="dxa" w:w="80"/>
+              <w:right w:type="dxa" w:w="120"/>
+            </w:tcMar>
+          </w:tcPr>
+          <w:p>
+            <w:r>
+              <w:rPr>
+                <w:rFonts w:ascii="Arial" w:cs="Arial" w:eastAsia="Arial" w:hAnsi="Arial"/>
+                <w:b w:val="false"/>
+                <w:bCs w:val="false"/>
+                <w:color w:val="1C1C1C"/>
+                <w:sz w:val="21"/>
+                <w:szCs w:val="21"/>
+              </w:rPr>
+              <w:t xml:space="preserve">Do you like it? / She likes Rome.</w:t>
+            </w:r>
+          </w:p>
+        </w:tc>
+        <w:tc>
+          <w:tcPr>
+            <w:tcW w:type="dxa" w:w="3760"/>
+            <w:tcBorders>
+              <w:top w:val="single" w:color="CCCCCC" w:sz="1"/>
+              <w:left w:val="single" w:color="CCCCCC" w:sz="1"/>
+              <w:bottom w:val="single" w:color="CCCCCC" w:sz="1"/>
+              <w:right w:val="single" w:color="CCCCCC" w:sz="1"/>
+            </w:tcBorders>
+            <w:shd w:fill="F5F5F5" w:val="clear"/>
+            <w:tcMar>
+              <w:top w:type="dxa" w:w="80"/>
+              <w:left w:type="dxa" w:w="120"/>
+              <w:bottom w:type="dxa" w:w="80"/>
+              <w:right w:type="dxa" w:w="120"/>
+            </w:tcMar>
+          </w:tcPr>
+          <w:p>
+            <w:r>
+              <w:rPr>
+                <w:rFonts w:ascii="Arial" w:cs="Arial" w:eastAsia="Arial" w:hAnsi="Arial"/>
+                <w:b w:val="false"/>
+                <w:bCs w:val="false"/>
+                <w:color w:val="1C1C1C"/>
+                <w:sz w:val="21"/>
+                <w:szCs w:val="21"/>
+              </w:rPr>
+              <w:t xml:space="preserve">swap the person with an indirect pronoun</w:t>
+            </w:r>
+          </w:p>
+        </w:tc>
+      </w:tr>
+      <w:tr>
+        <w:tc>
+          <w:tcPr>
+            <w:tcW w:type="dxa" w:w="3000"/>
+            <w:tcBorders>
+              <w:top w:val="single" w:color="CCCCCC" w:sz="1"/>
+              <w:left w:val="single" w:color="CCCCCC" w:sz="1"/>
+              <w:bottom w:val="single" w:color="CCCCCC" w:sz="1"/>
+              <w:right w:val="single" w:color="CCCCCC" w:sz="1"/>
+            </w:tcBorders>
+            <w:shd w:fill="FFFFFF" w:val="clear"/>
+            <w:tcMar>
+              <w:top w:type="dxa" w:w="80"/>
+              <w:left w:type="dxa" w:w="120"/>
+              <w:bottom w:type="dxa" w:w="80"/>
+              <w:right w:type="dxa" w:w="120"/>
+            </w:tcMar>
+          </w:tcPr>
+          <w:p>
+            <w:r>
+              <w:rPr>
+                <w:rFonts w:ascii="Arial" w:cs="Arial" w:eastAsia="Arial" w:hAnsi="Arial"/>
+                <w:b w:val="false"/>
+                <w:bCs w:val="false"/>
+                <w:color w:val="1C1C1C"/>
+                <w:sz w:val="21"/>
+                <w:szCs w:val="21"/>
+              </w:rPr>
+              <w:t xml:space="preserve">Non mi piace.</w:t>
+            </w:r>
+          </w:p>
+        </w:tc>
+        <w:tc>
+          <w:tcPr>
+            <w:tcW w:type="dxa" w:w="2600"/>
+            <w:tcBorders>
+              <w:top w:val="single" w:color="CCCCCC" w:sz="1"/>
+              <w:left w:val="single" w:color="CCCCCC" w:sz="1"/>
+              <w:bottom w:val="single" w:color="CCCCCC" w:sz="1"/>
+              <w:right w:val="single" w:color="CCCCCC" w:sz="1"/>
+            </w:tcBorders>
+            <w:shd w:fill="FFFFFF" w:val="clear"/>
+            <w:tcMar>
+              <w:top w:type="dxa" w:w="80"/>
+              <w:left w:type="dxa" w:w="120"/>
+              <w:bottom w:type="dxa" w:w="80"/>
+              <w:right w:type="dxa" w:w="120"/>
+            </w:tcMar>
+          </w:tcPr>
+          <w:p>
+            <w:r>
+              <w:rPr>
+                <w:rFonts w:ascii="Arial" w:cs="Arial" w:eastAsia="Arial" w:hAnsi="Arial"/>
+                <w:b w:val="false"/>
+                <w:bCs w:val="false"/>
+                <w:color w:val="1C1C1C"/>
+                <w:sz w:val="21"/>
+                <w:szCs w:val="21"/>
+              </w:rPr>
+              <w:t xml:space="preserve">I don't like it.</w:t>
+            </w:r>
+          </w:p>
+        </w:tc>
+        <w:tc>
+          <w:tcPr>
+            <w:tcW w:type="dxa" w:w="3760"/>
+            <w:tcBorders>
+              <w:top w:val="single" w:color="CCCCCC" w:sz="1"/>
+              <w:left w:val="single" w:color="CCCCCC" w:sz="1"/>
+              <w:bottom w:val="single" w:color="CCCCCC" w:sz="1"/>
+              <w:right w:val="single" w:color="CCCCCC" w:sz="1"/>
+            </w:tcBorders>
+            <w:shd w:fill="FFFFFF" w:val="clear"/>
+            <w:tcMar>
+              <w:top w:type="dxa" w:w="80"/>
+              <w:left w:type="dxa" w:w="120"/>
+              <w:bottom w:type="dxa" w:w="80"/>
+              <w:right w:type="dxa" w:w="120"/>
+            </w:tcMar>
+          </w:tcPr>
+          <w:p>
+            <w:r>
+              <w:rPr>
+                <w:rFonts w:ascii="Arial" w:cs="Arial" w:eastAsia="Arial" w:hAnsi="Arial"/>
+                <w:b w:val="false"/>
+                <w:bCs w:val="false"/>
+                <w:color w:val="1C1C1C"/>
+                <w:sz w:val="21"/>
+                <w:szCs w:val="21"/>
+              </w:rPr>
+              <w:t xml:space="preserve">negation: non before the pronoun</w:t>
+            </w:r>
+          </w:p>
+        </w:tc>
+      </w:tr>
+    </w:tbl>
+    <w:tbl>
+      <w:tblPr>
+        <w:tblW w:type="dxa" w:w="9360"/>
+        <w:tblBorders>
+          <w:top w:val="single" w:color="auto" w:sz="4"/>
+          <w:left w:val="single" w:color="auto" w:sz="4"/>
+          <w:bottom w:val="single" w:color="auto" w:sz="4"/>
+          <w:right w:val="single" w:color="auto" w:sz="4"/>
+          <w:insideH w:val="single" w:color="auto" w:sz="4"/>
+          <w:insideV w:val="single" w:color="auto" w:sz="4"/>
+        </w:tblBorders>
+      </w:tblPr>
+      <w:tblGrid>
+        <w:gridCol w:w="9360"/>
+      </w:tblGrid>
+      <w:tr>
+        <w:tc>
+          <w:tcPr>
+            <w:tcW w:type="dxa" w:w="9360"/>
+            <w:tcBorders>
+              <w:top w:val="single" w:color="1A6B3C" w:sz="12"/>
+              <w:left w:val="none" w:color="FFFFFF" w:sz="0"/>
+              <w:bottom w:val="single" w:color="CCCCCC" w:sz="1"/>
+              <w:right w:val="none" w:color="FFFFFF" w:sz="0"/>
+            </w:tcBorders>
+            <w:shd w:fill="E8F5EE" w:val="clear"/>
+            <w:tcMar>
+              <w:top w:type="dxa" w:w="120"/>
+              <w:left w:type="dxa" w:w="200"/>
+              <w:bottom w:type="dxa" w:w="120"/>
+              <w:right w:type="dxa" w:w="200"/>
+            </w:tcMar>
+          </w:tcPr>
+          <w:p>
+            <w:pPr>
+              <w:spacing w:before="80" w:after="60"/>
+            </w:pPr>
+            <w:r>
+              <w:rPr>
+                <w:rFonts w:ascii="Arial" w:cs="Arial" w:eastAsia="Arial" w:hAnsi="Arial"/>
+                <w:b w:val="false"/>
+                <w:bCs w:val="false"/>
+                <w:color w:val="1A6B3C"/>
+                <w:sz w:val="22"/>
+                <w:szCs w:val="22"/>
+              </w:rPr>
+              <w:t xml:space="preserve">Same backwards pattern: mi manca (I miss it), mi serve (I need it), mi sembra (it seems to me).</w:t>
+            </w:r>
+          </w:p>
+        </w:tc>
+      </w:tr>
+    </w:tbl>
     <w:p>
       <w:pPr>
         <w:pStyle w:val="Heading1"/>

</xml_diff>